<commit_message>
Descripción breve de los cambios
</commit_message>
<xml_diff>
--- a/docs/WordBPM.docx
+++ b/docs/WordBPM.docx
@@ -1,8 +1,8 @@
 
 <file path=word/document.xml><?xml version="1.0" encoding="utf-8"?>
-<w:document xmlns:wpc="http://schemas.microsoft.com/office/word/2010/wordprocessingCanvas" xmlns:cx="http://schemas.microsoft.com/office/drawing/2014/chartex" xmlns:cx1="http://schemas.microsoft.com/office/drawing/2015/9/8/chartex" xmlns:cx2="http://schemas.microsoft.com/office/drawing/2015/10/21/chartex" xmlns:cx3="http://schemas.microsoft.com/office/drawing/2016/5/9/chartex" xmlns:cx4="http://schemas.microsoft.com/office/drawing/2016/5/10/chartex" xmlns:cx5="http://schemas.microsoft.com/office/drawing/2016/5/11/chartex" xmlns:cx6="http://schemas.microsoft.com/office/drawing/2016/5/12/chartex" xmlns:cx7="http://schemas.microsoft.com/office/drawing/2016/5/13/chartex" xmlns:cx8="http://schemas.microsoft.com/office/drawing/2016/5/14/chartex" xmlns:mc="http://schemas.openxmlformats.org/markup-compatibility/2006" xmlns:aink="http://schemas.microsoft.com/office/drawing/2016/ink" xmlns:am3d="http://schemas.microsoft.com/office/drawing/2017/model3d" xmlns:o="urn:schemas-microsoft-com:office:office" xmlns:oel="http://schemas.microsoft.com/office/2019/extlst" xmlns:r="http://schemas.openxmlformats.org/officeDocument/2006/relationships" xmlns:m="http://schemas.openxmlformats.org/officeDocument/2006/math" xmlns:v="urn:schemas-microsoft-com:vml" xmlns:wp14="http://schemas.microsoft.com/office/word/2010/wordprocessingDrawing" xmlns:wp="http://schemas.openxmlformats.org/drawingml/2006/wordprocessingDrawing" xmlns:w10="urn:schemas-microsoft-com:office:word" xmlns:w="http://schemas.openxmlformats.org/wordprocessingml/2006/main" xmlns:w14="http://schemas.microsoft.com/office/word/2010/wordml" xmlns:w15="http://schemas.microsoft.com/office/word/2012/wordml" xmlns:w16cex="http://schemas.microsoft.com/office/word/2018/wordml/cex" xmlns:w16cid="http://schemas.microsoft.com/office/word/2016/wordml/cid" xmlns:w16="http://schemas.microsoft.com/office/word/2018/wordml" xmlns:w16du="http://schemas.microsoft.com/office/word/2023/wordml/word16du" xmlns:w16sdtdh="http://schemas.microsoft.com/office/word/2020/wordml/sdtdatahash" xmlns:w16sdtfl="http://schemas.microsoft.com/office/word/2024/wordml/sdtformatlock" xmlns:w16se="http://schemas.microsoft.com/office/word/2015/wordml/symex" xmlns:wpg="http://schemas.microsoft.com/office/word/2010/wordprocessingGroup" xmlns:wpi="http://schemas.microsoft.com/office/word/2010/wordprocessingInk" xmlns:wne="http://schemas.microsoft.com/office/word/2006/wordml" xmlns:wps="http://schemas.microsoft.com/office/word/2010/wordprocessingShape" mc:Ignorable="w14 w15 w16se w16cid w16 w16cex w16sdtdh w16sdtfl w16du wp14">
+<w:document xmlns:a="http://schemas.openxmlformats.org/drawingml/2006/main" xmlns:ns1="http://schemas.openxmlformats.org/markup-compatibility/2006" xmlns:ns2="http://schemas.microsoft.com/office/word/2010/wordml" xmlns:ns4="http://schemas.microsoft.com/office/word/2010/wordprocessingDrawing" xmlns:ns6="http://schemas.openxmlformats.org/drawingml/2006/picture" xmlns:ns8="http://schemas.microsoft.com/office/drawing/2010/main" xmlns:r="http://schemas.openxmlformats.org/officeDocument/2006/relationships" xmlns:w="http://schemas.openxmlformats.org/wordprocessingml/2006/main" xmlns:wp="http://schemas.openxmlformats.org/drawingml/2006/wordprocessingDrawing" ns1:Ignorable="w14 w15 w16se w16cid w16 w16cex w16sdtdh w16sdtfl w16du wp14">
   <w:body>
-    <w:p>
+    <w:p ns2:paraId="50880639" ns2:textId="578328C9">
       <w:pPr>
         <w:pBdr>
           <w:top w:val="nil"/>
@@ -22,27 +22,27 @@
           <w:noProof/>
         </w:rPr>
         <w:drawing>
-          <wp:inline distT="0" distB="0" distL="0" distR="0" wp14:anchorId="3B161E4E" wp14:editId="6857D981">
+          <wp:inline distT="0" distB="0" distL="0" distR="0" ns4:anchorId="3B161E4E" ns4:editId="6857D981">
             <wp:extent cx="1741383" cy="1800000"/>
             <wp:effectExtent l="0" t="0" r="0" b="0"/>
             <wp:docPr id="3" name="Imagen 3" descr="Logotipo&#10;&#10;Descripción generada automáticamente"/>
             <wp:cNvGraphicFramePr>
-              <a:graphicFrameLocks xmlns:a="http://schemas.openxmlformats.org/drawingml/2006/main" noChangeAspect="1"/>
+              <a:graphicFrameLocks noChangeAspect="1"/>
             </wp:cNvGraphicFramePr>
-            <a:graphic xmlns:a="http://schemas.openxmlformats.org/drawingml/2006/main">
+            <a:graphic>
               <a:graphicData uri="http://schemas.openxmlformats.org/drawingml/2006/picture">
-                <pic:pic xmlns:pic="http://schemas.openxmlformats.org/drawingml/2006/picture">
-                  <pic:nvPicPr>
-                    <pic:cNvPr id="3" name="Imagen 3" descr="Logotipo&#10;&#10;Descripción generada automáticamente"/>
-                    <pic:cNvPicPr>
+                <ns6:pic>
+                  <ns6:nvPicPr>
+                    <ns6:cNvPr id="3" name="Imagen 3" descr="Logotipo&#10;&#10;Descripción generada automáticamente"/>
+                    <ns6:cNvPicPr>
                       <a:picLocks noChangeAspect="1" noChangeArrowheads="1"/>
-                    </pic:cNvPicPr>
-                  </pic:nvPicPr>
-                  <pic:blipFill>
+                    </ns6:cNvPicPr>
+                  </ns6:nvPicPr>
+                  <ns6:blipFill>
                     <a:blip r:embed="rId12" cstate="print">
                       <a:extLst>
                         <a:ext uri="{28A0092B-C50C-407E-A947-70E740481C1C}">
-                          <a14:useLocalDpi xmlns:a14="http://schemas.microsoft.com/office/drawing/2010/main" val="0"/>
+                          <ns8:useLocalDpi val="0"/>
                         </a:ext>
                       </a:extLst>
                     </a:blip>
@@ -50,8 +50,8 @@
                     <a:stretch>
                       <a:fillRect/>
                     </a:stretch>
-                  </pic:blipFill>
-                  <pic:spPr bwMode="auto">
+                  </ns6:blipFill>
+                  <ns6:spPr bwMode="auto">
                     <a:xfrm>
                       <a:off x="0" y="0"/>
                       <a:ext cx="1741383" cy="1800000"/>
@@ -63,15 +63,15 @@
                     <a:ln>
                       <a:noFill/>
                     </a:ln>
-                  </pic:spPr>
-                </pic:pic>
+                  </ns6:spPr>
+                </ns6:pic>
               </a:graphicData>
             </a:graphic>
           </wp:inline>
         </w:drawing>
       </w:r>
     </w:p>
-    <w:p>
+    <w:p ns2:paraId="3E956691" ns2:textId="77777777">
       <w:pPr>
         <w:pBdr>
           <w:top w:val="nil"/>
@@ -87,7 +87,7 @@
         </w:rPr>
       </w:pPr>
     </w:p>
-    <w:p>
+    <w:p ns2:paraId="5FE83477" ns2:textId="77777777">
       <w:pPr>
         <w:pBdr>
           <w:top w:val="nil"/>
@@ -111,7 +111,7 @@
         <w:t>FACULTAD DE INGENIERÍA</w:t>
       </w:r>
     </w:p>
-    <w:p>
+    <w:p ns2:paraId="6A31ADD1" ns2:textId="79F64F8D">
       <w:pPr>
         <w:pBdr>
           <w:top w:val="nil"/>
@@ -143,7 +143,7 @@
         <w:t>EN COMPUTACIÓN E INFORMÁTICA</w:t>
       </w:r>
     </w:p>
-    <w:p>
+    <w:p ns2:paraId="0EE61D0B" ns2:textId="77777777">
       <w:pPr>
         <w:pBdr>
           <w:top w:val="nil"/>
@@ -159,7 +159,7 @@
         </w:rPr>
       </w:pPr>
     </w:p>
-    <w:p>
+    <w:p ns2:paraId="1E85F520" ns2:textId="77777777">
       <w:pPr>
         <w:pBdr>
           <w:top w:val="nil"/>
@@ -175,7 +175,7 @@
         </w:rPr>
       </w:pPr>
     </w:p>
-    <w:p>
+    <w:p ns2:paraId="1419A245" ns2:textId="77777777">
       <w:pPr>
         <w:pBdr>
           <w:top w:val="nil"/>
@@ -191,7 +191,7 @@
         </w:rPr>
       </w:pPr>
     </w:p>
-    <w:p>
+    <w:p ns2:paraId="12599121" ns2:textId="231C5176">
       <w:pPr>
         <w:pBdr>
           <w:top w:val="nil"/>
@@ -219,7 +219,7 @@
         <w:t>APLICACIÓN WEB BASADA EN PROCESOS DE NEGOCIO PARA LA GESTIÓN DE LA ORIENTACIÓN VOCACIONAL Y EL AUTOCONOCIMIENTO EN ESTUDIANTES CHILENOS</w:t>
       </w:r>
     </w:p>
-    <w:p>
+    <w:p ns2:paraId="743FF16D" ns2:textId="77777777">
       <w:pPr>
         <w:pBdr>
           <w:top w:val="nil"/>
@@ -235,7 +235,7 @@
         </w:rPr>
       </w:pPr>
     </w:p>
-    <w:p>
+    <w:p ns2:paraId="541DE892" ns2:textId="77777777">
       <w:pPr>
         <w:pBdr>
           <w:top w:val="nil"/>
@@ -251,7 +251,7 @@
         </w:rPr>
       </w:pPr>
     </w:p>
-    <w:p>
+    <w:p ns2:paraId="3D6B7E33" ns2:textId="7CAEFAC5">
       <w:pPr>
         <w:pStyle w:val="PortadaInicialNormal"/>
       </w:pPr>
@@ -265,7 +265,7 @@
         <w:t>en Computación e Informática</w:t>
       </w:r>
     </w:p>
-    <w:p>
+    <w:p ns2:paraId="1A6FFA30" ns2:textId="77777777">
       <w:pPr>
         <w:pBdr>
           <w:top w:val="nil"/>
@@ -281,7 +281,7 @@
         </w:rPr>
       </w:pPr>
     </w:p>
-    <w:p>
+    <w:p ns2:paraId="54DDD269" ns2:textId="5925FCF7">
       <w:pPr>
         <w:pBdr>
           <w:top w:val="nil"/>
@@ -313,7 +313,7 @@
         <w:t>r</w:t>
       </w:r>
     </w:p>
-    <w:p>
+    <w:p ns2:paraId="5CDDF137" ns2:textId="061DDC55">
       <w:pPr>
         <w:pBdr>
           <w:top w:val="nil"/>
@@ -337,7 +337,7 @@
         <w:t>José Miguel Piña Benítez</w:t>
       </w:r>
     </w:p>
-    <w:p>
+    <w:p ns2:paraId="497BBA79" ns2:textId="77777777">
       <w:pPr>
         <w:pBdr>
           <w:top w:val="nil"/>
@@ -353,7 +353,7 @@
         </w:rPr>
       </w:pPr>
     </w:p>
-    <w:p>
+    <w:p ns2:paraId="315ABF36" ns2:textId="77777777">
       <w:pPr>
         <w:pBdr>
           <w:top w:val="nil"/>
@@ -377,7 +377,7 @@
         <w:t>PROFESOR GUÍA</w:t>
       </w:r>
     </w:p>
-    <w:p>
+    <w:p ns2:paraId="48980E4D" ns2:textId="4AB939F1">
       <w:pPr>
         <w:pBdr>
           <w:top w:val="nil"/>
@@ -401,7 +401,7 @@
         <w:t>Lismary Alejandra Cubillan Aizpurua</w:t>
       </w:r>
     </w:p>
-    <w:p>
+    <w:p ns2:paraId="0C697DC9" ns2:textId="77777777">
       <w:pPr>
         <w:pBdr>
           <w:top w:val="nil"/>
@@ -417,7 +417,7 @@
         </w:rPr>
       </w:pPr>
     </w:p>
-    <w:p>
+    <w:p ns2:paraId="460B4B61" ns2:textId="77777777">
       <w:pPr>
         <w:pBdr>
           <w:top w:val="nil"/>
@@ -433,7 +433,7 @@
         </w:rPr>
       </w:pPr>
     </w:p>
-    <w:p>
+    <w:p ns2:paraId="3263A470" ns2:textId="77777777">
       <w:pPr>
         <w:pBdr>
           <w:top w:val="nil"/>
@@ -449,7 +449,7 @@
         </w:rPr>
       </w:pPr>
     </w:p>
-    <w:p>
+    <w:p ns2:paraId="33A81E7A" ns2:textId="77777777">
       <w:pPr>
         <w:pBdr>
           <w:top w:val="nil"/>
@@ -465,7 +465,7 @@
         </w:rPr>
       </w:pPr>
     </w:p>
-    <w:p>
+    <w:p ns2:paraId="53A5F43A" ns2:textId="77777777">
       <w:pPr>
         <w:pBdr>
           <w:top w:val="nil"/>
@@ -481,7 +481,7 @@
         </w:rPr>
       </w:pPr>
     </w:p>
-    <w:p>
+    <w:p ns2:paraId="209740F8" ns2:textId="77777777">
       <w:pPr>
         <w:pBdr>
           <w:top w:val="nil"/>
@@ -497,7 +497,7 @@
         </w:rPr>
       </w:pPr>
     </w:p>
-    <w:p>
+    <w:p ns2:paraId="65A43326" ns2:textId="66AB25E6">
       <w:pPr>
         <w:pBdr>
           <w:top w:val="nil"/>
@@ -529,7 +529,7 @@
         <w:t xml:space="preserve"> CHILE</w:t>
       </w:r>
     </w:p>
-    <w:p>
+    <w:p ns2:paraId="46A9AF04" ns2:textId="434E225B">
       <w:pPr>
         <w:pBdr>
           <w:top w:val="nil"/>
@@ -570,7 +570,7 @@
         <w:t>5</w:t>
       </w:r>
     </w:p>
-    <w:p>
+    <w:p ns2:paraId="76AC19D8" ns2:textId="17C5DAA1">
       <w:pPr>
         <w:rPr>
           <w:b/>
@@ -588,32 +588,32 @@
         </w:rPr>
         <w:lastRenderedPageBreak/>
         <w:drawing>
-          <wp:inline distT="0" distB="0" distL="0" distR="0" wp14:anchorId="60707FE7" wp14:editId="0DF76E87">
+          <wp:inline distT="0" distB="0" distL="0" distR="0" ns4:anchorId="60707FE7" ns4:editId="0DF76E87">
             <wp:extent cx="1857375" cy="1755140"/>
             <wp:effectExtent l="0" t="0" r="9525" b="0"/>
             <wp:docPr id="2" name="Imagen 2"/>
             <wp:cNvGraphicFramePr>
-              <a:graphicFrameLocks xmlns:a="http://schemas.openxmlformats.org/drawingml/2006/main" noChangeAspect="1"/>
+              <a:graphicFrameLocks noChangeAspect="1"/>
             </wp:cNvGraphicFramePr>
-            <a:graphic xmlns:a="http://schemas.openxmlformats.org/drawingml/2006/main">
+            <a:graphic>
               <a:graphicData uri="http://schemas.openxmlformats.org/drawingml/2006/picture">
-                <pic:pic xmlns:pic="http://schemas.openxmlformats.org/drawingml/2006/picture">
-                  <pic:nvPicPr>
-                    <pic:cNvPr id="1" name="logo-01.png"/>
-                    <pic:cNvPicPr/>
-                  </pic:nvPicPr>
-                  <pic:blipFill rotWithShape="1">
+                <ns6:pic>
+                  <ns6:nvPicPr>
+                    <ns6:cNvPr id="1" name="logo-01.png"/>
+                    <ns6:cNvPicPr/>
+                  </ns6:nvPicPr>
+                  <ns6:blipFill rotWithShape="1">
                     <a:blip r:embed="rId15" cstate="print">
                       <a:extLst>
                         <a:ext uri="{28A0092B-C50C-407E-A947-70E740481C1C}">
-                          <a14:useLocalDpi xmlns:a14="http://schemas.microsoft.com/office/drawing/2010/main" val="0"/>
+                          <ns8:useLocalDpi val="0"/>
                         </a:ext>
                       </a:extLst>
                     </a:blip>
                     <a:srcRect r="58335"/>
                     <a:stretch/>
-                  </pic:blipFill>
-                  <pic:spPr bwMode="auto">
+                  </ns6:blipFill>
+                  <ns6:spPr bwMode="auto">
                     <a:xfrm>
                       <a:off x="0" y="0"/>
                       <a:ext cx="1857917" cy="1755652"/>
@@ -626,18 +626,18 @@
                     </a:ln>
                     <a:extLst>
                       <a:ext uri="{53640926-AAD7-44D8-BBD7-CCE9431645EC}">
-                        <a14:shadowObscured xmlns:a14="http://schemas.microsoft.com/office/drawing/2010/main"/>
+                        <ns8:shadowObscured/>
                       </a:ext>
                     </a:extLst>
-                  </pic:spPr>
-                </pic:pic>
+                  </ns6:spPr>
+                </ns6:pic>
               </a:graphicData>
             </a:graphic>
           </wp:inline>
         </w:drawing>
       </w:r>
     </w:p>
-    <w:p>
+    <w:p ns2:paraId="43687B2A" ns2:textId="77777777">
       <w:pPr>
         <w:rPr>
           <w:b/>
@@ -646,7 +646,7 @@
         </w:rPr>
       </w:pPr>
     </w:p>
-    <w:p>
+    <w:p ns2:paraId="1A49D24D" ns2:textId="77777777">
       <w:pPr>
         <w:rPr>
           <w:rFonts w:ascii="Arial" w:hAnsi="Arial" w:cs="Arial"/>
@@ -656,7 +656,7 @@
         </w:rPr>
       </w:pPr>
     </w:p>
-    <w:p>
+    <w:p ns2:paraId="1D1597DC" ns2:textId="77777777">
       <w:pPr>
         <w:pBdr>
           <w:top w:val="nil"/>
@@ -680,7 +680,7 @@
         <w:t>FACULTAD DE INGENIERÍA</w:t>
       </w:r>
     </w:p>
-    <w:p>
+    <w:p ns2:paraId="606F9C20" ns2:textId="27228F0B">
       <w:pPr>
         <w:pBdr>
           <w:top w:val="nil"/>
@@ -712,7 +712,7 @@
         <w:t>EN COMPUTACIÓN E INFORMÁTICA</w:t>
       </w:r>
     </w:p>
-    <w:p>
+    <w:p ns2:paraId="34C56339" ns2:textId="151EE265">
       <w:pPr>
         <w:pBdr>
           <w:top w:val="nil"/>
@@ -765,7 +765,7 @@
         <w:tab/>
       </w:r>
     </w:p>
-    <w:p>
+    <w:p ns2:paraId="4E7A144D" ns2:textId="77777777">
       <w:pPr>
         <w:pBdr>
           <w:top w:val="nil"/>
@@ -781,7 +781,7 @@
         </w:rPr>
       </w:pPr>
     </w:p>
-    <w:p>
+    <w:p ns2:paraId="3C69B500" ns2:textId="77777777">
       <w:pPr>
         <w:pBdr>
           <w:top w:val="nil"/>
@@ -805,7 +805,7 @@
         <w:t>DECLARACIÓN DE ORIGINALIDAD Y PROPIEDAD</w:t>
       </w:r>
     </w:p>
-    <w:p>
+    <w:p ns2:paraId="3E519179" ns2:textId="77777777">
       <w:pPr>
         <w:pBdr>
           <w:top w:val="nil"/>
@@ -822,7 +822,7 @@
         </w:rPr>
       </w:pPr>
     </w:p>
-    <w:p>
+    <w:p ns2:paraId="637F7415" ns2:textId="77777777">
       <w:pPr>
         <w:pStyle w:val="Textoindependiente"/>
         <w:spacing w:before="5"/>
@@ -838,7 +838,7 @@
         <w:t>Yo, José Miguel Piña Benítez, declaro por este medio que el trabajo de titulación presentado para su defensa y evaluación es original; las fuentes, herramientas y aplicaciones utilizadas que contribuyeron a la investigación realizada están debidamente citadas en el texto y acreditadas en el apartado de las referencias, conforme con los requisitos que establece el estilo bibliográfico APA 7.0 y respetando los aspectos que conciernen a la propiedad intelectual.</w:t>
       </w:r>
     </w:p>
-    <w:p>
+    <w:p ns2:paraId="0B774586" ns2:textId="3178E3A8">
       <w:pPr>
         <w:pStyle w:val="Textoindependiente"/>
         <w:spacing w:before="5"/>
@@ -860,7 +860,7 @@
         <w:br/>
       </w:r>
     </w:p>
-    <w:p>
+    <w:p ns2:paraId="79B2EE22" ns2:textId="77777777">
       <w:pPr>
         <w:pStyle w:val="Textoindependiente"/>
         <w:tabs>
@@ -888,7 +888,7 @@
         <w:t>de Ingeniería</w:t>
       </w:r>
     </w:p>
-    <w:p>
+    <w:p ns2:paraId="606680FD" ns2:textId="77777777">
       <w:pPr>
         <w:pStyle w:val="Textoindependiente"/>
         <w:tabs>
@@ -916,7 +916,7 @@
         <w:t>Computación e Informática</w:t>
       </w:r>
     </w:p>
-    <w:p>
+    <w:p ns2:paraId="576F66D1" ns2:textId="00E3D568">
       <w:pPr>
         <w:pStyle w:val="Textoindependiente"/>
         <w:tabs>
@@ -950,7 +950,7 @@
         <w:t>Aplicación web basada en procesos de negocio para la gestión de la orientación vocacional y el autoconocimiento en estudiantes chilenos</w:t>
       </w:r>
     </w:p>
-    <w:p>
+    <w:p ns2:paraId="61A91314" ns2:textId="77777777">
       <w:pPr>
         <w:pStyle w:val="Textoindependiente"/>
         <w:jc w:val="right"/>
@@ -961,7 +961,7 @@
         </w:rPr>
       </w:pPr>
     </w:p>
-    <w:p>
+    <w:p ns2:paraId="3C769723" ns2:textId="74184201">
       <w:pPr>
         <w:pStyle w:val="Textoindependiente"/>
         <w:jc w:val="right"/>
@@ -1048,7 +1048,7 @@
         <w:t>autor</w:t>
       </w:r>
     </w:p>
-    <w:p>
+    <w:p ns2:paraId="5EAB6C53" ns2:textId="77777777">
       <w:pPr>
         <w:pBdr>
           <w:top w:val="nil"/>
@@ -1066,7 +1066,7 @@
         </w:rPr>
       </w:pPr>
     </w:p>
-    <w:p>
+    <w:p ns2:paraId="5F23895B" ns2:textId="1863013B">
       <w:pPr>
         <w:spacing w:after="200" w:line="276" w:lineRule="auto"/>
         <w:jc w:val="left"/>
@@ -1076,7 +1076,7 @@
         </w:rPr>
       </w:pPr>
     </w:p>
-    <w:p>
+    <w:p ns2:paraId="71595B38" ns2:textId="77777777">
       <w:pPr>
         <w:pBdr>
           <w:top w:val="nil"/>
@@ -1102,7 +1102,7 @@
         <w:t>AGRADECIMIENTOS</w:t>
       </w:r>
     </w:p>
-    <w:p>
+    <w:p ns2:paraId="0C0D7A85" ns2:textId="77777777">
       <w:pPr>
         <w:spacing w:after="200" w:line="276" w:lineRule="auto"/>
         <w:jc w:val="left"/>
@@ -1111,7 +1111,7 @@
         </w:rPr>
       </w:pPr>
     </w:p>
-    <w:p>
+    <w:p ns2:paraId="6DA62D68" ns2:textId="5E3FBEA2">
       <w:pPr>
         <w:jc w:val="left"/>
       </w:pPr>
@@ -1140,7 +1140,7 @@
         <w:br/>
       </w:r>
     </w:p>
-    <w:p>
+    <w:p ns2:paraId="1B28F248" ns2:textId="77777777">
       <w:pPr>
         <w:jc w:val="left"/>
       </w:pPr>
@@ -1151,7 +1151,7 @@
         <w:t>Asimismo, agradezco a la Facultad de Ingeniería de la Universidad Andrés Bello por brindarme las herramientas conceptuales y técnicas necesarias para afrontar los desafíos del desarrollo de software moderno y la ingeniería de procesos.</w:t>
       </w:r>
     </w:p>
-    <w:p>
+    <w:p ns2:paraId="41F7C7CA" ns2:textId="77777777">
       <w:pPr>
         <w:spacing w:line="276" w:lineRule="auto"/>
         <w:jc w:val="both"/>
@@ -1162,7 +1162,7 @@
         </w:rPr>
       </w:pPr>
     </w:p>
-    <w:p>
+    <w:p ns2:paraId="15B8B7BE" ns2:textId="77777777">
       <w:pPr>
         <w:spacing w:line="276" w:lineRule="auto"/>
         <w:jc w:val="both"/>
@@ -1173,7 +1173,7 @@
         </w:rPr>
       </w:pPr>
     </w:p>
-    <w:p>
+    <w:p ns2:paraId="1A10A66B" ns2:textId="77777777">
       <w:pPr>
         <w:spacing w:line="276" w:lineRule="auto"/>
         <w:jc w:val="both"/>
@@ -1184,7 +1184,7 @@
         </w:rPr>
       </w:pPr>
     </w:p>
-    <w:p>
+    <w:p ns2:paraId="67634536" ns2:textId="77777777">
       <w:pPr>
         <w:spacing w:line="276" w:lineRule="auto"/>
         <w:jc w:val="both"/>
@@ -1195,7 +1195,7 @@
         </w:rPr>
       </w:pPr>
     </w:p>
-    <w:p>
+    <w:p ns2:paraId="7F83B5E2" ns2:textId="77777777">
       <w:pPr>
         <w:spacing w:line="276" w:lineRule="auto"/>
         <w:jc w:val="both"/>
@@ -1206,7 +1206,7 @@
         </w:rPr>
       </w:pPr>
     </w:p>
-    <w:p>
+    <w:p ns2:paraId="34C194A5" ns2:textId="77777777">
       <w:pPr>
         <w:spacing w:line="276" w:lineRule="auto"/>
         <w:jc w:val="both"/>
@@ -1217,7 +1217,7 @@
         </w:rPr>
       </w:pPr>
     </w:p>
-    <w:p>
+    <w:p ns2:paraId="448D01C9" ns2:textId="77777777">
       <w:pPr>
         <w:spacing w:line="276" w:lineRule="auto"/>
         <w:jc w:val="both"/>
@@ -1228,7 +1228,7 @@
         </w:rPr>
       </w:pPr>
     </w:p>
-    <w:p>
+    <w:p ns2:paraId="5DAF38C0" ns2:textId="77777777">
       <w:pPr>
         <w:spacing w:line="276" w:lineRule="auto"/>
         <w:jc w:val="both"/>
@@ -1239,7 +1239,7 @@
         </w:rPr>
       </w:pPr>
     </w:p>
-    <w:p>
+    <w:p ns2:paraId="3A7FD570" ns2:textId="77777777">
       <w:pPr>
         <w:spacing w:line="276" w:lineRule="auto"/>
         <w:jc w:val="both"/>
@@ -1250,7 +1250,7 @@
         </w:rPr>
       </w:pPr>
     </w:p>
-    <w:p>
+    <w:p ns2:paraId="2DAC54D7" ns2:textId="77777777">
       <w:pPr>
         <w:spacing w:line="276" w:lineRule="auto"/>
         <w:jc w:val="both"/>
@@ -1261,7 +1261,7 @@
         </w:rPr>
       </w:pPr>
     </w:p>
-    <w:p>
+    <w:p ns2:paraId="5365D713" ns2:textId="77777777">
       <w:pPr>
         <w:spacing w:line="276" w:lineRule="auto"/>
         <w:jc w:val="both"/>
@@ -1272,7 +1272,7 @@
         </w:rPr>
       </w:pPr>
     </w:p>
-    <w:p>
+    <w:p ns2:paraId="0A3054BC" ns2:textId="77777777">
       <w:pPr>
         <w:spacing w:line="276" w:lineRule="auto"/>
         <w:jc w:val="both"/>
@@ -1283,7 +1283,7 @@
         </w:rPr>
       </w:pPr>
     </w:p>
-    <w:p>
+    <w:p ns2:paraId="6965E5C9" ns2:textId="4D7B4FDC">
       <w:pPr>
         <w:spacing w:line="276" w:lineRule="auto"/>
         <w:jc w:val="both"/>
@@ -1294,7 +1294,7 @@
         </w:rPr>
       </w:pPr>
     </w:p>
-    <w:p>
+    <w:p ns2:paraId="0EB391F4" ns2:textId="4B578390">
       <w:pPr>
         <w:spacing w:line="276" w:lineRule="auto"/>
         <w:jc w:val="both"/>
@@ -1305,7 +1305,7 @@
         </w:rPr>
       </w:pPr>
     </w:p>
-    <w:p>
+    <w:p ns2:paraId="775F08E5" ns2:textId="7F34478B">
       <w:pPr>
         <w:spacing w:line="276" w:lineRule="auto"/>
         <w:jc w:val="both"/>
@@ -1316,7 +1316,7 @@
         </w:rPr>
       </w:pPr>
     </w:p>
-    <w:p>
+    <w:p ns2:paraId="13A9A865" ns2:textId="55E494D2">
       <w:pPr>
         <w:spacing w:line="276" w:lineRule="auto"/>
         <w:jc w:val="both"/>
@@ -1327,7 +1327,7 @@
         </w:rPr>
       </w:pPr>
     </w:p>
-    <w:p>
+    <w:p ns2:paraId="3D2E268A" ns2:textId="05C26705">
       <w:pPr>
         <w:rPr>
           <w:rFonts w:ascii="Verdana" w:hAnsi="Verdana"/>
@@ -1344,7 +1344,7 @@
         <w:br w:type="page"/>
       </w:r>
     </w:p>
-    <w:p>
+    <w:p ns2:paraId="5D2A3CAB" ns2:textId="40F64F6E">
       <w:pPr>
         <w:spacing w:line="276" w:lineRule="auto"/>
         <w:jc w:val="both"/>
@@ -1380,7 +1380,7 @@
         </w:docPartObj>
       </w:sdtPr>
       <w:sdtContent>
-        <w:p>
+        <w:p ns2:paraId="5C453285" ns2:textId="5B278213">
           <w:pPr>
             <w:pStyle w:val="TtuloTDC"/>
           </w:pPr>
@@ -1391,7 +1391,7 @@
             <w:t>Tabla de contenido</w:t>
           </w:r>
         </w:p>
-        <w:p>
+        <w:p ns2:paraId="0A32B889" ns2:textId="23100D2C">
           <w:pPr>
             <w:pStyle w:val="TDC1"/>
             <w:rPr>
@@ -1402,7 +1402,7 @@
               <w:kern w:val="2"/>
               <w:szCs w:val="24"/>
               <w:lang w:val="es-CL"/>
-              <w14:ligatures w14:val="standardContextual"/>
+              <ns2:ligatures ns2:val="standardContextual"/>
             </w:rPr>
           </w:pPr>
           <w:r>
@@ -1465,7 +1465,7 @@
             </w:r>
           </w:hyperlink>
         </w:p>
-        <w:p>
+        <w:p ns2:paraId="56DE156B" ns2:textId="67B17845">
           <w:pPr>
             <w:pStyle w:val="TDC2"/>
             <w:tabs>
@@ -1479,7 +1479,7 @@
               <w:sz w:val="24"/>
               <w:szCs w:val="24"/>
               <w:lang w:val="es-CL" w:eastAsia="es-CL"/>
-              <w14:ligatures w14:val="standardContextual"/>
+              <ns2:ligatures ns2:val="standardContextual"/>
             </w:rPr>
           </w:pPr>
           <w:hyperlink w:anchor="_Toc232975647" w:history="1">
@@ -1541,7 +1541,7 @@
             </w:r>
           </w:hyperlink>
         </w:p>
-        <w:p>
+        <w:p ns2:paraId="20E885CF" ns2:textId="61038064">
           <w:pPr>
             <w:pStyle w:val="TDC2"/>
             <w:tabs>
@@ -1555,7 +1555,7 @@
               <w:sz w:val="24"/>
               <w:szCs w:val="24"/>
               <w:lang w:val="es-CL" w:eastAsia="es-CL"/>
-              <w14:ligatures w14:val="standardContextual"/>
+              <ns2:ligatures ns2:val="standardContextual"/>
             </w:rPr>
           </w:pPr>
           <w:hyperlink w:anchor="_Toc232975648" w:history="1">
@@ -1617,7 +1617,7 @@
             </w:r>
           </w:hyperlink>
         </w:p>
-        <w:p>
+        <w:p ns2:paraId="13622B2C" ns2:textId="5C1E88A6">
           <w:pPr>
             <w:pStyle w:val="TDC2"/>
             <w:tabs>
@@ -1631,7 +1631,7 @@
               <w:sz w:val="24"/>
               <w:szCs w:val="24"/>
               <w:lang w:val="es-CL" w:eastAsia="es-CL"/>
-              <w14:ligatures w14:val="standardContextual"/>
+              <ns2:ligatures ns2:val="standardContextual"/>
             </w:rPr>
           </w:pPr>
           <w:hyperlink w:anchor="_Toc232975649" w:history="1">
@@ -1693,7 +1693,7 @@
             </w:r>
           </w:hyperlink>
         </w:p>
-        <w:p>
+        <w:p ns2:paraId="381EE9B6" ns2:textId="6767BB40">
           <w:pPr>
             <w:pStyle w:val="TDC1"/>
             <w:rPr>
@@ -1704,7 +1704,7 @@
               <w:kern w:val="2"/>
               <w:szCs w:val="24"/>
               <w:lang w:val="es-CL"/>
-              <w14:ligatures w14:val="standardContextual"/>
+              <ns2:ligatures ns2:val="standardContextual"/>
             </w:rPr>
           </w:pPr>
           <w:hyperlink w:anchor="_Toc232975650" w:history="1">
@@ -1724,7 +1724,7 @@
                 <w:kern w:val="2"/>
                 <w:szCs w:val="24"/>
                 <w:lang w:val="es-CL"/>
-                <w14:ligatures w14:val="standardContextual"/>
+                <ns2:ligatures ns2:val="standardContextual"/>
               </w:rPr>
               <w:tab/>
             </w:r>
@@ -1777,7 +1777,7 @@
             </w:r>
           </w:hyperlink>
         </w:p>
-        <w:p>
+        <w:p ns2:paraId="14F8C3D6" ns2:textId="13F0C7D6">
           <w:pPr>
             <w:pStyle w:val="TDC2"/>
             <w:tabs>
@@ -1791,7 +1791,7 @@
               <w:sz w:val="24"/>
               <w:szCs w:val="24"/>
               <w:lang w:val="es-CL" w:eastAsia="es-CL"/>
-              <w14:ligatures w14:val="standardContextual"/>
+              <ns2:ligatures ns2:val="standardContextual"/>
             </w:rPr>
           </w:pPr>
           <w:hyperlink w:anchor="_Toc232975651" w:history="1">
@@ -1853,7 +1853,7 @@
             </w:r>
           </w:hyperlink>
         </w:p>
-        <w:p>
+        <w:p ns2:paraId="267D9E9E" ns2:textId="06D56042">
           <w:pPr>
             <w:pStyle w:val="TDC2"/>
             <w:tabs>
@@ -1867,7 +1867,7 @@
               <w:sz w:val="24"/>
               <w:szCs w:val="24"/>
               <w:lang w:val="es-CL" w:eastAsia="es-CL"/>
-              <w14:ligatures w14:val="standardContextual"/>
+              <ns2:ligatures ns2:val="standardContextual"/>
             </w:rPr>
           </w:pPr>
           <w:hyperlink w:anchor="_Toc232975652" w:history="1">
@@ -1929,7 +1929,7 @@
             </w:r>
           </w:hyperlink>
         </w:p>
-        <w:p>
+        <w:p ns2:paraId="3C3ADDE1" ns2:textId="4FF7C7E7">
           <w:pPr>
             <w:pStyle w:val="TDC2"/>
             <w:tabs>
@@ -1943,7 +1943,7 @@
               <w:sz w:val="24"/>
               <w:szCs w:val="24"/>
               <w:lang w:val="es-CL" w:eastAsia="es-CL"/>
-              <w14:ligatures w14:val="standardContextual"/>
+              <ns2:ligatures ns2:val="standardContextual"/>
             </w:rPr>
           </w:pPr>
           <w:hyperlink w:anchor="_Toc232975653" w:history="1">
@@ -2005,7 +2005,7 @@
             </w:r>
           </w:hyperlink>
         </w:p>
-        <w:p>
+        <w:p ns2:paraId="395EC958" ns2:textId="368B6988">
           <w:pPr>
             <w:pStyle w:val="TDC2"/>
             <w:tabs>
@@ -2019,7 +2019,7 @@
               <w:sz w:val="24"/>
               <w:szCs w:val="24"/>
               <w:lang w:val="es-CL" w:eastAsia="es-CL"/>
-              <w14:ligatures w14:val="standardContextual"/>
+              <ns2:ligatures ns2:val="standardContextual"/>
             </w:rPr>
           </w:pPr>
           <w:hyperlink w:anchor="_Toc232975654" w:history="1">
@@ -2081,7 +2081,7 @@
             </w:r>
           </w:hyperlink>
         </w:p>
-        <w:p>
+        <w:p ns2:paraId="045F0F30" ns2:textId="78B4C749">
           <w:pPr>
             <w:pStyle w:val="TDC2"/>
             <w:tabs>
@@ -2095,7 +2095,7 @@
               <w:sz w:val="24"/>
               <w:szCs w:val="24"/>
               <w:lang w:val="es-CL" w:eastAsia="es-CL"/>
-              <w14:ligatures w14:val="standardContextual"/>
+              <ns2:ligatures ns2:val="standardContextual"/>
             </w:rPr>
           </w:pPr>
           <w:hyperlink w:anchor="_Toc232975655" w:history="1">
@@ -2157,7 +2157,7 @@
             </w:r>
           </w:hyperlink>
         </w:p>
-        <w:p>
+        <w:p ns2:paraId="4DD64C39" ns2:textId="33705B52">
           <w:pPr>
             <w:pStyle w:val="TDC2"/>
             <w:tabs>
@@ -2171,7 +2171,7 @@
               <w:sz w:val="24"/>
               <w:szCs w:val="24"/>
               <w:lang w:val="es-CL" w:eastAsia="es-CL"/>
-              <w14:ligatures w14:val="standardContextual"/>
+              <ns2:ligatures ns2:val="standardContextual"/>
             </w:rPr>
           </w:pPr>
           <w:hyperlink w:anchor="_Toc232975656" w:history="1">
@@ -2233,7 +2233,7 @@
             </w:r>
           </w:hyperlink>
         </w:p>
-        <w:p>
+        <w:p ns2:paraId="313711DB" ns2:textId="693583CA">
           <w:pPr>
             <w:pStyle w:val="TDC1"/>
             <w:rPr>
@@ -2244,7 +2244,7 @@
               <w:kern w:val="2"/>
               <w:szCs w:val="24"/>
               <w:lang w:val="es-CL"/>
-              <w14:ligatures w14:val="standardContextual"/>
+              <ns2:ligatures ns2:val="standardContextual"/>
             </w:rPr>
           </w:pPr>
           <w:hyperlink w:anchor="_Toc232975657" w:history="1">
@@ -2264,7 +2264,7 @@
                 <w:kern w:val="2"/>
                 <w:szCs w:val="24"/>
                 <w:lang w:val="es-CL"/>
-                <w14:ligatures w14:val="standardContextual"/>
+                <ns2:ligatures ns2:val="standardContextual"/>
               </w:rPr>
               <w:tab/>
             </w:r>
@@ -2317,7 +2317,7 @@
             </w:r>
           </w:hyperlink>
         </w:p>
-        <w:p>
+        <w:p ns2:paraId="28B4CEA9" ns2:textId="3BF764A7">
           <w:pPr>
             <w:pStyle w:val="TDC2"/>
             <w:tabs>
@@ -2331,7 +2331,7 @@
               <w:sz w:val="24"/>
               <w:szCs w:val="24"/>
               <w:lang w:val="es-CL" w:eastAsia="es-CL"/>
-              <w14:ligatures w14:val="standardContextual"/>
+              <ns2:ligatures ns2:val="standardContextual"/>
             </w:rPr>
           </w:pPr>
           <w:hyperlink w:anchor="_Toc232975658" w:history="1">
@@ -2393,7 +2393,7 @@
             </w:r>
           </w:hyperlink>
         </w:p>
-        <w:p>
+        <w:p ns2:paraId="3B68E38A" ns2:textId="6CDDF4C7">
           <w:pPr>
             <w:pStyle w:val="TDC3"/>
             <w:tabs>
@@ -2408,7 +2408,7 @@
               <w:sz w:val="24"/>
               <w:szCs w:val="24"/>
               <w:lang w:val="es-CL" w:eastAsia="es-CL"/>
-              <w14:ligatures w14:val="standardContextual"/>
+              <ns2:ligatures ns2:val="standardContextual"/>
             </w:rPr>
           </w:pPr>
           <w:hyperlink w:anchor="_Toc232975659" w:history="1">
@@ -2471,7 +2471,7 @@
             </w:r>
           </w:hyperlink>
         </w:p>
-        <w:p>
+        <w:p ns2:paraId="41EDFD2C" ns2:textId="33B96C22">
           <w:pPr>
             <w:pStyle w:val="TDC2"/>
             <w:tabs>
@@ -2485,7 +2485,7 @@
               <w:sz w:val="24"/>
               <w:szCs w:val="24"/>
               <w:lang w:val="es-CL" w:eastAsia="es-CL"/>
-              <w14:ligatures w14:val="standardContextual"/>
+              <ns2:ligatures ns2:val="standardContextual"/>
             </w:rPr>
           </w:pPr>
           <w:hyperlink w:anchor="_Toc232975660" w:history="1">
@@ -2547,7 +2547,7 @@
             </w:r>
           </w:hyperlink>
         </w:p>
-        <w:p>
+        <w:p ns2:paraId="62166B3B" ns2:textId="2D5B9C0E">
           <w:pPr>
             <w:pStyle w:val="TDC2"/>
             <w:tabs>
@@ -2561,7 +2561,7 @@
               <w:sz w:val="24"/>
               <w:szCs w:val="24"/>
               <w:lang w:val="es-CL" w:eastAsia="es-CL"/>
-              <w14:ligatures w14:val="standardContextual"/>
+              <ns2:ligatures ns2:val="standardContextual"/>
             </w:rPr>
           </w:pPr>
           <w:hyperlink w:anchor="_Toc232975661" w:history="1">
@@ -2623,7 +2623,7 @@
             </w:r>
           </w:hyperlink>
         </w:p>
-        <w:p>
+        <w:p ns2:paraId="111CA601" ns2:textId="49170D9E">
           <w:pPr>
             <w:pStyle w:val="TDC2"/>
             <w:tabs>
@@ -2637,7 +2637,7 @@
               <w:sz w:val="24"/>
               <w:szCs w:val="24"/>
               <w:lang w:val="es-CL" w:eastAsia="es-CL"/>
-              <w14:ligatures w14:val="standardContextual"/>
+              <ns2:ligatures ns2:val="standardContextual"/>
             </w:rPr>
           </w:pPr>
           <w:hyperlink w:anchor="_Toc232975662" w:history="1">
@@ -2699,7 +2699,7 @@
             </w:r>
           </w:hyperlink>
         </w:p>
-        <w:p>
+        <w:p ns2:paraId="1319399A" ns2:textId="7D03423E">
           <w:pPr>
             <w:pStyle w:val="TDC2"/>
             <w:tabs>
@@ -2713,7 +2713,7 @@
               <w:sz w:val="24"/>
               <w:szCs w:val="24"/>
               <w:lang w:val="es-CL" w:eastAsia="es-CL"/>
-              <w14:ligatures w14:val="standardContextual"/>
+              <ns2:ligatures ns2:val="standardContextual"/>
             </w:rPr>
           </w:pPr>
           <w:hyperlink w:anchor="_Toc232975663" w:history="1">
@@ -2775,7 +2775,7 @@
             </w:r>
           </w:hyperlink>
         </w:p>
-        <w:p>
+        <w:p ns2:paraId="49C37620" ns2:textId="10411167">
           <w:pPr>
             <w:pStyle w:val="TDC2"/>
             <w:tabs>
@@ -2789,7 +2789,7 @@
               <w:sz w:val="24"/>
               <w:szCs w:val="24"/>
               <w:lang w:val="es-CL" w:eastAsia="es-CL"/>
-              <w14:ligatures w14:val="standardContextual"/>
+              <ns2:ligatures ns2:val="standardContextual"/>
             </w:rPr>
           </w:pPr>
           <w:hyperlink w:anchor="_Toc232975664" w:history="1">
@@ -2851,7 +2851,7 @@
             </w:r>
           </w:hyperlink>
         </w:p>
-        <w:p>
+        <w:p ns2:paraId="6A9797C4" ns2:textId="20B197DA">
           <w:pPr>
             <w:pStyle w:val="TDC1"/>
             <w:rPr>
@@ -2862,7 +2862,7 @@
               <w:kern w:val="2"/>
               <w:szCs w:val="24"/>
               <w:lang w:val="es-CL"/>
-              <w14:ligatures w14:val="standardContextual"/>
+              <ns2:ligatures ns2:val="standardContextual"/>
             </w:rPr>
           </w:pPr>
           <w:hyperlink w:anchor="_Toc232975665" w:history="1">
@@ -2882,7 +2882,7 @@
                 <w:kern w:val="2"/>
                 <w:szCs w:val="24"/>
                 <w:lang w:val="es-CL"/>
-                <w14:ligatures w14:val="standardContextual"/>
+                <ns2:ligatures ns2:val="standardContextual"/>
               </w:rPr>
               <w:tab/>
             </w:r>
@@ -2935,7 +2935,7 @@
             </w:r>
           </w:hyperlink>
         </w:p>
-        <w:p>
+        <w:p ns2:paraId="54A63ADB" ns2:textId="2C9AC261">
           <w:pPr>
             <w:pStyle w:val="TDC2"/>
             <w:tabs>
@@ -2949,7 +2949,7 @@
               <w:sz w:val="24"/>
               <w:szCs w:val="24"/>
               <w:lang w:val="es-CL" w:eastAsia="es-CL"/>
-              <w14:ligatures w14:val="standardContextual"/>
+              <ns2:ligatures ns2:val="standardContextual"/>
             </w:rPr>
           </w:pPr>
           <w:hyperlink w:anchor="_Toc232975666" w:history="1">
@@ -3011,7 +3011,7 @@
             </w:r>
           </w:hyperlink>
         </w:p>
-        <w:p>
+        <w:p ns2:paraId="082CB8AE" ns2:textId="0785900E">
           <w:pPr>
             <w:pStyle w:val="TDC2"/>
             <w:tabs>
@@ -3025,7 +3025,7 @@
               <w:sz w:val="24"/>
               <w:szCs w:val="24"/>
               <w:lang w:val="es-CL" w:eastAsia="es-CL"/>
-              <w14:ligatures w14:val="standardContextual"/>
+              <ns2:ligatures ns2:val="standardContextual"/>
             </w:rPr>
           </w:pPr>
           <w:hyperlink w:anchor="_Toc232975667" w:history="1">
@@ -3087,7 +3087,7 @@
             </w:r>
           </w:hyperlink>
         </w:p>
-        <w:p>
+        <w:p ns2:paraId="36B5ABE0" ns2:textId="17069A52">
           <w:pPr>
             <w:pStyle w:val="TDC2"/>
             <w:tabs>
@@ -3101,7 +3101,7 @@
               <w:sz w:val="24"/>
               <w:szCs w:val="24"/>
               <w:lang w:val="es-CL" w:eastAsia="es-CL"/>
-              <w14:ligatures w14:val="standardContextual"/>
+              <ns2:ligatures ns2:val="standardContextual"/>
             </w:rPr>
           </w:pPr>
           <w:hyperlink w:anchor="_Toc232975668" w:history="1">
@@ -3163,7 +3163,7 @@
             </w:r>
           </w:hyperlink>
         </w:p>
-        <w:p>
+        <w:p ns2:paraId="728F80D8" ns2:textId="047F9F86">
           <w:pPr>
             <w:pStyle w:val="TDC2"/>
             <w:tabs>
@@ -3177,7 +3177,7 @@
               <w:sz w:val="24"/>
               <w:szCs w:val="24"/>
               <w:lang w:val="es-CL" w:eastAsia="es-CL"/>
-              <w14:ligatures w14:val="standardContextual"/>
+              <ns2:ligatures ns2:val="standardContextual"/>
             </w:rPr>
           </w:pPr>
           <w:hyperlink w:anchor="_Toc232975669" w:history="1">
@@ -3239,7 +3239,7 @@
             </w:r>
           </w:hyperlink>
         </w:p>
-        <w:p>
+        <w:p ns2:paraId="064EE1D2" ns2:textId="3450DA11">
           <w:pPr>
             <w:pStyle w:val="TDC2"/>
             <w:tabs>
@@ -3253,7 +3253,7 @@
               <w:sz w:val="24"/>
               <w:szCs w:val="24"/>
               <w:lang w:val="es-CL" w:eastAsia="es-CL"/>
-              <w14:ligatures w14:val="standardContextual"/>
+              <ns2:ligatures ns2:val="standardContextual"/>
             </w:rPr>
           </w:pPr>
           <w:hyperlink w:anchor="_Toc232975670" w:history="1">
@@ -3315,7 +3315,7 @@
             </w:r>
           </w:hyperlink>
         </w:p>
-        <w:p>
+        <w:p ns2:paraId="1B39F8CD" ns2:textId="2347E25A">
           <w:pPr>
             <w:pStyle w:val="TDC2"/>
             <w:tabs>
@@ -3329,7 +3329,7 @@
               <w:sz w:val="24"/>
               <w:szCs w:val="24"/>
               <w:lang w:val="es-CL" w:eastAsia="es-CL"/>
-              <w14:ligatures w14:val="standardContextual"/>
+              <ns2:ligatures ns2:val="standardContextual"/>
             </w:rPr>
           </w:pPr>
           <w:hyperlink w:anchor="_Toc232975671" w:history="1">
@@ -3391,7 +3391,7 @@
             </w:r>
           </w:hyperlink>
         </w:p>
-        <w:p>
+        <w:p ns2:paraId="1A0A9D34" ns2:textId="3BFB34E5">
           <w:pPr>
             <w:pStyle w:val="TDC3"/>
             <w:tabs>
@@ -3406,7 +3406,7 @@
               <w:sz w:val="24"/>
               <w:szCs w:val="24"/>
               <w:lang w:val="es-CL" w:eastAsia="es-CL"/>
-              <w14:ligatures w14:val="standardContextual"/>
+              <ns2:ligatures ns2:val="standardContextual"/>
             </w:rPr>
           </w:pPr>
           <w:hyperlink w:anchor="_Toc232975672" w:history="1">
@@ -3469,7 +3469,7 @@
             </w:r>
           </w:hyperlink>
         </w:p>
-        <w:p>
+        <w:p ns2:paraId="243D875E" ns2:textId="55AB3225">
           <w:pPr>
             <w:pStyle w:val="TDC3"/>
             <w:tabs>
@@ -3484,7 +3484,7 @@
               <w:sz w:val="24"/>
               <w:szCs w:val="24"/>
               <w:lang w:val="es-CL" w:eastAsia="es-CL"/>
-              <w14:ligatures w14:val="standardContextual"/>
+              <ns2:ligatures ns2:val="standardContextual"/>
             </w:rPr>
           </w:pPr>
           <w:hyperlink w:anchor="_Toc232975673" w:history="1">
@@ -3547,7 +3547,7 @@
             </w:r>
           </w:hyperlink>
         </w:p>
-        <w:p>
+        <w:p ns2:paraId="677EF2D1" ns2:textId="23D5EF46">
           <w:pPr>
             <w:pStyle w:val="TDC3"/>
             <w:tabs>
@@ -3562,7 +3562,7 @@
               <w:sz w:val="24"/>
               <w:szCs w:val="24"/>
               <w:lang w:val="es-CL" w:eastAsia="es-CL"/>
-              <w14:ligatures w14:val="standardContextual"/>
+              <ns2:ligatures ns2:val="standardContextual"/>
             </w:rPr>
           </w:pPr>
           <w:hyperlink w:anchor="_Toc232975674" w:history="1">
@@ -3625,7 +3625,7 @@
             </w:r>
           </w:hyperlink>
         </w:p>
-        <w:p>
+        <w:p ns2:paraId="0C363BAF" ns2:textId="4D9FB97B">
           <w:pPr>
             <w:pStyle w:val="TDC3"/>
             <w:tabs>
@@ -3640,7 +3640,7 @@
               <w:sz w:val="24"/>
               <w:szCs w:val="24"/>
               <w:lang w:val="es-CL" w:eastAsia="es-CL"/>
-              <w14:ligatures w14:val="standardContextual"/>
+              <ns2:ligatures ns2:val="standardContextual"/>
             </w:rPr>
           </w:pPr>
           <w:hyperlink w:anchor="_Toc232975675" w:history="1">
@@ -3703,7 +3703,7 @@
             </w:r>
           </w:hyperlink>
         </w:p>
-        <w:p>
+        <w:p ns2:paraId="179C5070" ns2:textId="00843FD6">
           <w:pPr>
             <w:pStyle w:val="TDC3"/>
             <w:tabs>
@@ -3718,7 +3718,7 @@
               <w:sz w:val="24"/>
               <w:szCs w:val="24"/>
               <w:lang w:val="es-CL" w:eastAsia="es-CL"/>
-              <w14:ligatures w14:val="standardContextual"/>
+              <ns2:ligatures ns2:val="standardContextual"/>
             </w:rPr>
           </w:pPr>
           <w:hyperlink w:anchor="_Toc232975676" w:history="1">
@@ -3781,7 +3781,7 @@
             </w:r>
           </w:hyperlink>
         </w:p>
-        <w:p>
+        <w:p ns2:paraId="62C6A470" ns2:textId="2B7EF78D">
           <w:pPr>
             <w:pStyle w:val="TDC1"/>
             <w:rPr>
@@ -3792,7 +3792,7 @@
               <w:kern w:val="2"/>
               <w:szCs w:val="24"/>
               <w:lang w:val="es-CL"/>
-              <w14:ligatures w14:val="standardContextual"/>
+              <ns2:ligatures ns2:val="standardContextual"/>
             </w:rPr>
           </w:pPr>
           <w:hyperlink w:anchor="_Toc232975677" w:history="1">
@@ -3839,7 +3839,7 @@
             </w:r>
           </w:hyperlink>
         </w:p>
-        <w:p>
+        <w:p ns2:paraId="799F4F06" ns2:textId="2D3B9AEB">
           <w:pPr>
             <w:pStyle w:val="TDC1"/>
             <w:rPr>
@@ -3850,7 +3850,7 @@
               <w:kern w:val="2"/>
               <w:szCs w:val="24"/>
               <w:lang w:val="es-CL"/>
-              <w14:ligatures w14:val="standardContextual"/>
+              <ns2:ligatures ns2:val="standardContextual"/>
             </w:rPr>
           </w:pPr>
           <w:hyperlink w:anchor="_Toc232975678" w:history="1">
@@ -3870,7 +3870,7 @@
                 <w:kern w:val="2"/>
                 <w:szCs w:val="24"/>
                 <w:lang w:val="es-CL"/>
-                <w14:ligatures w14:val="standardContextual"/>
+                <ns2:ligatures ns2:val="standardContextual"/>
               </w:rPr>
               <w:tab/>
             </w:r>
@@ -3923,7 +3923,7 @@
             </w:r>
           </w:hyperlink>
         </w:p>
-        <w:p>
+        <w:p ns2:paraId="6FA7A06C" ns2:textId="05AF2166">
           <w:pPr>
             <w:pStyle w:val="TDC2"/>
             <w:tabs>
@@ -3937,7 +3937,7 @@
               <w:sz w:val="24"/>
               <w:szCs w:val="24"/>
               <w:lang w:val="es-CL" w:eastAsia="es-CL"/>
-              <w14:ligatures w14:val="standardContextual"/>
+              <ns2:ligatures ns2:val="standardContextual"/>
             </w:rPr>
           </w:pPr>
           <w:hyperlink w:anchor="_Toc232975679" w:history="1">
@@ -3999,7 +3999,7 @@
             </w:r>
           </w:hyperlink>
         </w:p>
-        <w:p>
+        <w:p ns2:paraId="0CC24A32" ns2:textId="7F6047BE">
           <w:pPr>
             <w:pStyle w:val="TDC3"/>
             <w:tabs>
@@ -4014,7 +4014,7 @@
               <w:sz w:val="24"/>
               <w:szCs w:val="24"/>
               <w:lang w:val="es-CL" w:eastAsia="es-CL"/>
-              <w14:ligatures w14:val="standardContextual"/>
+              <ns2:ligatures ns2:val="standardContextual"/>
             </w:rPr>
           </w:pPr>
           <w:hyperlink w:anchor="_Toc232975680" w:history="1">
@@ -4068,7 +4068,7 @@
             </w:r>
           </w:hyperlink>
         </w:p>
-        <w:p>
+        <w:p ns2:paraId="14A5167D" ns2:textId="31E2AE06">
           <w:pPr>
             <w:pStyle w:val="TDC2"/>
             <w:tabs>
@@ -4082,7 +4082,7 @@
               <w:sz w:val="24"/>
               <w:szCs w:val="24"/>
               <w:lang w:val="es-CL" w:eastAsia="es-CL"/>
-              <w14:ligatures w14:val="standardContextual"/>
+              <ns2:ligatures ns2:val="standardContextual"/>
             </w:rPr>
           </w:pPr>
           <w:hyperlink w:anchor="_Toc232975681" w:history="1">
@@ -4144,7 +4144,7 @@
             </w:r>
           </w:hyperlink>
         </w:p>
-        <w:p>
+        <w:p ns2:paraId="1C5C8757" ns2:textId="50369869">
           <w:pPr>
             <w:pStyle w:val="TDC3"/>
             <w:tabs>
@@ -4159,7 +4159,7 @@
               <w:sz w:val="24"/>
               <w:szCs w:val="24"/>
               <w:lang w:val="es-CL" w:eastAsia="es-CL"/>
-              <w14:ligatures w14:val="standardContextual"/>
+              <ns2:ligatures ns2:val="standardContextual"/>
             </w:rPr>
           </w:pPr>
           <w:hyperlink w:anchor="_Toc232975682" w:history="1">
@@ -4222,7 +4222,7 @@
             </w:r>
           </w:hyperlink>
         </w:p>
-        <w:p>
+        <w:p ns2:paraId="24C0C47D" ns2:textId="661553B4">
           <w:pPr>
             <w:pStyle w:val="TDC3"/>
             <w:tabs>
@@ -4237,7 +4237,7 @@
               <w:sz w:val="24"/>
               <w:szCs w:val="24"/>
               <w:lang w:val="es-CL" w:eastAsia="es-CL"/>
-              <w14:ligatures w14:val="standardContextual"/>
+              <ns2:ligatures ns2:val="standardContextual"/>
             </w:rPr>
           </w:pPr>
           <w:hyperlink w:anchor="_Toc232975683" w:history="1">
@@ -4300,7 +4300,7 @@
             </w:r>
           </w:hyperlink>
         </w:p>
-        <w:p>
+        <w:p ns2:paraId="123EA583" ns2:textId="39735B17">
           <w:pPr>
             <w:pStyle w:val="TDC3"/>
             <w:tabs>
@@ -4315,7 +4315,7 @@
               <w:sz w:val="24"/>
               <w:szCs w:val="24"/>
               <w:lang w:val="es-CL" w:eastAsia="es-CL"/>
-              <w14:ligatures w14:val="standardContextual"/>
+              <ns2:ligatures ns2:val="standardContextual"/>
             </w:rPr>
           </w:pPr>
           <w:hyperlink w:anchor="_Toc232975684" w:history="1">
@@ -4378,7 +4378,7 @@
             </w:r>
           </w:hyperlink>
         </w:p>
-        <w:p>
+        <w:p ns2:paraId="08604B9D" ns2:textId="04F84B20">
           <w:pPr>
             <w:pStyle w:val="TDC3"/>
             <w:tabs>
@@ -4393,7 +4393,7 @@
               <w:sz w:val="24"/>
               <w:szCs w:val="24"/>
               <w:lang w:val="es-CL" w:eastAsia="es-CL"/>
-              <w14:ligatures w14:val="standardContextual"/>
+              <ns2:ligatures ns2:val="standardContextual"/>
             </w:rPr>
           </w:pPr>
           <w:hyperlink w:anchor="_Toc232975685" w:history="1">
@@ -4456,7 +4456,7 @@
             </w:r>
           </w:hyperlink>
         </w:p>
-        <w:p>
+        <w:p ns2:paraId="71418246" ns2:textId="35B45051">
           <w:pPr>
             <w:pStyle w:val="TDC2"/>
             <w:tabs>
@@ -4470,7 +4470,7 @@
               <w:sz w:val="24"/>
               <w:szCs w:val="24"/>
               <w:lang w:val="es-CL" w:eastAsia="es-CL"/>
-              <w14:ligatures w14:val="standardContextual"/>
+              <ns2:ligatures ns2:val="standardContextual"/>
             </w:rPr>
           </w:pPr>
           <w:hyperlink w:anchor="_Toc232975686" w:history="1">
@@ -4535,7 +4535,7 @@
             </w:r>
           </w:hyperlink>
         </w:p>
-        <w:p>
+        <w:p ns2:paraId="792FB921" ns2:textId="1EA4462F">
           <w:pPr>
             <w:pStyle w:val="TDC1"/>
             <w:rPr>
@@ -4546,7 +4546,7 @@
               <w:kern w:val="2"/>
               <w:szCs w:val="24"/>
               <w:lang w:val="es-CL"/>
-              <w14:ligatures w14:val="standardContextual"/>
+              <ns2:ligatures ns2:val="standardContextual"/>
             </w:rPr>
           </w:pPr>
           <w:hyperlink w:anchor="_Toc232975687" w:history="1">
@@ -4600,7 +4600,7 @@
             </w:r>
           </w:hyperlink>
         </w:p>
-        <w:p>
+        <w:p ns2:paraId="65AFFFF1" ns2:textId="0B3714D9">
           <w:r>
             <w:rPr>
               <w:b/>
@@ -4612,7 +4612,7 @@
         </w:p>
       </w:sdtContent>
     </w:sdt>
-    <w:p>
+    <w:p ns2:paraId="1B0724FC" ns2:textId="77777777">
       <w:pPr>
         <w:spacing w:line="276" w:lineRule="auto"/>
         <w:jc w:val="both"/>
@@ -4622,7 +4622,7 @@
         </w:rPr>
       </w:pPr>
     </w:p>
-    <w:p>
+    <w:p ns2:paraId="78599745" ns2:textId="1BD1534E">
       <w:pPr>
         <w:jc w:val="both"/>
         <w:rPr>
@@ -4638,7 +4638,7 @@
         <w:br w:type="page"/>
       </w:r>
     </w:p>
-    <w:p>
+    <w:p ns2:paraId="0F3246D7" ns2:textId="54CC850D">
       <w:pPr>
         <w:spacing w:line="360" w:lineRule="auto"/>
         <w:jc w:val="left"/>
@@ -4698,7 +4698,7 @@
         <w:t>El sistema educativo chileno enfrenta desafíos en la orientación vocacional de estudiantes que se encuentran próximos a egresar de la enseñanza media. En muchos casos, los jóvenes deben tomar decisiones académicas y profesionales con un nivel limitado de autoconocimiento respecto de sus intereses, preferencias y características personales, mientras que los mecanismos de orientación disponibles suelen variar significativamente entre establecimientos educacionales.</w:t>
       </w:r>
     </w:p>
-    <w:p>
+    <w:p ns2:paraId="6BAE589A" ns2:textId="55599523">
       <w:pPr>
         <w:spacing w:line="360" w:lineRule="auto"/>
         <w:jc w:val="left"/>
@@ -4715,7 +4715,7 @@
         <w:t>La ausencia de procesos estandarizados que integren herramientas de apoyo al autoconocimiento dificulta el seguimiento y la trazabilidad de las acciones de orientación vocacional, limitando la capacidad de los establecimientos para acompañar de manera consistente a los estudiantes durante la toma de decisiones.</w:t>
       </w:r>
     </w:p>
-    <w:p>
+    <w:p ns2:paraId="0686E445" ns2:textId="382FB71C">
       <w:pPr>
         <w:spacing w:line="360" w:lineRule="auto"/>
         <w:jc w:val="left"/>
@@ -4741,7 +4741,7 @@
         <w:br/>
       </w:r>
     </w:p>
-    <w:p>
+    <w:p ns2:paraId="7FEFDE77" ns2:textId="0FD1D717">
       <w:pPr>
         <w:spacing w:line="360" w:lineRule="auto"/>
         <w:jc w:val="left"/>
@@ -4784,7 +4784,7 @@
         <w:br/>
       </w:r>
     </w:p>
-    <w:p>
+    <w:p ns2:paraId="2CFD6329" ns2:textId="32853AE4">
       <w:pPr>
         <w:jc w:val="left"/>
         <w:rPr>
@@ -4800,7 +4800,7 @@
         <w:br w:type="page"/>
       </w:r>
     </w:p>
-    <w:p>
+    <w:p ns2:paraId="30366C4C" ns2:textId="09327D3C">
       <w:pPr>
         <w:spacing w:line="360" w:lineRule="auto"/>
         <w:jc w:val="left"/>
@@ -4844,7 +4844,7 @@
         <w:br/>
       </w:r>
     </w:p>
-    <w:p>
+    <w:p ns2:paraId="32E57D32" ns2:textId="4ADF1DD6">
       <w:pPr>
         <w:spacing w:line="360" w:lineRule="auto"/>
         <w:jc w:val="left"/>
@@ -4896,7 +4896,7 @@
         <w:t xml:space="preserve"> de 44 ítems, y el cálculo inmediato de las cinco dimensiones de la personalidad (OCEAN). El sistema genera un reporte vocacional enriquecido con gráficos de radar y sugerencias de afinidad profesional alineadas al estudiante, centralizando toda la información en un panel de seguimiento en tiempo real para el orientador. </w:t>
       </w:r>
     </w:p>
-    <w:p>
+    <w:p ns2:paraId="2D6411F6" ns2:textId="77777777">
       <w:pPr>
         <w:spacing w:line="360" w:lineRule="auto"/>
         <w:jc w:val="left"/>
@@ -4926,7 +4926,7 @@
         <w:t xml:space="preserve"> </w:t>
       </w:r>
     </w:p>
-    <w:p>
+    <w:p ns2:paraId="2900BBFC" ns2:textId="22E0BFB1">
       <w:pPr>
         <w:spacing w:line="360" w:lineRule="auto"/>
         <w:jc w:val="left"/>
@@ -4950,7 +4950,7 @@
         <w:br/>
       </w:r>
     </w:p>
-    <w:p>
+    <w:p ns2:paraId="1C387DB4" ns2:textId="77777777">
       <w:pPr>
         <w:spacing w:line="360" w:lineRule="auto"/>
         <w:jc w:val="left"/>
@@ -4976,7 +4976,7 @@
         <w:t xml:space="preserve"> Gestión de Procesos de Negocio (BPM), Orientación Vocacional, Modelo Big Five (OCEAN), Aplicación Web, Camunda.</w:t>
       </w:r>
     </w:p>
-    <w:p>
+    <w:p ns2:paraId="3B895CEB" ns2:textId="77777777">
       <w:pPr>
         <w:spacing w:line="360" w:lineRule="auto"/>
         <w:jc w:val="both"/>
@@ -4987,7 +4987,7 @@
         </w:rPr>
       </w:pPr>
     </w:p>
-    <w:p>
+    <w:p ns2:paraId="05A4822B" ns2:textId="77777777">
       <w:pPr>
         <w:spacing w:line="360" w:lineRule="auto"/>
         <w:jc w:val="both"/>
@@ -5005,7 +5005,7 @@
         </w:sectPr>
       </w:pPr>
     </w:p>
-    <w:p>
+    <w:p ns2:paraId="378A0BA2" ns2:textId="63C20386">
       <w:pPr>
         <w:pStyle w:val="Ttulo1"/>
       </w:pPr>
@@ -5022,7 +5022,7 @@
       </w:r>
       <w:bookmarkEnd w:id="5"/>
     </w:p>
-    <w:p>
+    <w:p ns2:paraId="0F8D6387" ns2:textId="77777777">
       <w:pPr>
         <w:pStyle w:val="Ttulo2"/>
         <w:rPr>
@@ -5038,7 +5038,7 @@
       </w:r>
       <w:bookmarkEnd w:id="6"/>
     </w:p>
-    <w:p>
+    <w:p ns2:paraId="3E2FED03" ns2:textId="435A3223">
       <w:pPr>
         <w:widowControl w:val="0"/>
         <w:pBdr>
@@ -5070,7 +5070,7 @@
         <w:t>asociado a múltiples factores, entre ellos el limitado acceso a procesos sistemáticos de orientación vocacional y autoconocimiento.</w:t>
       </w:r>
     </w:p>
-    <w:p>
+    <w:p ns2:paraId="4FA4640E" ns2:textId="77777777">
       <w:pPr>
         <w:widowControl w:val="0"/>
         <w:pBdr>
@@ -5095,7 +5095,7 @@
         <w:t>El problema se ubica específicamente en la etapa de formación secundaria, donde la orientación vocacional suele ser tratada como un proceso administrativo anexo y no como un eje central del desarrollo del estudiante. Esta desconexión genera que la toma de decisiones sea reactiva y basada en presiones externas, en lugar de ser un proceso reflexivo y basado en datos reales sobre las habilidades y rasgos intrínsecos del joven.</w:t>
       </w:r>
     </w:p>
-    <w:p>
+    <w:p ns2:paraId="709F505D" ns2:textId="77777777">
       <w:pPr>
         <w:pStyle w:val="Ttulo2"/>
         <w:rPr>
@@ -5111,7 +5111,7 @@
       </w:r>
       <w:bookmarkEnd w:id="7"/>
     </w:p>
-    <w:p>
+    <w:p ns2:paraId="2ADAF37A" ns2:textId="296D1485">
       <w:pPr>
         <w:widowControl w:val="0"/>
         <w:pBdr>
@@ -5178,7 +5178,7 @@
         <w:t>, se reduce de manera considerable el procesamiento manual de encuestas por parte de los departamentos de orientación escolar, permitiendo a los orientadores y docentes enfocar sus esfuerzos en el acompañamiento humano personalizado de los casos de mayor complejidad.</w:t>
       </w:r>
     </w:p>
-    <w:p>
+    <w:p ns2:paraId="58B8F779" ns2:textId="77777777">
       <w:pPr>
         <w:rPr>
           <w:rFonts w:ascii="Arial" w:eastAsia="Arial" w:hAnsi="Arial" w:cs="Arial"/>
@@ -5193,7 +5193,7 @@
         <w:br w:type="page"/>
       </w:r>
     </w:p>
-    <w:p>
+    <w:p ns2:paraId="2CBB542E" ns2:textId="77777777">
       <w:pPr>
         <w:pStyle w:val="Ttulo2"/>
         <w:rPr>
@@ -5210,7 +5210,7 @@
       </w:r>
       <w:bookmarkEnd w:id="8"/>
     </w:p>
-    <w:p>
+    <w:p ns2:paraId="29993FC8" ns2:textId="77777777">
       <w:pPr>
         <w:widowControl w:val="0"/>
         <w:pBdr>
@@ -5235,7 +5235,7 @@
         <w:t>Según la literatura educativa contemporánea, la orientación no debe limitarse a la mera entrega informativa de mallas curriculares y ofertas académicas, sino que debe constituir un proceso continuo de autoconocimiento en el cual el estudiante identifique con precisión sus intereses y aptitudes individuales. Desde la perspectiva tecnológica, las aplicaciones web ofrecen marcadas ventajas en accesibilidad, escalabilidad y costo, permitiendo que soluciones personalizadas y robustas compitan eficazmente con softwares comerciales complejos, volviéndose viables para establecimientos educacionales vulnerables o con presupuestos limitados.</w:t>
       </w:r>
     </w:p>
-    <w:p>
+    <w:p ns2:paraId="773091AD" ns2:textId="77777777">
       <w:pPr>
         <w:pStyle w:val="Ttulo2"/>
         <w:rPr>
@@ -5251,7 +5251,7 @@
       </w:r>
       <w:bookmarkEnd w:id="9"/>
     </w:p>
-    <w:p>
+    <w:p ns2:paraId="1D5198A1" ns2:textId="7E8F6972">
       <w:pPr>
         <w:widowControl w:val="0"/>
         <w:pBdr>
@@ -5290,7 +5290,7 @@
         <w:t xml:space="preserve"> de la evolución vocacional del alumno y una toma de decisiones eficiente basada en datos objetivos.</w:t>
       </w:r>
     </w:p>
-    <w:p>
+    <w:p ns2:paraId="5E5918DA" ns2:textId="77777777">
       <w:pPr>
         <w:pStyle w:val="Ttulo2"/>
         <w:rPr>
@@ -5306,7 +5306,7 @@
       </w:r>
       <w:bookmarkEnd w:id="10"/>
     </w:p>
-    <w:p>
+    <w:p ns2:paraId="1B1B3E29" ns2:textId="5FB10DA2">
       <w:pPr>
         <w:widowControl w:val="0"/>
         <w:pBdr>
@@ -5331,7 +5331,7 @@
         <w:t>El trabajo consiste en desarrollar e implementar una aplicación web interactiva basada en patrones de procesos de negocio (BPM) para la gestión de la orientación vocacional y el autoconocimiento, integrando el motor Camunda Platform 8 para la orquestación del flujo y el modelo Big Five de personalidad como eje de evaluación científica, resolviendo la falta de herramientas digitales y el acompañamiento reactivo en los estudiantes de enseñanza media chilenos.</w:t>
       </w:r>
     </w:p>
-    <w:p>
+    <w:p ns2:paraId="2664E66E" ns2:textId="77777777">
       <w:pPr>
         <w:rPr>
           <w:rFonts w:ascii="Arial" w:eastAsia="Arial" w:hAnsi="Arial" w:cs="Arial"/>
@@ -5346,7 +5346,7 @@
         <w:br w:type="page"/>
       </w:r>
     </w:p>
-    <w:p>
+    <w:p ns2:paraId="7F2C71FF" ns2:textId="77777777">
       <w:pPr>
         <w:pStyle w:val="Ttulo2"/>
         <w:rPr>
@@ -5363,7 +5363,7 @@
       </w:r>
       <w:bookmarkEnd w:id="11"/>
     </w:p>
-    <w:p>
+    <w:p ns2:paraId="671E524C" ns2:textId="77777777">
       <w:pPr>
         <w:widowControl w:val="0"/>
         <w:pBdr>
@@ -5388,7 +5388,7 @@
         <w:t>Este documento se estructura de la siguiente manera: El Capítulo II detalla la identificación, fundamentación y desglose cuantitativo del problema, así como los objetivos y el alcance del sistema. El Capítulo III expone el marco metodológico, el stack de herramientas de desarrollo open-source, planes de calidad, gestión de riesgos, el cronograma detallado por sprints y el diseño exhaustivo de las interfaces a través de la sección de Prototipo. El Capítulo IV proyecta la matriz de trazabilidad y los aspectos de diseño arquitectónico y de base de datos del sistema.</w:t>
       </w:r>
     </w:p>
-    <w:p>
+    <w:p ns2:paraId="2005C287" ns2:textId="77777777">
       <w:pPr>
         <w:widowControl w:val="0"/>
         <w:pBdr>
@@ -5406,7 +5406,7 @@
         </w:rPr>
       </w:pPr>
     </w:p>
-    <w:p>
+    <w:p ns2:paraId="7CB1A1E8" ns2:textId="77777777">
       <w:pPr>
         <w:widowControl w:val="0"/>
         <w:pBdr>
@@ -5424,7 +5424,7 @@
         </w:rPr>
       </w:pPr>
     </w:p>
-    <w:p>
+    <w:p ns2:paraId="3C8CE7BA" ns2:textId="77777777">
       <w:pPr>
         <w:widowControl w:val="0"/>
         <w:pBdr>
@@ -5442,7 +5442,7 @@
         </w:rPr>
       </w:pPr>
     </w:p>
-    <w:p>
+    <w:p ns2:paraId="4F205557" ns2:textId="0422FA0D">
       <w:pPr>
         <w:jc w:val="left"/>
         <w:rPr>
@@ -5459,7 +5459,7 @@
         <w:br w:type="page"/>
       </w:r>
     </w:p>
-    <w:p>
+    <w:p ns2:paraId="4CDF8024" ns2:textId="282E1961">
       <w:pPr>
         <w:pStyle w:val="Ttulo1"/>
       </w:pPr>
@@ -5497,7 +5497,7 @@
       </w:r>
       <w:bookmarkEnd w:id="12"/>
     </w:p>
-    <w:p>
+    <w:p ns2:paraId="74100612" ns2:textId="77777777">
       <w:pPr>
         <w:pStyle w:val="Ttulo2"/>
         <w:rPr>
@@ -5513,7 +5513,7 @@
       </w:r>
       <w:bookmarkEnd w:id="13"/>
     </w:p>
-    <w:p>
+    <w:p ns2:paraId="55D343DC" ns2:textId="77777777">
       <w:pPr>
         <w:widowControl w:val="0"/>
         <w:pBdr>
@@ -5541,7 +5541,7 @@
       </w:r>
       <w:bookmarkEnd w:id="14"/>
     </w:p>
-    <w:p>
+    <w:p ns2:paraId="3099C9CF" ns2:textId="4FAA5D89">
       <w:pPr>
         <w:pStyle w:val="Ttulo2"/>
         <w:rPr>
@@ -5557,7 +5557,7 @@
       </w:r>
       <w:bookmarkEnd w:id="15"/>
     </w:p>
-    <w:p>
+    <w:p ns2:paraId="16DFE22B" ns2:textId="77777777">
       <w:pPr>
         <w:widowControl w:val="0"/>
         <w:pBdr>
@@ -5582,7 +5582,7 @@
         <w:t>Se identifican tres síntomas críticos dentro del modelo de orientación vigente:</w:t>
       </w:r>
     </w:p>
-    <w:p>
+    <w:p ns2:paraId="25F4488A" ns2:textId="77777777">
       <w:pPr>
         <w:widowControl w:val="0"/>
         <w:numPr>
@@ -5620,7 +5620,7 @@
         <w:t xml:space="preserve"> El acompañamiento se intensifica erróneamente solo en 4to medio, impidiendo una exploración progresiva y forzando decisiones apresuradas bajo la presión de las pruebas de admisión.</w:t>
       </w:r>
     </w:p>
-    <w:p>
+    <w:p ns2:paraId="278FA376" ns2:textId="77777777">
       <w:pPr>
         <w:widowControl w:val="0"/>
         <w:numPr>
@@ -5658,7 +5658,7 @@
         <w:t xml:space="preserve"> Se priorizan contenidos académicos abstractos en lugar del desarrollo de competencias blandas o el autoconocimiento científico de aptitudes.</w:t>
       </w:r>
     </w:p>
-    <w:p>
+    <w:p ns2:paraId="4C7EAABA" ns2:textId="64F6BB3E">
       <w:pPr>
         <w:widowControl w:val="0"/>
         <w:numPr>
@@ -5696,7 +5696,7 @@
         <w:t xml:space="preserve"> Existe una excesiva carga administrativa y carencia de profesionales capacitados de forma específica, reduciendo al alumno a una mera estadística.</w:t>
       </w:r>
     </w:p>
-    <w:p>
+    <w:p ns2:paraId="66D71969" ns2:textId="2F709B02">
       <w:pPr>
         <w:rPr>
           <w:rFonts w:ascii="Arial" w:eastAsia="Arial" w:hAnsi="Arial" w:cs="Arial"/>
@@ -5711,7 +5711,7 @@
         <w:br w:type="page"/>
       </w:r>
     </w:p>
-    <w:p>
+    <w:p ns2:paraId="326878A3" ns2:textId="77777777">
       <w:pPr>
         <w:pStyle w:val="Ttulo2"/>
         <w:rPr>
@@ -5728,7 +5728,7 @@
       </w:r>
       <w:bookmarkEnd w:id="16"/>
     </w:p>
-    <w:p>
+    <w:p ns2:paraId="6CE8E199" ns2:textId="77777777">
       <w:pPr>
         <w:widowControl w:val="0"/>
         <w:pBdr>
@@ -5753,7 +5753,7 @@
         <w:t>El análisis causal se estructura a partir del Diagrama de Ishikawa, abarcando las siguientes dimensiones identificadas en el entorno escolar:</w:t>
       </w:r>
     </w:p>
-    <w:p>
+    <w:p ns2:paraId="3D23A95C" ns2:textId="77777777">
       <w:pPr>
         <w:widowControl w:val="0"/>
         <w:numPr>
@@ -5791,7 +5791,7 @@
         <w:t xml:space="preserve"> Herramientas digitales sumamente limitadas y baja adopción de tecnología interactiva o plataformas centralizadas en la nube.</w:t>
       </w:r>
     </w:p>
-    <w:p>
+    <w:p ns2:paraId="1C251527" ns2:textId="77777777">
       <w:pPr>
         <w:widowControl w:val="0"/>
         <w:numPr>
@@ -5829,7 +5829,7 @@
         <w:t xml:space="preserve"> Ausencia de tests de autoconocimiento integrados metodológicamente y nulo seguimiento periódico de la evolución vocacional del alumno.</w:t>
       </w:r>
     </w:p>
-    <w:p>
+    <w:p ns2:paraId="55A92DC4" ns2:textId="77777777">
       <w:pPr>
         <w:widowControl w:val="0"/>
         <w:numPr>
@@ -5867,7 +5867,7 @@
         <w:t xml:space="preserve"> Orientación enfocada de manera reactiva en el último año de enseñanza media con un sesgo centrado estrictamente en contenidos tradicionales.</w:t>
       </w:r>
     </w:p>
-    <w:p>
+    <w:p ns2:paraId="564DA5AC" ns2:textId="762C57A1">
       <w:pPr>
         <w:widowControl w:val="0"/>
         <w:numPr>
@@ -5912,7 +5912,7 @@
         <w:t>.</w:t>
       </w:r>
     </w:p>
-    <w:p>
+    <w:p ns2:paraId="701714B2" ns2:textId="77777777">
       <w:pPr>
         <w:widowControl w:val="0"/>
         <w:pBdr>
@@ -5934,7 +5934,7 @@
         </w:rPr>
       </w:pPr>
     </w:p>
-    <w:p>
+    <w:p ns2:paraId="7BBF9663" ns2:textId="18AE4198">
       <w:pPr>
         <w:widowControl w:val="0"/>
         <w:pBdr>
@@ -5965,25 +5965,25 @@
           <w:lang w:val="es-CL" w:eastAsia="es-CL"/>
         </w:rPr>
         <w:drawing>
-          <wp:inline distT="0" distB="0" distL="0" distR="0" wp14:anchorId="4BBB1BE5" wp14:editId="5C9D8CD6">
+          <wp:inline distT="0" distB="0" distL="0" distR="0" ns4:anchorId="4BBB1BE5" ns4:editId="5C9D8CD6">
             <wp:extent cx="5217683" cy="2434442"/>
             <wp:effectExtent l="0" t="0" r="2540" b="4445"/>
             <wp:docPr id="1560822815" name="Picture 1"/>
             <wp:cNvGraphicFramePr>
-              <a:graphicFrameLocks xmlns:a="http://schemas.openxmlformats.org/drawingml/2006/main" noChangeAspect="1"/>
+              <a:graphicFrameLocks noChangeAspect="1"/>
             </wp:cNvGraphicFramePr>
-            <a:graphic xmlns:a="http://schemas.openxmlformats.org/drawingml/2006/main">
+            <a:graphic>
               <a:graphicData uri="http://schemas.openxmlformats.org/drawingml/2006/picture">
-                <pic:pic xmlns:pic="http://schemas.openxmlformats.org/drawingml/2006/picture">
-                  <pic:nvPicPr>
-                    <pic:cNvPr id="1560822815" name="Picture 1560822815"/>
-                    <pic:cNvPicPr/>
-                  </pic:nvPicPr>
-                  <pic:blipFill rotWithShape="1">
+                <ns6:pic>
+                  <ns6:nvPicPr>
+                    <ns6:cNvPr id="1560822815" name="Picture 1560822815"/>
+                    <ns6:cNvPicPr/>
+                  </ns6:nvPicPr>
+                  <ns6:blipFill rotWithShape="1">
                     <a:blip r:embed="rId17">
                       <a:extLst>
                         <a:ext uri="{28A0092B-C50C-407E-A947-70E740481C1C}">
-                          <a14:useLocalDpi xmlns:a14="http://schemas.microsoft.com/office/drawing/2010/main" val="0"/>
+                          <ns8:useLocalDpi val="0"/>
                         </a:ext>
                       </a:extLst>
                     </a:blip>
@@ -5991,8 +5991,8 @@
                     <a:stretch>
                       <a:fillRect/>
                     </a:stretch>
-                  </pic:blipFill>
-                  <pic:spPr bwMode="auto">
+                  </ns6:blipFill>
+                  <ns6:spPr bwMode="auto">
                     <a:xfrm>
                       <a:off x="0" y="0"/>
                       <a:ext cx="5235336" cy="2442679"/>
@@ -6005,18 +6005,18 @@
                     </a:ln>
                     <a:extLst>
                       <a:ext uri="{53640926-AAD7-44D8-BBD7-CCE9431645EC}">
-                        <a14:shadowObscured xmlns:a14="http://schemas.microsoft.com/office/drawing/2010/main"/>
+                        <ns8:shadowObscured/>
                       </a:ext>
                     </a:extLst>
-                  </pic:spPr>
-                </pic:pic>
+                  </ns6:spPr>
+                </ns6:pic>
               </a:graphicData>
             </a:graphic>
           </wp:inline>
         </w:drawing>
       </w:r>
     </w:p>
-    <w:p>
+    <w:p ns2:paraId="18308933" ns2:textId="77777777">
       <w:pPr>
         <w:widowControl w:val="0"/>
         <w:pBdr>
@@ -6037,7 +6037,7 @@
         </w:rPr>
       </w:pPr>
     </w:p>
-    <w:p>
+    <w:p ns2:paraId="62F4C303" ns2:textId="77777777">
       <w:pPr>
         <w:pStyle w:val="Ttulo2"/>
         <w:rPr>
@@ -6053,7 +6053,7 @@
       </w:r>
       <w:bookmarkEnd w:id="17"/>
     </w:p>
-    <w:p>
+    <w:p ns2:paraId="62EA4139" ns2:textId="588AF51C">
       <w:pPr>
         <w:widowControl w:val="0"/>
         <w:pBdr>
@@ -6082,7 +6082,7 @@
         <w:t>Desarrollar una aplicación web interactiva basada en patrones de procesos de negocio (BPM) para la gestión de la orientación vocacional y el autoconocimiento, con la finalidad de resolver las dificultades que enfrentan los jóvenes chilenos para elegir su futuro profesional debido a la falta de herramientas digitales y la orientación tardía.</w:t>
       </w:r>
     </w:p>
-    <w:p>
+    <w:p ns2:paraId="65EA1015" ns2:textId="77777777">
       <w:pPr>
         <w:rPr>
           <w:rFonts w:ascii="Arial" w:eastAsia="Arial" w:hAnsi="Arial" w:cs="Arial"/>
@@ -6101,7 +6101,7 @@
         <w:br w:type="page"/>
       </w:r>
     </w:p>
-    <w:p>
+    <w:p ns2:paraId="4FD52091" ns2:textId="77777777">
       <w:pPr>
         <w:pStyle w:val="Ttulo2"/>
         <w:rPr>
@@ -6118,7 +6118,7 @@
       </w:r>
       <w:bookmarkEnd w:id="18"/>
     </w:p>
-    <w:p>
+    <w:p ns2:paraId="3E4F33FE" ns2:textId="77777777">
       <w:pPr>
         <w:widowControl w:val="0"/>
         <w:pBdr>
@@ -6168,7 +6168,7 @@
         <w:gridCol w:w="1654"/>
         <w:gridCol w:w="1654"/>
       </w:tblGrid>
-      <w:tr>
+      <w:tr ns2:paraId="50C47CB6" ns2:textId="77777777">
         <w:trPr>
           <w:trHeight w:val="661"/>
           <w:tblHeader/>
@@ -6190,7 +6190,7 @@
               <w:right w:w="120" w:type="dxa"/>
             </w:tcMar>
           </w:tcPr>
-          <w:p>
+          <w:p ns2:paraId="7F8A5E87" ns2:textId="77777777">
             <w:pPr>
               <w:widowControl w:val="0"/>
               <w:pBdr>
@@ -6239,7 +6239,7 @@
               <w:right w:w="120" w:type="dxa"/>
             </w:tcMar>
           </w:tcPr>
-          <w:p>
+          <w:p ns2:paraId="7A595747" ns2:textId="77777777">
             <w:pPr>
               <w:widowControl w:val="0"/>
               <w:pBdr>
@@ -6288,7 +6288,7 @@
               <w:right w:w="120" w:type="dxa"/>
             </w:tcMar>
           </w:tcPr>
-          <w:p>
+          <w:p ns2:paraId="507630E8" ns2:textId="77777777">
             <w:pPr>
               <w:widowControl w:val="0"/>
               <w:pBdr>
@@ -6337,7 +6337,7 @@
               <w:right w:w="120" w:type="dxa"/>
             </w:tcMar>
           </w:tcPr>
-          <w:p>
+          <w:p ns2:paraId="613F26B2" ns2:textId="77777777">
             <w:pPr>
               <w:widowControl w:val="0"/>
               <w:pBdr>
@@ -6386,7 +6386,7 @@
               <w:right w:w="120" w:type="dxa"/>
             </w:tcMar>
           </w:tcPr>
-          <w:p>
+          <w:p ns2:paraId="4EBC6284" ns2:textId="77777777">
             <w:pPr>
               <w:widowControl w:val="0"/>
               <w:pBdr>
@@ -6417,7 +6417,7 @@
               <w:t>Criterio de éxito</w:t>
             </w:r>
           </w:p>
-          <w:p>
+          <w:p ns2:paraId="2C1C325A" ns2:textId="77777777">
             <w:pPr>
               <w:widowControl w:val="0"/>
               <w:pBdr>
@@ -6447,7 +6447,7 @@
           </w:p>
         </w:tc>
       </w:tr>
-      <w:tr>
+      <w:tr ns2:paraId="13C407A4" ns2:textId="77777777">
         <w:trPr>
           <w:trHeight w:val="1549"/>
         </w:trPr>
@@ -6467,7 +6467,7 @@
               <w:right w:w="120" w:type="dxa"/>
             </w:tcMar>
           </w:tcPr>
-          <w:p>
+          <w:p ns2:paraId="1CF1400A" ns2:textId="77777777">
             <w:pPr>
               <w:widowControl w:val="0"/>
               <w:pBdr>
@@ -6513,7 +6513,7 @@
               <w:right w:w="120" w:type="dxa"/>
             </w:tcMar>
           </w:tcPr>
-          <w:p>
+          <w:p ns2:paraId="6E328504" ns2:textId="77777777">
             <w:pPr>
               <w:widowControl w:val="0"/>
               <w:pBdr>
@@ -6559,7 +6559,7 @@
               <w:right w:w="120" w:type="dxa"/>
             </w:tcMar>
           </w:tcPr>
-          <w:p>
+          <w:p ns2:paraId="2325CBF0" ns2:textId="77777777">
             <w:pPr>
               <w:widowControl w:val="0"/>
               <w:pBdr>
@@ -6605,7 +6605,7 @@
               <w:right w:w="120" w:type="dxa"/>
             </w:tcMar>
           </w:tcPr>
-          <w:p>
+          <w:p ns2:paraId="7C0D75CC" ns2:textId="77777777">
             <w:pPr>
               <w:widowControl w:val="0"/>
               <w:pBdr>
@@ -6651,7 +6651,7 @@
               <w:right w:w="120" w:type="dxa"/>
             </w:tcMar>
           </w:tcPr>
-          <w:p>
+          <w:p ns2:paraId="2B6D1B7B" ns2:textId="77777777">
             <w:pPr>
               <w:widowControl w:val="0"/>
               <w:pBdr>
@@ -6682,7 +6682,7 @@
           </w:p>
         </w:tc>
       </w:tr>
-      <w:tr>
+      <w:tr ns2:paraId="008513BE" ns2:textId="77777777">
         <w:trPr>
           <w:trHeight w:val="1539"/>
         </w:trPr>
@@ -6703,7 +6703,7 @@
               <w:right w:w="120" w:type="dxa"/>
             </w:tcMar>
           </w:tcPr>
-          <w:p>
+          <w:p ns2:paraId="6265DCC4" ns2:textId="77777777">
             <w:pPr>
               <w:widowControl w:val="0"/>
               <w:pBdr>
@@ -6750,7 +6750,7 @@
               <w:right w:w="120" w:type="dxa"/>
             </w:tcMar>
           </w:tcPr>
-          <w:p>
+          <w:p ns2:paraId="78D34243" ns2:textId="77777777">
             <w:pPr>
               <w:widowControl w:val="0"/>
               <w:pBdr>
@@ -6797,7 +6797,7 @@
               <w:right w:w="120" w:type="dxa"/>
             </w:tcMar>
           </w:tcPr>
-          <w:p>
+          <w:p ns2:paraId="5BA1F63B" ns2:textId="77777777">
             <w:pPr>
               <w:widowControl w:val="0"/>
               <w:pBdr>
@@ -6844,7 +6844,7 @@
               <w:right w:w="120" w:type="dxa"/>
             </w:tcMar>
           </w:tcPr>
-          <w:p>
+          <w:p ns2:paraId="6F7012DE" ns2:textId="77777777">
             <w:pPr>
               <w:widowControl w:val="0"/>
               <w:pBdr>
@@ -6891,7 +6891,7 @@
               <w:right w:w="120" w:type="dxa"/>
             </w:tcMar>
           </w:tcPr>
-          <w:p>
+          <w:p ns2:paraId="3990BBE5" ns2:textId="77777777">
             <w:pPr>
               <w:widowControl w:val="0"/>
               <w:pBdr>
@@ -6922,7 +6922,7 @@
           </w:p>
         </w:tc>
       </w:tr>
-      <w:tr>
+      <w:tr ns2:paraId="6470E84E" ns2:textId="77777777">
         <w:trPr>
           <w:trHeight w:val="1539"/>
         </w:trPr>
@@ -6942,7 +6942,7 @@
               <w:right w:w="120" w:type="dxa"/>
             </w:tcMar>
           </w:tcPr>
-          <w:p>
+          <w:p ns2:paraId="0C530172" ns2:textId="77777777">
             <w:pPr>
               <w:widowControl w:val="0"/>
               <w:pBdr>
@@ -6988,7 +6988,7 @@
               <w:right w:w="120" w:type="dxa"/>
             </w:tcMar>
           </w:tcPr>
-          <w:p>
+          <w:p ns2:paraId="676B2657" ns2:textId="77777777">
             <w:pPr>
               <w:widowControl w:val="0"/>
               <w:pBdr>
@@ -7034,7 +7034,7 @@
               <w:right w:w="120" w:type="dxa"/>
             </w:tcMar>
           </w:tcPr>
-          <w:p>
+          <w:p ns2:paraId="14AAB83A" ns2:textId="77777777">
             <w:pPr>
               <w:widowControl w:val="0"/>
               <w:pBdr>
@@ -7080,7 +7080,7 @@
               <w:right w:w="120" w:type="dxa"/>
             </w:tcMar>
           </w:tcPr>
-          <w:p>
+          <w:p ns2:paraId="746A5857" ns2:textId="77777777">
             <w:pPr>
               <w:widowControl w:val="0"/>
               <w:pBdr>
@@ -7126,7 +7126,7 @@
               <w:right w:w="120" w:type="dxa"/>
             </w:tcMar>
           </w:tcPr>
-          <w:p>
+          <w:p ns2:paraId="2ECC088D" ns2:textId="77777777">
             <w:pPr>
               <w:widowControl w:val="0"/>
               <w:pBdr>
@@ -7157,7 +7157,7 @@
           </w:p>
         </w:tc>
       </w:tr>
-      <w:tr>
+      <w:tr ns2:paraId="1252BFA0" ns2:textId="77777777">
         <w:trPr>
           <w:trHeight w:val="1549"/>
         </w:trPr>
@@ -7178,7 +7178,7 @@
               <w:right w:w="120" w:type="dxa"/>
             </w:tcMar>
           </w:tcPr>
-          <w:p>
+          <w:p ns2:paraId="5A8CE56E" ns2:textId="77777777">
             <w:pPr>
               <w:widowControl w:val="0"/>
               <w:pBdr>
@@ -7225,7 +7225,7 @@
               <w:right w:w="120" w:type="dxa"/>
             </w:tcMar>
           </w:tcPr>
-          <w:p>
+          <w:p ns2:paraId="6A4A98C8" ns2:textId="77777777">
             <w:pPr>
               <w:widowControl w:val="0"/>
               <w:pBdr>
@@ -7272,7 +7272,7 @@
               <w:right w:w="120" w:type="dxa"/>
             </w:tcMar>
           </w:tcPr>
-          <w:p>
+          <w:p ns2:paraId="4AD4191B" ns2:textId="77777777">
             <w:pPr>
               <w:widowControl w:val="0"/>
               <w:pBdr>
@@ -7319,7 +7319,7 @@
               <w:right w:w="120" w:type="dxa"/>
             </w:tcMar>
           </w:tcPr>
-          <w:p>
+          <w:p ns2:paraId="45D40297" ns2:textId="77777777">
             <w:pPr>
               <w:widowControl w:val="0"/>
               <w:pBdr>
@@ -7366,7 +7366,7 @@
               <w:right w:w="120" w:type="dxa"/>
             </w:tcMar>
           </w:tcPr>
-          <w:p>
+          <w:p ns2:paraId="71743644" ns2:textId="77777777">
             <w:pPr>
               <w:widowControl w:val="0"/>
               <w:pBdr>
@@ -7398,7 +7398,7 @@
         </w:tc>
       </w:tr>
     </w:tbl>
-    <w:p>
+    <w:p ns2:paraId="4AE76620" ns2:textId="77777777">
       <w:pPr>
         <w:widowControl w:val="0"/>
         <w:pBdr>
@@ -7421,7 +7421,7 @@
         </w:rPr>
       </w:pPr>
     </w:p>
-    <w:p>
+    <w:p ns2:paraId="4F0B4D84" ns2:textId="77777777">
       <w:pPr>
         <w:rPr>
           <w:rFonts w:ascii="Arial" w:eastAsia="Arial" w:hAnsi="Arial" w:cs="Arial"/>
@@ -7444,7 +7444,7 @@
         <w:br w:type="page"/>
       </w:r>
     </w:p>
-    <w:p>
+    <w:p ns2:paraId="0B8E066A" ns2:textId="2A45B3B1">
       <w:pPr>
         <w:pStyle w:val="Ttulo2"/>
         <w:rPr>
@@ -7461,7 +7461,7 @@
       </w:r>
       <w:bookmarkEnd w:id="19"/>
     </w:p>
-    <w:p>
+    <w:p ns2:paraId="6298C734" ns2:textId="77777777">
       <w:pPr>
         <w:widowControl w:val="0"/>
         <w:pBdr>
@@ -7486,7 +7486,7 @@
         <w:t>Dada la naturaleza individual del proyecto académico, se ha acotado un Producto Mínimo Viable (MVP) que abarca los siguientes módulos e hitos de desarrollo críticos:</w:t>
       </w:r>
     </w:p>
-    <w:p>
+    <w:p ns2:paraId="1A1F06A9" ns2:textId="77777777">
       <w:pPr>
         <w:widowControl w:val="0"/>
         <w:numPr>
@@ -7524,7 +7524,7 @@
         <w:t xml:space="preserve"> Formularios de captura de datos básicos estudiantiles y validación de seguridad mediante tokens JWT.</w:t>
       </w:r>
     </w:p>
-    <w:p>
+    <w:p ns2:paraId="334F4308" ns2:textId="77777777">
       <w:pPr>
         <w:widowControl w:val="0"/>
         <w:numPr>
@@ -7562,7 +7562,7 @@
         <w:t xml:space="preserve"> Implementación digital completa del inventario Big Five compuesto por 44 ítems evaluados bajo escala Likert de 5 puntos, garantizando robustez psicométrica.</w:t>
       </w:r>
     </w:p>
-    <w:p>
+    <w:p ns2:paraId="02CB683F" ns2:textId="77777777">
       <w:pPr>
         <w:widowControl w:val="0"/>
         <w:numPr>
@@ -7600,7 +7600,7 @@
         <w:t xml:space="preserve"> Algoritmo de procesamiento inmediato de las dimensiones OCEAN (Apertura, Responsabilidad, Extraversión, Amabilidad, Estabilidad Emocional), estructurando una visualización enriquecida en gráfico de radar.</w:t>
       </w:r>
     </w:p>
-    <w:p>
+    <w:p ns2:paraId="506AE04C" ns2:textId="77777777">
       <w:pPr>
         <w:widowControl w:val="0"/>
         <w:numPr>
@@ -7638,7 +7638,7 @@
         <w:t xml:space="preserve"> Control de estados del flujo del usuario administrado mediante el motor de procesos Camunda 8.</w:t>
       </w:r>
     </w:p>
-    <w:p>
+    <w:p ns2:paraId="2F2BB248" ns2:textId="77777777">
       <w:pPr>
         <w:widowControl w:val="0"/>
         <w:numPr>
@@ -7676,7 +7676,7 @@
         <w:t xml:space="preserve"> Interfaz básica de monitoreo para visualizar la lista de estudiantes asignados y acceder a sus respectivos resultados.</w:t>
       </w:r>
     </w:p>
-    <w:p>
+    <w:p ns2:paraId="2614C4E8" ns2:textId="3A634980">
       <w:pPr>
         <w:jc w:val="left"/>
       </w:pPr>
@@ -7688,7 +7688,7 @@
         <w:t>Quedan fuera del alcance del MVP y proyectados como mejoras futuras: La exportación automatizada de reportes en formato PDF, la analítica predictiva institucional avanzada y las pruebas de interfaz automatizadas de frontend.</w:t>
       </w:r>
     </w:p>
-    <w:p>
+    <w:p ns2:paraId="1CEAF8AD" ns2:textId="77777777">
       <w:pPr>
         <w:spacing w:line="360" w:lineRule="auto"/>
         <w:jc w:val="left"/>
@@ -7697,7 +7697,7 @@
         </w:rPr>
       </w:pPr>
     </w:p>
-    <w:p>
+    <w:p ns2:paraId="200A42F9" ns2:textId="65A24A80">
       <w:pPr>
         <w:rPr>
           <w:rFonts w:ascii="Arial" w:hAnsi="Arial" w:cs="Arial"/>
@@ -7710,7 +7710,7 @@
         <w:br w:type="page"/>
       </w:r>
     </w:p>
-    <w:p>
+    <w:p ns2:paraId="0085F3FF" ns2:textId="53839555">
       <w:pPr>
         <w:pStyle w:val="Ttulo1"/>
       </w:pPr>
@@ -7727,8 +7727,8 @@
       </w:r>
       <w:bookmarkEnd w:id="20"/>
     </w:p>
-    <w:p/>
-    <w:p>
+    <w:p ns2:paraId="740F0D81" ns2:textId="77777777"/>
+    <w:p ns2:paraId="61E06728" ns2:textId="77777777">
       <w:pPr>
         <w:pStyle w:val="Ttulo2"/>
         <w:rPr>
@@ -7744,7 +7744,7 @@
       </w:r>
       <w:bookmarkEnd w:id="21"/>
     </w:p>
-    <w:p>
+    <w:p ns2:paraId="78E2508E" ns2:textId="77777777">
       <w:pPr>
         <w:widowControl w:val="0"/>
         <w:pBdr>
@@ -7769,7 +7769,7 @@
         <w:t>Para la ejecución idónea del proyecto se optó por una metodología de enfoque híbrido. Se utiliza la guía PMBOK para estructurar los macroprocesos de gestión organizativa (tales como la planificación de la calidad, la mitigación oportuna de riesgos y el control estricto del cronograma general) en coexistencia armónica con el marco ágil Scrum para guiar de manera iterativa el desarrollo del producto de software.</w:t>
       </w:r>
     </w:p>
-    <w:p>
+    <w:p ns2:paraId="1D394E6D" ns2:textId="77777777">
       <w:pPr>
         <w:widowControl w:val="0"/>
         <w:pBdr>
@@ -7794,7 +7794,7 @@
         <w:t>Este enfoque híbrido subsana las carencias del modelo tradicional Waterfall (descartado debido a su rigidez conceptual ante requerimientos evolutivos) y del Scrum puro (el cual carece de mecanismos formales para dar soporte al cumplimiento y control de hitos administrativos de carácter académico).</w:t>
       </w:r>
     </w:p>
-    <w:p>
+    <w:p ns2:paraId="3A82625F" ns2:textId="77777777">
       <w:pPr>
         <w:pStyle w:val="Ttulo2"/>
         <w:rPr>
@@ -7810,7 +7810,7 @@
       </w:r>
       <w:bookmarkEnd w:id="22"/>
     </w:p>
-    <w:p>
+    <w:p ns2:paraId="3704A7E2" ns2:textId="77777777">
       <w:pPr>
         <w:widowControl w:val="0"/>
         <w:pBdr>
@@ -7835,7 +7835,7 @@
         <w:t>La selección del stack tecnológico responde rigurosamente a restricciones de costo y robustez, priorizando ecosistemas open-source con amplio respaldo en la industria:</w:t>
       </w:r>
     </w:p>
-    <w:p>
+    <w:p ns2:paraId="48A96CFB" ns2:textId="77777777">
       <w:pPr>
         <w:widowControl w:val="0"/>
         <w:numPr>
@@ -7873,7 +7873,7 @@
         <w:t xml:space="preserve"> Framework FastAPI (Python 3.11) por su óptimo rendimiento asíncrono y la autogeneración interactiva de documentación mediante Swagger UI.</w:t>
       </w:r>
     </w:p>
-    <w:p>
+    <w:p ns2:paraId="26C6B7E5" ns2:textId="77777777">
       <w:pPr>
         <w:widowControl w:val="0"/>
         <w:numPr>
@@ -7911,7 +7911,7 @@
         <w:t xml:space="preserve"> Camunda Platform 8 (versión Self-Managed ejecutada en entorno local) encargado de la automatización secuencial del proceso vocacional bajo notación BPMN.</w:t>
       </w:r>
     </w:p>
-    <w:p>
+    <w:p ns2:paraId="30899672" ns2:textId="77777777">
       <w:pPr>
         <w:widowControl w:val="0"/>
         <w:numPr>
@@ -7949,7 +7949,7 @@
         <w:t xml:space="preserve"> Vue.js (versión 3) complementado con la librería Axios para la gestión fluida de peticiones HTTP en una arquitectura SPA.</w:t>
       </w:r>
     </w:p>
-    <w:p>
+    <w:p ns2:paraId="295D6D7B" ns2:textId="77777777">
       <w:pPr>
         <w:widowControl w:val="0"/>
         <w:numPr>
@@ -7987,7 +7987,7 @@
         <w:t xml:space="preserve"> MySQL 8.0 administrado mediante MySQL Workbench, interactuando con el backend mediante el ORM SQLAlchemy.</w:t>
       </w:r>
     </w:p>
-    <w:p>
+    <w:p ns2:paraId="003DC7E7" ns2:textId="7647C871">
       <w:pPr>
         <w:widowControl w:val="0"/>
         <w:numPr>
@@ -8025,7 +8025,7 @@
         <w:t xml:space="preserve"> Git con repositorios remotos en GitHub; desarrollo sobre Visual Studio Code operado de forma nativa bajo el sistema operativo CachyOS (distribución basada en Arch Linux).</w:t>
       </w:r>
     </w:p>
-    <w:p>
+    <w:p ns2:paraId="6670AAC1" ns2:textId="53F7AB52">
       <w:pPr>
         <w:rPr>
           <w:rFonts w:ascii="Arial" w:eastAsia="Arial" w:hAnsi="Arial" w:cs="Arial"/>
@@ -8044,7 +8044,7 @@
         <w:br w:type="page"/>
       </w:r>
     </w:p>
-    <w:p>
+    <w:p ns2:paraId="44D3167B" ns2:textId="71A9DF78">
       <w:pPr>
         <w:pStyle w:val="Ttulo2"/>
         <w:rPr>
@@ -8061,7 +8061,7 @@
       </w:r>
       <w:bookmarkEnd w:id="23"/>
     </w:p>
-    <w:p>
+    <w:p ns2:paraId="6EE9978A" ns2:textId="027FA204">
       <w:pPr>
         <w:rPr>
           <w:rFonts w:ascii="Arial" w:eastAsia="Arial" w:hAnsi="Arial" w:cs="Arial"/>
@@ -8083,33 +8083,33 @@
           <w:lang w:val="es-CL" w:eastAsia="es-CL"/>
         </w:rPr>
         <w:drawing>
-          <wp:inline distT="0" distB="0" distL="0" distR="0" wp14:anchorId="75772A86" wp14:editId="0CBBEC28">
+          <wp:inline distT="0" distB="0" distL="0" distR="0" ns4:anchorId="75772A86" ns4:editId="0CBBEC28">
             <wp:extent cx="5431790" cy="3054985"/>
             <wp:effectExtent l="0" t="0" r="0" b="0"/>
             <wp:docPr id="430900993" name="Picture 2"/>
             <wp:cNvGraphicFramePr>
-              <a:graphicFrameLocks xmlns:a="http://schemas.openxmlformats.org/drawingml/2006/main" noChangeAspect="1"/>
+              <a:graphicFrameLocks noChangeAspect="1"/>
             </wp:cNvGraphicFramePr>
-            <a:graphic xmlns:a="http://schemas.openxmlformats.org/drawingml/2006/main">
+            <a:graphic>
               <a:graphicData uri="http://schemas.openxmlformats.org/drawingml/2006/picture">
-                <pic:pic xmlns:pic="http://schemas.openxmlformats.org/drawingml/2006/picture">
-                  <pic:nvPicPr>
-                    <pic:cNvPr id="430900993" name="Picture 430900993"/>
-                    <pic:cNvPicPr/>
-                  </pic:nvPicPr>
-                  <pic:blipFill>
+                <ns6:pic>
+                  <ns6:nvPicPr>
+                    <ns6:cNvPr id="430900993" name="Picture 430900993"/>
+                    <ns6:cNvPicPr/>
+                  </ns6:nvPicPr>
+                  <ns6:blipFill>
                     <a:blip r:embed="rId18" cstate="print">
                       <a:extLst>
                         <a:ext uri="{28A0092B-C50C-407E-A947-70E740481C1C}">
-                          <a14:useLocalDpi xmlns:a14="http://schemas.microsoft.com/office/drawing/2010/main" val="0"/>
+                          <ns8:useLocalDpi val="0"/>
                         </a:ext>
                       </a:extLst>
                     </a:blip>
                     <a:stretch>
                       <a:fillRect/>
                     </a:stretch>
-                  </pic:blipFill>
-                  <pic:spPr>
+                  </ns6:blipFill>
+                  <ns6:spPr>
                     <a:xfrm>
                       <a:off x="0" y="0"/>
                       <a:ext cx="5431790" cy="3054985"/>
@@ -8117,8 +8117,8 @@
                     <a:prstGeom prst="rect">
                       <a:avLst/>
                     </a:prstGeom>
-                  </pic:spPr>
-                </pic:pic>
+                  </ns6:spPr>
+                </ns6:pic>
               </a:graphicData>
             </a:graphic>
           </wp:inline>
@@ -8136,7 +8136,7 @@
         <w:br w:type="page"/>
       </w:r>
     </w:p>
-    <w:p>
+    <w:p ns2:paraId="639E8611" ns2:textId="77777777">
       <w:pPr>
         <w:pStyle w:val="Ttulo2"/>
         <w:rPr>
@@ -8153,7 +8153,7 @@
       </w:r>
       <w:bookmarkEnd w:id="24"/>
     </w:p>
-    <w:p>
+    <w:p ns2:paraId="538A2F23" ns2:textId="77777777">
       <w:pPr>
         <w:widowControl w:val="0"/>
         <w:pBdr>
@@ -8187,7 +8187,7 @@
         <w:t xml:space="preserve"> Se contempla como riesgo principal la complejidad técnica al integrar las llamadas de servicios de Camunda 8 con los endpoints asíncronos de FastAPI. La mitigación consiste en priorizar una prueba de concepto (PoC) durante el primer sprint del proyecto. Ante retrasos por carga académica paralela, se establece una bitácora de dedicación mínima de 10 horas semanales.</w:t>
       </w:r>
     </w:p>
-    <w:p>
+    <w:p ns2:paraId="773F404E" ns2:textId="77777777">
       <w:pPr>
         <w:widowControl w:val="0"/>
         <w:pBdr>
@@ -8221,7 +8221,7 @@
         <w:t xml:space="preserve"> El código fuente backend debe alinearse estrictamente a las convenciones estilísticas de la guía PEP 8. Se exige cobertura de pruebas unitarias sobre los controladores de negocio y un umbral de tiempo de respuesta para la API REST que no exceda los 3 segundos bajo una concurrencia normal de hasta 30 usuarios en red escolar.</w:t>
       </w:r>
     </w:p>
-    <w:p>
+    <w:p ns2:paraId="5092F46F" ns2:textId="77777777">
       <w:pPr>
         <w:widowControl w:val="0"/>
         <w:pBdr>
@@ -8255,7 +8255,7 @@
         <w:t xml:space="preserve"> Se define un ciclo compuesto por pruebas unitarias automatizadas (vía Pytest para la API de backend), pruebas integrales de comunicación de interfaz y pruebas de sistema de extremo a extremo que validen de forma limpia la completitud del flujo de proceso orquestado por el motor.</w:t>
       </w:r>
     </w:p>
-    <w:p>
+    <w:p ns2:paraId="30B82928" ns2:textId="77777777">
       <w:pPr>
         <w:pStyle w:val="Ttulo2"/>
         <w:rPr>
@@ -8271,7 +8271,7 @@
       </w:r>
       <w:bookmarkEnd w:id="25"/>
     </w:p>
-    <w:p>
+    <w:p ns2:paraId="240FAD6A" ns2:textId="77777777">
       <w:pPr>
         <w:widowControl w:val="0"/>
         <w:pBdr>
@@ -8296,7 +8296,7 @@
         <w:t>El desarrollo se desglosa temporalmente en ciclos fijos de tres semanas cada uno, abarcando desde abril de 2026 hasta la entrega final programada para finales de noviembre de 2026:</w:t>
       </w:r>
     </w:p>
-    <w:p>
+    <w:p ns2:paraId="087C72BC" ns2:textId="77777777">
       <w:pPr>
         <w:widowControl w:val="0"/>
         <w:numPr>
@@ -8354,7 +8354,7 @@
         <w:t xml:space="preserve"> Inicialización del entorno, despliegue local de Camunda, PoC de integración y desarrollo de la capa de autenticación JWT.</w:t>
       </w:r>
     </w:p>
-    <w:p>
+    <w:p ns2:paraId="294A44C1" ns2:textId="77777777">
       <w:pPr>
         <w:widowControl w:val="0"/>
         <w:numPr>
@@ -8412,7 +8412,7 @@
         <w:t xml:space="preserve"> Modelado BPMN de la evaluación, maquetación del cuestionario BFI-44 en Vue.js y codificación del algoritmo de puntajes OCEAN.</w:t>
       </w:r>
     </w:p>
-    <w:p>
+    <w:p ns2:paraId="213C6B45" ns2:textId="77777777">
       <w:pPr>
         <w:widowControl w:val="0"/>
         <w:numPr>
@@ -8470,7 +8470,7 @@
         <w:t xml:space="preserve"> Construcción de la interfaz gráfica de resultados (Gráfico de Radar), lógica de reportes interpretativos y pruebas integradas de flujo.</w:t>
       </w:r>
     </w:p>
-    <w:p>
+    <w:p ns2:paraId="25EBF0AA" ns2:textId="77777777">
       <w:pPr>
         <w:widowControl w:val="0"/>
         <w:numPr>
@@ -8528,7 +8528,7 @@
         <w:t xml:space="preserve"> Implementación del panel de control para el perfil de usuario orientador y seguimiento de progreso de alumnos.</w:t>
       </w:r>
     </w:p>
-    <w:p>
+    <w:p ns2:paraId="677C5EE1" ns2:textId="77777777">
       <w:pPr>
         <w:widowControl w:val="0"/>
         <w:numPr>
@@ -8606,7 +8606,7 @@
         <w:t xml:space="preserve"> Refinamiento de interfaces, pruebas de usabilidad con un grupo muestra de 5 usuarios reales y validación de seguridad.</w:t>
       </w:r>
     </w:p>
-    <w:p>
+    <w:p ns2:paraId="2950D5A0" ns2:textId="77777777">
       <w:pPr>
         <w:pStyle w:val="Ttulo2"/>
         <w:rPr>
@@ -8623,7 +8623,7 @@
       </w:r>
       <w:bookmarkEnd w:id="26"/>
     </w:p>
-    <w:p>
+    <w:p ns2:paraId="32BC7821" ns2:textId="4346C2F7">
       <w:pPr>
         <w:widowControl w:val="0"/>
         <w:pBdr>
@@ -8657,7 +8657,7 @@
         <w:br w:type="page"/>
       </w:r>
     </w:p>
-    <w:p>
+    <w:p ns2:paraId="7574D23B" ns2:textId="5980EF43">
       <w:pPr>
         <w:pStyle w:val="Ttulo3"/>
         <w:rPr>
@@ -8676,7 +8676,7 @@
       </w:r>
       <w:bookmarkEnd w:id="27"/>
     </w:p>
-    <w:p>
+    <w:p ns2:paraId="53881591" ns2:textId="005E8C99">
       <w:pPr>
         <w:widowControl w:val="0"/>
         <w:pBdr>
@@ -8701,7 +8701,7 @@
         <w:t>Esta interfaz permite el acceso seguro a la plataforma mediante credenciales validadas (correo electrónico y contraseña cifrada). Cuenta con un selector dinámico para desviar el flujo según el rol del usuario (Estudiante u Orientador Escolar). El formulario de registro solicita datos de entrada clave como nombre completo, edad, establecimiento educativo y curso correspondiente.</w:t>
       </w:r>
     </w:p>
-    <w:p>
+    <w:p ns2:paraId="53889D87" ns2:textId="6A08F645">
       <w:pPr>
         <w:widowControl w:val="0"/>
         <w:pBdr>
@@ -8732,33 +8732,33 @@
           <w:lang w:val="es-CL" w:eastAsia="es-CL"/>
         </w:rPr>
         <w:drawing>
-          <wp:inline distT="0" distB="0" distL="0" distR="0" wp14:anchorId="2BD0DBD8" wp14:editId="0C0E2B21">
+          <wp:inline distT="0" distB="0" distL="0" distR="0" ns4:anchorId="2BD0DBD8" ns4:editId="0C0E2B21">
             <wp:extent cx="5431790" cy="2778125"/>
             <wp:effectExtent l="0" t="0" r="0" b="3175"/>
             <wp:docPr id="1597681208" name="Picture 1"/>
             <wp:cNvGraphicFramePr>
-              <a:graphicFrameLocks xmlns:a="http://schemas.openxmlformats.org/drawingml/2006/main" noChangeAspect="1"/>
+              <a:graphicFrameLocks noChangeAspect="1"/>
             </wp:cNvGraphicFramePr>
-            <a:graphic xmlns:a="http://schemas.openxmlformats.org/drawingml/2006/main">
+            <a:graphic>
               <a:graphicData uri="http://schemas.openxmlformats.org/drawingml/2006/picture">
-                <pic:pic xmlns:pic="http://schemas.openxmlformats.org/drawingml/2006/picture">
-                  <pic:nvPicPr>
-                    <pic:cNvPr id="1597681208" name="Picture 1597681208"/>
-                    <pic:cNvPicPr/>
-                  </pic:nvPicPr>
-                  <pic:blipFill>
+                <ns6:pic>
+                  <ns6:nvPicPr>
+                    <ns6:cNvPr id="1597681208" name="Picture 1597681208"/>
+                    <ns6:cNvPicPr/>
+                  </ns6:nvPicPr>
+                  <ns6:blipFill>
                     <a:blip r:embed="rId19" cstate="print">
                       <a:extLst>
                         <a:ext uri="{28A0092B-C50C-407E-A947-70E740481C1C}">
-                          <a14:useLocalDpi xmlns:a14="http://schemas.microsoft.com/office/drawing/2010/main" val="0"/>
+                          <ns8:useLocalDpi val="0"/>
                         </a:ext>
                       </a:extLst>
                     </a:blip>
                     <a:stretch>
                       <a:fillRect/>
                     </a:stretch>
-                  </pic:blipFill>
-                  <pic:spPr>
+                  </ns6:blipFill>
+                  <ns6:spPr>
                     <a:xfrm>
                       <a:off x="0" y="0"/>
                       <a:ext cx="5431790" cy="2778125"/>
@@ -8766,15 +8766,15 @@
                     <a:prstGeom prst="rect">
                       <a:avLst/>
                     </a:prstGeom>
-                  </pic:spPr>
-                </pic:pic>
+                  </ns6:spPr>
+                </ns6:pic>
               </a:graphicData>
             </a:graphic>
           </wp:inline>
         </w:drawing>
       </w:r>
     </w:p>
-    <w:p>
+    <w:p ns2:paraId="50D578BD" ns2:textId="77777777">
       <w:pPr>
         <w:widowControl w:val="0"/>
         <w:pBdr>
@@ -8795,7 +8795,7 @@
         </w:rPr>
       </w:pPr>
     </w:p>
-    <w:p>
+    <w:p ns2:paraId="316B162B" ns2:textId="77777777">
       <w:pPr>
         <w:widowControl w:val="0"/>
         <w:pBdr>
@@ -8816,7 +8816,7 @@
         </w:rPr>
       </w:pPr>
     </w:p>
-    <w:p>
+    <w:p ns2:paraId="0CA51898" ns2:textId="77777777">
       <w:pPr>
         <w:rPr>
           <w:rFonts w:ascii="Arial" w:eastAsia="Arial" w:hAnsi="Arial" w:cs="Arial"/>
@@ -8837,7 +8837,7 @@
         <w:br w:type="page"/>
       </w:r>
     </w:p>
-    <w:p>
+    <w:p ns2:paraId="3B1016EA" ns2:textId="1D84D9D2">
       <w:pPr>
         <w:pStyle w:val="Ttulo3"/>
         <w:rPr>
@@ -8856,7 +8856,7 @@
       </w:r>
       <w:bookmarkEnd w:id="28"/>
     </w:p>
-    <w:p>
+    <w:p ns2:paraId="4195657D" ns2:textId="34AD47C0">
       <w:pPr>
         <w:widowControl w:val="0"/>
         <w:pBdr>
@@ -8881,7 +8881,7 @@
         <w:t>Una vez autenticado, el estudiante accede a un panel intuitivo y lúdico que le da la bienvenida y le muestra el estado actual de su proceso guiado por el motor BPM Camunda. Si es su primera navegación, se despliega un botón destacado con la acción "Iniciar Evaluación Vocacional". Si posee registros previos, el panel expone un acceso directo a su historial de perfiles guardados.</w:t>
       </w:r>
     </w:p>
-    <w:p>
+    <w:p ns2:paraId="6856FFE8" ns2:textId="77777777">
       <w:pPr>
         <w:widowControl w:val="0"/>
         <w:pBdr>
@@ -8912,33 +8912,33 @@
           <w:lang w:val="es-CL" w:eastAsia="es-CL"/>
         </w:rPr>
         <w:drawing>
-          <wp:inline distT="0" distB="0" distL="0" distR="0" wp14:anchorId="7F12DEC0" wp14:editId="63F6BF1A">
+          <wp:inline distT="0" distB="0" distL="0" distR="0" ns4:anchorId="7F12DEC0" ns4:editId="63F6BF1A">
             <wp:extent cx="5431790" cy="3211195"/>
             <wp:effectExtent l="0" t="0" r="0" b="8255"/>
             <wp:docPr id="789010549" name="Picture 2"/>
             <wp:cNvGraphicFramePr>
-              <a:graphicFrameLocks xmlns:a="http://schemas.openxmlformats.org/drawingml/2006/main" noChangeAspect="1"/>
+              <a:graphicFrameLocks noChangeAspect="1"/>
             </wp:cNvGraphicFramePr>
-            <a:graphic xmlns:a="http://schemas.openxmlformats.org/drawingml/2006/main">
+            <a:graphic>
               <a:graphicData uri="http://schemas.openxmlformats.org/drawingml/2006/picture">
-                <pic:pic xmlns:pic="http://schemas.openxmlformats.org/drawingml/2006/picture">
-                  <pic:nvPicPr>
-                    <pic:cNvPr id="789010549" name="Picture 789010549"/>
-                    <pic:cNvPicPr/>
-                  </pic:nvPicPr>
-                  <pic:blipFill>
+                <ns6:pic>
+                  <ns6:nvPicPr>
+                    <ns6:cNvPr id="789010549" name="Picture 789010549"/>
+                    <ns6:cNvPicPr/>
+                  </ns6:nvPicPr>
+                  <ns6:blipFill>
                     <a:blip r:embed="rId20" cstate="print">
                       <a:extLst>
                         <a:ext uri="{28A0092B-C50C-407E-A947-70E740481C1C}">
-                          <a14:useLocalDpi xmlns:a14="http://schemas.microsoft.com/office/drawing/2010/main" val="0"/>
+                          <ns8:useLocalDpi val="0"/>
                         </a:ext>
                       </a:extLst>
                     </a:blip>
                     <a:stretch>
                       <a:fillRect/>
                     </a:stretch>
-                  </pic:blipFill>
-                  <pic:spPr>
+                  </ns6:blipFill>
+                  <ns6:spPr>
                     <a:xfrm>
                       <a:off x="0" y="0"/>
                       <a:ext cx="5431790" cy="3211195"/>
@@ -8946,15 +8946,15 @@
                     <a:prstGeom prst="rect">
                       <a:avLst/>
                     </a:prstGeom>
-                  </pic:spPr>
-                </pic:pic>
+                  </ns6:spPr>
+                </ns6:pic>
               </a:graphicData>
             </a:graphic>
           </wp:inline>
         </w:drawing>
       </w:r>
     </w:p>
-    <w:p>
+    <w:p ns2:paraId="76F27672" ns2:textId="77777777">
       <w:pPr>
         <w:rPr>
           <w:rFonts w:ascii="Arial" w:eastAsia="Arial" w:hAnsi="Arial" w:cs="Arial"/>
@@ -8975,7 +8975,7 @@
         <w:br w:type="page"/>
       </w:r>
     </w:p>
-    <w:p>
+    <w:p ns2:paraId="45AF48EF" ns2:textId="6CA45234">
       <w:pPr>
         <w:pStyle w:val="Ttulo3"/>
         <w:rPr>
@@ -8994,7 +8994,7 @@
       </w:r>
       <w:bookmarkEnd w:id="29"/>
     </w:p>
-    <w:p>
+    <w:p ns2:paraId="708DC4F3" ns2:textId="77777777">
       <w:pPr>
         <w:widowControl w:val="0"/>
         <w:pBdr>
@@ -9019,7 +9019,7 @@
         <w:t>Esta pantalla renderiza de manera interactiva los 44 ítems del instrumento psicométrico Big Five. Para evitar la fatiga cognitiva del usuario, las preguntas se distribuyen de forma paginada (en bloques de 10 preguntas por vista). Cada ítem se responde obligatoriamente a través de una matriz de opciones con escala Likert de 5 puntos (desde "Totalmente en desacuerdo" hasta "Totalmente de acuerdo"). El progreso parcial se almacena de forma asíncrona en la base de datos MySQL.</w:t>
       </w:r>
     </w:p>
-    <w:p>
+    <w:p ns2:paraId="7D08753A" ns2:textId="77777777">
       <w:pPr>
         <w:widowControl w:val="0"/>
         <w:pBdr>
@@ -9050,33 +9050,33 @@
           <w:lang w:val="es-CL" w:eastAsia="es-CL"/>
         </w:rPr>
         <w:drawing>
-          <wp:inline distT="0" distB="0" distL="0" distR="0" wp14:anchorId="47D075CA" wp14:editId="76ACF317">
+          <wp:inline distT="0" distB="0" distL="0" distR="0" ns4:anchorId="47D075CA" ns4:editId="76ACF317">
             <wp:extent cx="5431790" cy="3544570"/>
             <wp:effectExtent l="0" t="0" r="0" b="0"/>
             <wp:docPr id="1885610193" name="Picture 3"/>
             <wp:cNvGraphicFramePr>
-              <a:graphicFrameLocks xmlns:a="http://schemas.openxmlformats.org/drawingml/2006/main" noChangeAspect="1"/>
+              <a:graphicFrameLocks noChangeAspect="1"/>
             </wp:cNvGraphicFramePr>
-            <a:graphic xmlns:a="http://schemas.openxmlformats.org/drawingml/2006/main">
+            <a:graphic>
               <a:graphicData uri="http://schemas.openxmlformats.org/drawingml/2006/picture">
-                <pic:pic xmlns:pic="http://schemas.openxmlformats.org/drawingml/2006/picture">
-                  <pic:nvPicPr>
-                    <pic:cNvPr id="1885610193" name="Picture 1885610193"/>
-                    <pic:cNvPicPr/>
-                  </pic:nvPicPr>
-                  <pic:blipFill>
+                <ns6:pic>
+                  <ns6:nvPicPr>
+                    <ns6:cNvPr id="1885610193" name="Picture 1885610193"/>
+                    <ns6:cNvPicPr/>
+                  </ns6:nvPicPr>
+                  <ns6:blipFill>
                     <a:blip r:embed="rId21" cstate="print">
                       <a:extLst>
                         <a:ext uri="{28A0092B-C50C-407E-A947-70E740481C1C}">
-                          <a14:useLocalDpi xmlns:a14="http://schemas.microsoft.com/office/drawing/2010/main" val="0"/>
+                          <ns8:useLocalDpi val="0"/>
                         </a:ext>
                       </a:extLst>
                     </a:blip>
                     <a:stretch>
                       <a:fillRect/>
                     </a:stretch>
-                  </pic:blipFill>
-                  <pic:spPr>
+                  </ns6:blipFill>
+                  <ns6:spPr>
                     <a:xfrm>
                       <a:off x="0" y="0"/>
                       <a:ext cx="5431790" cy="3544570"/>
@@ -9084,15 +9084,15 @@
                     <a:prstGeom prst="rect">
                       <a:avLst/>
                     </a:prstGeom>
-                  </pic:spPr>
-                </pic:pic>
+                  </ns6:spPr>
+                </ns6:pic>
               </a:graphicData>
             </a:graphic>
           </wp:inline>
         </w:drawing>
       </w:r>
     </w:p>
-    <w:p>
+    <w:p ns2:paraId="612C2330" ns2:textId="77777777">
       <w:pPr>
         <w:widowControl w:val="0"/>
         <w:pBdr>
@@ -9114,7 +9114,7 @@
         </w:rPr>
       </w:pPr>
     </w:p>
-    <w:p>
+    <w:p ns2:paraId="6EB89353" ns2:textId="77777777">
       <w:pPr>
         <w:rPr>
           <w:rFonts w:ascii="Arial" w:eastAsia="Arial" w:hAnsi="Arial" w:cs="Arial"/>
@@ -9135,7 +9135,7 @@
         <w:br w:type="page"/>
       </w:r>
     </w:p>
-    <w:p>
+    <w:p ns2:paraId="5F6C26DA" ns2:textId="754EE51E">
       <w:pPr>
         <w:pStyle w:val="Ttulo3"/>
         <w:rPr>
@@ -9154,7 +9154,7 @@
       </w:r>
       <w:bookmarkEnd w:id="30"/>
     </w:p>
-    <w:p>
+    <w:p ns2:paraId="531B50B6" ns2:textId="77777777">
       <w:pPr>
         <w:widowControl w:val="0"/>
         <w:pBdr>
@@ -9179,7 +9179,7 @@
         <w:t>Al completar los 44 ítems, el motor procesa el flujo y calcula los puntajes OCEAN. Esta interfaz despliega los resultados de forma visual y de fácil lectura. Incorpora un componente gráfico de tipo radar que mapea los niveles de las cinco grandes dimensiones de la personalidad, acompañado de bloques de texto interpretativo personalizado, listado de familias de carreras afines y recomendaciones orientativas accionables basadas en el perfil dominante.</w:t>
       </w:r>
     </w:p>
-    <w:p>
+    <w:p ns2:paraId="7CEE7375" ns2:textId="2B97813D">
       <w:pPr>
         <w:widowControl w:val="0"/>
         <w:pBdr>
@@ -9210,33 +9210,33 @@
           <w:lang w:val="es-CL" w:eastAsia="es-CL"/>
         </w:rPr>
         <w:drawing>
-          <wp:inline distT="0" distB="0" distL="0" distR="0" wp14:anchorId="705A39BF" wp14:editId="54E1383A">
+          <wp:inline distT="0" distB="0" distL="0" distR="0" ns4:anchorId="705A39BF" ns4:editId="54E1383A">
             <wp:extent cx="5431790" cy="3792855"/>
             <wp:effectExtent l="0" t="0" r="0" b="0"/>
             <wp:docPr id="1613511005" name="Picture 4"/>
             <wp:cNvGraphicFramePr>
-              <a:graphicFrameLocks xmlns:a="http://schemas.openxmlformats.org/drawingml/2006/main" noChangeAspect="1"/>
+              <a:graphicFrameLocks noChangeAspect="1"/>
             </wp:cNvGraphicFramePr>
-            <a:graphic xmlns:a="http://schemas.openxmlformats.org/drawingml/2006/main">
+            <a:graphic>
               <a:graphicData uri="http://schemas.openxmlformats.org/drawingml/2006/picture">
-                <pic:pic xmlns:pic="http://schemas.openxmlformats.org/drawingml/2006/picture">
-                  <pic:nvPicPr>
-                    <pic:cNvPr id="1613511005" name="Picture 1613511005"/>
-                    <pic:cNvPicPr/>
-                  </pic:nvPicPr>
-                  <pic:blipFill>
+                <ns6:pic>
+                  <ns6:nvPicPr>
+                    <ns6:cNvPr id="1613511005" name="Picture 1613511005"/>
+                    <ns6:cNvPicPr/>
+                  </ns6:nvPicPr>
+                  <ns6:blipFill>
                     <a:blip r:embed="rId22">
                       <a:extLst>
                         <a:ext uri="{28A0092B-C50C-407E-A947-70E740481C1C}">
-                          <a14:useLocalDpi xmlns:a14="http://schemas.microsoft.com/office/drawing/2010/main" val="0"/>
+                          <ns8:useLocalDpi val="0"/>
                         </a:ext>
                       </a:extLst>
                     </a:blip>
                     <a:stretch>
                       <a:fillRect/>
                     </a:stretch>
-                  </pic:blipFill>
-                  <pic:spPr>
+                  </ns6:blipFill>
+                  <ns6:spPr>
                     <a:xfrm>
                       <a:off x="0" y="0"/>
                       <a:ext cx="5431790" cy="3792855"/>
@@ -9244,8 +9244,8 @@
                     <a:prstGeom prst="rect">
                       <a:avLst/>
                     </a:prstGeom>
-                  </pic:spPr>
-                </pic:pic>
+                  </ns6:spPr>
+                </ns6:pic>
               </a:graphicData>
             </a:graphic>
           </wp:inline>
@@ -9262,7 +9262,7 @@
         </w:rPr>
         <w:lastRenderedPageBreak/>
         <w:drawing>
-          <wp:anchor distT="0" distB="0" distL="114300" distR="114300" simplePos="0" relativeHeight="251658240" behindDoc="0" locked="0" layoutInCell="1" allowOverlap="1" wp14:anchorId="1C921A3F" wp14:editId="6D6FAA46">
+          <wp:anchor distT="0" distB="0" distL="114300" distR="114300" simplePos="0" relativeHeight="251658240" behindDoc="0" locked="0" layoutInCell="1" allowOverlap="1" ns4:anchorId="1C921A3F" ns4:editId="6D6FAA46">
             <wp:simplePos x="0" y="0"/>
             <wp:positionH relativeFrom="margin">
               <wp:align>right</wp:align>
@@ -9275,20 +9275,20 @@
             <wp:wrapSquare wrapText="bothSides"/>
             <wp:docPr id="1709967325" name="Picture 6"/>
             <wp:cNvGraphicFramePr>
-              <a:graphicFrameLocks xmlns:a="http://schemas.openxmlformats.org/drawingml/2006/main" noChangeAspect="1"/>
+              <a:graphicFrameLocks noChangeAspect="1"/>
             </wp:cNvGraphicFramePr>
-            <a:graphic xmlns:a="http://schemas.openxmlformats.org/drawingml/2006/main">
+            <a:graphic>
               <a:graphicData uri="http://schemas.openxmlformats.org/drawingml/2006/picture">
-                <pic:pic xmlns:pic="http://schemas.openxmlformats.org/drawingml/2006/picture">
-                  <pic:nvPicPr>
-                    <pic:cNvPr id="1709967325" name="Picture 1709967325"/>
-                    <pic:cNvPicPr/>
-                  </pic:nvPicPr>
-                  <pic:blipFill rotWithShape="1">
+                <ns6:pic>
+                  <ns6:nvPicPr>
+                    <ns6:cNvPr id="1709967325" name="Picture 1709967325"/>
+                    <ns6:cNvPicPr/>
+                  </ns6:nvPicPr>
+                  <ns6:blipFill rotWithShape="1">
                     <a:blip r:embed="rId23">
                       <a:extLst>
                         <a:ext uri="{28A0092B-C50C-407E-A947-70E740481C1C}">
-                          <a14:useLocalDpi xmlns:a14="http://schemas.microsoft.com/office/drawing/2010/main" val="0"/>
+                          <ns8:useLocalDpi val="0"/>
                         </a:ext>
                       </a:extLst>
                     </a:blip>
@@ -9296,8 +9296,8 @@
                     <a:stretch>
                       <a:fillRect/>
                     </a:stretch>
-                  </pic:blipFill>
-                  <pic:spPr bwMode="auto">
+                  </ns6:blipFill>
+                  <ns6:spPr bwMode="auto">
                     <a:xfrm>
                       <a:off x="0" y="0"/>
                       <a:ext cx="5431790" cy="3152775"/>
@@ -9310,16 +9310,16 @@
                     </a:ln>
                     <a:extLst>
                       <a:ext uri="{53640926-AAD7-44D8-BBD7-CCE9431645EC}">
-                        <a14:shadowObscured xmlns:a14="http://schemas.microsoft.com/office/drawing/2010/main"/>
+                        <ns8:shadowObscured/>
                       </a:ext>
                     </a:extLst>
-                  </pic:spPr>
-                </pic:pic>
+                  </ns6:spPr>
+                </ns6:pic>
               </a:graphicData>
             </a:graphic>
-            <wp14:sizeRelV relativeFrom="margin">
-              <wp14:pctHeight>0</wp14:pctHeight>
-            </wp14:sizeRelV>
+            <ns4:sizeRelV relativeFrom="margin">
+              <ns4:pctHeight>0</ns4:pctHeight>
+            </ns4:sizeRelV>
           </wp:anchor>
         </w:drawing>
       </w:r>
@@ -9333,33 +9333,33 @@
           <w:lang w:val="es-CL" w:eastAsia="es-CL"/>
         </w:rPr>
         <w:drawing>
-          <wp:inline distT="0" distB="0" distL="0" distR="0" wp14:anchorId="6F395D46" wp14:editId="22729B4A">
+          <wp:inline distT="0" distB="0" distL="0" distR="0" ns4:anchorId="6F395D46" ns4:editId="22729B4A">
             <wp:extent cx="5431790" cy="3792855"/>
             <wp:effectExtent l="0" t="0" r="0" b="0"/>
             <wp:docPr id="2089392492" name="Picture 5"/>
             <wp:cNvGraphicFramePr>
-              <a:graphicFrameLocks xmlns:a="http://schemas.openxmlformats.org/drawingml/2006/main" noChangeAspect="1"/>
+              <a:graphicFrameLocks noChangeAspect="1"/>
             </wp:cNvGraphicFramePr>
-            <a:graphic xmlns:a="http://schemas.openxmlformats.org/drawingml/2006/main">
+            <a:graphic>
               <a:graphicData uri="http://schemas.openxmlformats.org/drawingml/2006/picture">
-                <pic:pic xmlns:pic="http://schemas.openxmlformats.org/drawingml/2006/picture">
-                  <pic:nvPicPr>
-                    <pic:cNvPr id="2089392492" name="Picture 2089392492"/>
-                    <pic:cNvPicPr/>
-                  </pic:nvPicPr>
-                  <pic:blipFill>
+                <ns6:pic>
+                  <ns6:nvPicPr>
+                    <ns6:cNvPr id="2089392492" name="Picture 2089392492"/>
+                    <ns6:cNvPicPr/>
+                  </ns6:nvPicPr>
+                  <ns6:blipFill>
                     <a:blip r:embed="rId24">
                       <a:extLst>
                         <a:ext uri="{28A0092B-C50C-407E-A947-70E740481C1C}">
-                          <a14:useLocalDpi xmlns:a14="http://schemas.microsoft.com/office/drawing/2010/main" val="0"/>
+                          <ns8:useLocalDpi val="0"/>
                         </a:ext>
                       </a:extLst>
                     </a:blip>
                     <a:stretch>
                       <a:fillRect/>
                     </a:stretch>
-                  </pic:blipFill>
-                  <pic:spPr>
+                  </ns6:blipFill>
+                  <ns6:spPr>
                     <a:xfrm>
                       <a:off x="0" y="0"/>
                       <a:ext cx="5431790" cy="3792855"/>
@@ -9367,8 +9367,8 @@
                     <a:prstGeom prst="rect">
                       <a:avLst/>
                     </a:prstGeom>
-                  </pic:spPr>
-                </pic:pic>
+                  </ns6:spPr>
+                </ns6:pic>
               </a:graphicData>
             </a:graphic>
           </wp:inline>
@@ -9385,33 +9385,33 @@
         </w:rPr>
         <w:lastRenderedPageBreak/>
         <w:drawing>
-          <wp:inline distT="0" distB="0" distL="0" distR="0" wp14:anchorId="3354AB38" wp14:editId="1E9A4400">
+          <wp:inline distT="0" distB="0" distL="0" distR="0" ns4:anchorId="3354AB38" ns4:editId="1E9A4400">
             <wp:extent cx="5431790" cy="3468370"/>
             <wp:effectExtent l="0" t="0" r="0" b="0"/>
             <wp:docPr id="60742574" name="Picture 7"/>
             <wp:cNvGraphicFramePr>
-              <a:graphicFrameLocks xmlns:a="http://schemas.openxmlformats.org/drawingml/2006/main" noChangeAspect="1"/>
+              <a:graphicFrameLocks noChangeAspect="1"/>
             </wp:cNvGraphicFramePr>
-            <a:graphic xmlns:a="http://schemas.openxmlformats.org/drawingml/2006/main">
+            <a:graphic>
               <a:graphicData uri="http://schemas.openxmlformats.org/drawingml/2006/picture">
-                <pic:pic xmlns:pic="http://schemas.openxmlformats.org/drawingml/2006/picture">
-                  <pic:nvPicPr>
-                    <pic:cNvPr id="60742574" name="Picture 60742574"/>
-                    <pic:cNvPicPr/>
-                  </pic:nvPicPr>
-                  <pic:blipFill>
+                <ns6:pic>
+                  <ns6:nvPicPr>
+                    <ns6:cNvPr id="60742574" name="Picture 60742574"/>
+                    <ns6:cNvPicPr/>
+                  </ns6:nvPicPr>
+                  <ns6:blipFill>
                     <a:blip r:embed="rId25">
                       <a:extLst>
                         <a:ext uri="{28A0092B-C50C-407E-A947-70E740481C1C}">
-                          <a14:useLocalDpi xmlns:a14="http://schemas.microsoft.com/office/drawing/2010/main" val="0"/>
+                          <ns8:useLocalDpi val="0"/>
                         </a:ext>
                       </a:extLst>
                     </a:blip>
                     <a:stretch>
                       <a:fillRect/>
                     </a:stretch>
-                  </pic:blipFill>
-                  <pic:spPr>
+                  </ns6:blipFill>
+                  <ns6:spPr>
                     <a:xfrm>
                       <a:off x="0" y="0"/>
                       <a:ext cx="5431790" cy="3468370"/>
@@ -9419,15 +9419,15 @@
                     <a:prstGeom prst="rect">
                       <a:avLst/>
                     </a:prstGeom>
-                  </pic:spPr>
-                </pic:pic>
+                  </ns6:spPr>
+                </ns6:pic>
               </a:graphicData>
             </a:graphic>
           </wp:inline>
         </w:drawing>
       </w:r>
     </w:p>
-    <w:p>
+    <w:p ns2:paraId="035C390B" ns2:textId="77777777">
       <w:pPr>
         <w:rPr>
           <w:rFonts w:ascii="Arial" w:eastAsia="Arial" w:hAnsi="Arial" w:cs="Arial"/>
@@ -9448,7 +9448,7 @@
         <w:br w:type="page"/>
       </w:r>
     </w:p>
-    <w:p>
+    <w:p ns2:paraId="6831A39B" ns2:textId="788AE410">
       <w:pPr>
         <w:pStyle w:val="Ttulo3"/>
         <w:rPr>
@@ -9467,7 +9467,7 @@
       </w:r>
       <w:bookmarkEnd w:id="31"/>
     </w:p>
-    <w:p>
+    <w:p ns2:paraId="535E563C" ns2:textId="77777777">
       <w:pPr>
         <w:widowControl w:val="0"/>
         <w:pBdr>
@@ -9492,7 +9492,7 @@
         <w:t>Interfaz exclusiva para los usuarios con el rol de Orientador o Docente. Muestra un listado centralizado con los nombres, cursos y el estado del proceso BPM de todos los estudiantes bajo su tutela. Permite aplicar filtros de búsqueda avanzados y hacer clic sobre cualquier registro estudiantil para auditar el historial de respuestas y visualizar en tiempo real el reporte vocacional generado por el software.</w:t>
       </w:r>
     </w:p>
-    <w:p>
+    <w:p ns2:paraId="53816D2D" ns2:textId="77777777">
       <w:pPr>
         <w:pStyle w:val="Ttulo1"/>
         <w:numPr>
@@ -9513,33 +9513,33 @@
           <w:szCs w:val="24"/>
         </w:rPr>
         <w:drawing>
-          <wp:inline distT="0" distB="0" distL="0" distR="0" wp14:anchorId="2F8C15A0" wp14:editId="4E21830A">
+          <wp:inline distT="0" distB="0" distL="0" distR="0" ns4:anchorId="2F8C15A0" ns4:editId="4E21830A">
             <wp:extent cx="5431790" cy="3207385"/>
             <wp:effectExtent l="0" t="0" r="0" b="0"/>
             <wp:docPr id="968260790" name="Picture 8"/>
             <wp:cNvGraphicFramePr>
-              <a:graphicFrameLocks xmlns:a="http://schemas.openxmlformats.org/drawingml/2006/main" noChangeAspect="1"/>
+              <a:graphicFrameLocks noChangeAspect="1"/>
             </wp:cNvGraphicFramePr>
-            <a:graphic xmlns:a="http://schemas.openxmlformats.org/drawingml/2006/main">
+            <a:graphic>
               <a:graphicData uri="http://schemas.openxmlformats.org/drawingml/2006/picture">
-                <pic:pic xmlns:pic="http://schemas.openxmlformats.org/drawingml/2006/picture">
-                  <pic:nvPicPr>
-                    <pic:cNvPr id="968260790" name="Picture 968260790"/>
-                    <pic:cNvPicPr/>
-                  </pic:nvPicPr>
-                  <pic:blipFill>
+                <ns6:pic>
+                  <ns6:nvPicPr>
+                    <ns6:cNvPr id="968260790" name="Picture 968260790"/>
+                    <ns6:cNvPicPr/>
+                  </ns6:nvPicPr>
+                  <ns6:blipFill>
                     <a:blip r:embed="rId26" cstate="print">
                       <a:extLst>
                         <a:ext uri="{28A0092B-C50C-407E-A947-70E740481C1C}">
-                          <a14:useLocalDpi xmlns:a14="http://schemas.microsoft.com/office/drawing/2010/main" val="0"/>
+                          <ns8:useLocalDpi val="0"/>
                         </a:ext>
                       </a:extLst>
                     </a:blip>
                     <a:stretch>
                       <a:fillRect/>
                     </a:stretch>
-                  </pic:blipFill>
-                  <pic:spPr>
+                  </ns6:blipFill>
+                  <ns6:spPr>
                     <a:xfrm>
                       <a:off x="0" y="0"/>
                       <a:ext cx="5431790" cy="3207385"/>
@@ -9547,8 +9547,8 @@
                     <a:prstGeom prst="rect">
                       <a:avLst/>
                     </a:prstGeom>
-                  </pic:spPr>
-                </pic:pic>
+                  </ns6:spPr>
+                </ns6:pic>
               </a:graphicData>
             </a:graphic>
           </wp:inline>
@@ -9556,7 +9556,7 @@
       </w:r>
       <w:bookmarkEnd w:id="32"/>
     </w:p>
-    <w:p>
+    <w:p ns2:paraId="4CE4F892" ns2:textId="77777777">
       <w:pPr>
         <w:rPr>
           <w:rFonts w:ascii="Arial" w:hAnsi="Arial" w:cs="Arial"/>
@@ -9574,7 +9574,7 @@
         <w:br w:type="page"/>
       </w:r>
     </w:p>
-    <w:p>
+    <w:p ns2:paraId="43294AF2" ns2:textId="78D8B1CA">
       <w:pPr>
         <w:pStyle w:val="Ttulo1"/>
       </w:pPr>
@@ -9594,7 +9594,7 @@
       </w:r>
       <w:bookmarkEnd w:id="33"/>
     </w:p>
-    <w:p>
+    <w:p ns2:paraId="7047ACAE" ns2:textId="77777777">
       <w:pPr>
         <w:spacing w:line="360" w:lineRule="auto"/>
         <w:jc w:val="left"/>
@@ -9607,7 +9607,7 @@
         </w:rPr>
       </w:pPr>
     </w:p>
-    <w:p>
+    <w:p ns2:paraId="24ADC08F" ns2:textId="77777777">
       <w:pPr>
         <w:pStyle w:val="Ttulo2"/>
         <w:rPr>
@@ -9623,7 +9623,7 @@
       </w:r>
       <w:bookmarkEnd w:id="34"/>
     </w:p>
-    <w:p>
+    <w:p ns2:paraId="38C0E27A" ns2:textId="77777777">
       <w:pPr>
         <w:widowControl w:val="0"/>
         <w:pBdr>
@@ -9648,7 +9648,7 @@
         <w:t>Los requerimientos del sistema se estructuran a partir de los actores identificados (Estudiante, Orientador y Administrador). El flujo completo se valida mediante el modelado del comportamiento dinámico y estático del software utilizando la notación estándar UML.</w:t>
       </w:r>
     </w:p>
-    <w:p>
+    <w:p ns2:paraId="4C005700" ns2:textId="2612C456">
       <w:pPr>
         <w:widowControl w:val="0"/>
         <w:pBdr>
@@ -9673,84 +9673,7 @@
         <w:t>Diagrama de casos de uso.</w:t>
       </w:r>
     </w:p>
-    <w:p>
-      <w:pPr>
-        <w:widowControl w:val="0"/>
-        <w:pBdr>
-          <w:top w:val="nil"/>
-          <w:left w:val="nil"/>
-          <w:bottom w:val="nil"/>
-          <w:right w:val="nil"/>
-          <w:between w:val="nil"/>
-        </w:pBdr>
-        <w:spacing w:after="300" w:line="300" w:lineRule="auto"/>
-        <w:jc w:val="left"/>
-        <w:rPr>
-          <w:rFonts w:ascii="Arial" w:eastAsia="Arial" w:hAnsi="Arial" w:cs="Arial"/>
-          <w:sz w:val="22"/>
-          <w:szCs w:val="22"/>
-          <w:lang w:val="es-CL" w:eastAsia="es-CL"/>
-        </w:rPr>
-      </w:pPr>
-      <w:r>
-        <w:rPr>
-          <w:rFonts w:ascii="Arial" w:eastAsia="Arial" w:hAnsi="Arial" w:cs="Arial"/>
-          <w:noProof/>
-          <w:sz w:val="22"/>
-          <w:szCs w:val="22"/>
-          <w:lang w:val="es-CL" w:eastAsia="es-CL"/>
-        </w:rPr>
-        <w:drawing>
-          <wp:inline distT="0" distB="0" distL="0" distR="0" wp14:anchorId="7F052539" wp14:editId="3BD07C98">
-            <wp:extent cx="2634238" cy="5086153"/>
-            <wp:effectExtent l="0" t="0" r="0" b="635"/>
-            <wp:docPr id="1684389294" name="Picture 1"/>
-            <wp:cNvGraphicFramePr>
-              <a:graphicFrameLocks xmlns:a="http://schemas.openxmlformats.org/drawingml/2006/main" noChangeAspect="1"/>
-            </wp:cNvGraphicFramePr>
-            <a:graphic xmlns:a="http://schemas.openxmlformats.org/drawingml/2006/main">
-              <a:graphicData uri="http://schemas.openxmlformats.org/drawingml/2006/picture">
-                <pic:pic xmlns:pic="http://schemas.openxmlformats.org/drawingml/2006/picture">
-                  <pic:nvPicPr>
-                    <pic:cNvPr id="0" name="Picture 1"/>
-                    <pic:cNvPicPr>
-                      <a:picLocks noChangeAspect="1" noChangeArrowheads="1"/>
-                    </pic:cNvPicPr>
-                  </pic:nvPicPr>
-                  <pic:blipFill>
-                    <a:blip r:embed="rId27">
-                      <a:extLst>
-                        <a:ext uri="{28A0092B-C50C-407E-A947-70E740481C1C}">
-                          <a14:useLocalDpi xmlns:a14="http://schemas.microsoft.com/office/drawing/2010/main" val="0"/>
-                        </a:ext>
-                      </a:extLst>
-                    </a:blip>
-                    <a:srcRect/>
-                    <a:stretch>
-                      <a:fillRect/>
-                    </a:stretch>
-                  </pic:blipFill>
-                  <pic:spPr bwMode="auto">
-                    <a:xfrm>
-                      <a:off x="0" y="0"/>
-                      <a:ext cx="2641534" cy="5100239"/>
-                    </a:xfrm>
-                    <a:prstGeom prst="rect">
-                      <a:avLst/>
-                    </a:prstGeom>
-                    <a:noFill/>
-                    <a:ln>
-                      <a:noFill/>
-                    </a:ln>
-                  </pic:spPr>
-                </pic:pic>
-              </a:graphicData>
-            </a:graphic>
-          </wp:inline>
-        </w:drawing>
-      </w:r>
-    </w:p>
-    <w:p>
+    <w:p ns2:paraId="39122D92" ns2:textId="4848A15E">
       <w:pPr>
         <w:widowControl w:val="0"/>
         <w:pBdr>
@@ -9784,7 +9707,7 @@
         <w:t>Diagrama de actividades.</w:t>
       </w:r>
     </w:p>
-    <w:p>
+    <w:p ns2:paraId="28FC051C" ns2:textId="77777777">
       <w:pPr>
         <w:widowControl w:val="0"/>
         <w:pBdr>
@@ -9818,33 +9741,33 @@
           <w:lang w:val="es-CL" w:eastAsia="es-CL"/>
         </w:rPr>
         <w:drawing>
-          <wp:inline distT="0" distB="0" distL="0" distR="0" wp14:anchorId="30809AE4" wp14:editId="0B96C48E">
+          <wp:inline distT="0" distB="0" distL="0" distR="0" ns4:anchorId="30809AE4" ns4:editId="0B96C48E">
             <wp:extent cx="3410426" cy="5077534"/>
             <wp:effectExtent l="0" t="0" r="0" b="8890"/>
             <wp:docPr id="1749210480" name="Picture 10"/>
             <wp:cNvGraphicFramePr>
-              <a:graphicFrameLocks xmlns:a="http://schemas.openxmlformats.org/drawingml/2006/main" noChangeAspect="1"/>
+              <a:graphicFrameLocks noChangeAspect="1"/>
             </wp:cNvGraphicFramePr>
-            <a:graphic xmlns:a="http://schemas.openxmlformats.org/drawingml/2006/main">
+            <a:graphic>
               <a:graphicData uri="http://schemas.openxmlformats.org/drawingml/2006/picture">
-                <pic:pic xmlns:pic="http://schemas.openxmlformats.org/drawingml/2006/picture">
-                  <pic:nvPicPr>
-                    <pic:cNvPr id="1749210480" name="Picture 1749210480"/>
-                    <pic:cNvPicPr/>
-                  </pic:nvPicPr>
-                  <pic:blipFill>
+                <ns6:pic>
+                  <ns6:nvPicPr>
+                    <ns6:cNvPr id="1749210480" name="Picture 1749210480"/>
+                    <ns6:cNvPicPr/>
+                  </ns6:nvPicPr>
+                  <ns6:blipFill>
                     <a:blip r:embed="rId28">
                       <a:extLst>
                         <a:ext uri="{28A0092B-C50C-407E-A947-70E740481C1C}">
-                          <a14:useLocalDpi xmlns:a14="http://schemas.microsoft.com/office/drawing/2010/main" val="0"/>
+                          <ns8:useLocalDpi val="0"/>
                         </a:ext>
                       </a:extLst>
                     </a:blip>
                     <a:stretch>
                       <a:fillRect/>
                     </a:stretch>
-                  </pic:blipFill>
-                  <pic:spPr>
+                  </ns6:blipFill>
+                  <ns6:spPr>
                     <a:xfrm>
                       <a:off x="0" y="0"/>
                       <a:ext cx="3410426" cy="5077534"/>
@@ -9852,8 +9775,8 @@
                     <a:prstGeom prst="rect">
                       <a:avLst/>
                     </a:prstGeom>
-                  </pic:spPr>
-                </pic:pic>
+                  </ns6:spPr>
+                </ns6:pic>
               </a:graphicData>
             </a:graphic>
           </wp:inline>
@@ -9861,7 +9784,7 @@
       </w:r>
       <w:bookmarkEnd w:id="35"/>
     </w:p>
-    <w:p>
+    <w:p ns2:paraId="55415D43" ns2:textId="77777777">
       <w:pPr>
         <w:rPr>
           <w:rFonts w:ascii="Arial" w:eastAsia="Arial" w:hAnsi="Arial" w:cs="Arial"/>
@@ -9884,7 +9807,7 @@
         <w:br w:type="page"/>
       </w:r>
     </w:p>
-    <w:p>
+    <w:p ns2:paraId="68265B9A" ns2:textId="39643B3D">
       <w:pPr>
         <w:pStyle w:val="Ttulo2"/>
         <w:rPr>
@@ -9901,7 +9824,7 @@
       </w:r>
       <w:bookmarkEnd w:id="36"/>
     </w:p>
-    <w:p>
+    <w:p ns2:paraId="557BCEC7" ns2:textId="12801348">
       <w:pPr>
         <w:widowControl w:val="0"/>
         <w:pBdr>
@@ -9926,7 +9849,7 @@
         <w:t>Para garantizar la completitud técnica solicitada por la comisión evaluadora en las fases posteriores del proyecto de título, se reservan explícitamente los apartados correspondientes para la integración de los siguientes diagramas de ingeniería de software:</w:t>
       </w:r>
     </w:p>
-    <w:p>
+    <w:p ns2:paraId="4DAEC345" ns2:textId="77777777">
       <w:pPr>
         <w:pStyle w:val="Ttulo3"/>
         <w:rPr>
@@ -9944,7 +9867,7 @@
       </w:r>
       <w:bookmarkEnd w:id="37"/>
     </w:p>
-    <w:p>
+    <w:p ns2:paraId="44861325" ns2:textId="77777777">
       <w:pPr>
         <w:widowControl w:val="0"/>
         <w:pBdr>
@@ -9969,7 +9892,7 @@
         <w:t>Este diagrama técnico detallará la secuencia exacta de tareas automatizadas y manuales integradas en el motor de flujos, especificando las compuertas lógicas de decisión (ej. control de cuestionario completo o incompleto), los eventos de inicio/fin y el paso de variables entre el pool del estudiante y el backend del sistema.</w:t>
       </w:r>
     </w:p>
-    <w:p>
+    <w:p ns2:paraId="21C5892A" ns2:textId="349CFB9E">
       <w:pPr>
         <w:jc w:val="left"/>
         <w:rPr>
@@ -9997,27 +9920,27 @@
           <w:lang w:val="es-CL" w:eastAsia="es-CL"/>
         </w:rPr>
         <w:drawing>
-          <wp:inline distT="0" distB="0" distL="0" distR="0" wp14:anchorId="056DBDBC" wp14:editId="0692F1AC">
+          <wp:inline distT="0" distB="0" distL="0" distR="0" ns4:anchorId="056DBDBC" ns4:editId="0692F1AC">
             <wp:extent cx="5431790" cy="1726477"/>
             <wp:effectExtent l="0" t="0" r="0" b="7620"/>
             <wp:docPr id="1127019621" name="Picture 2"/>
             <wp:cNvGraphicFramePr>
-              <a:graphicFrameLocks xmlns:a="http://schemas.openxmlformats.org/drawingml/2006/main" noChangeAspect="1"/>
+              <a:graphicFrameLocks noChangeAspect="1"/>
             </wp:cNvGraphicFramePr>
-            <a:graphic xmlns:a="http://schemas.openxmlformats.org/drawingml/2006/main">
+            <a:graphic>
               <a:graphicData uri="http://schemas.openxmlformats.org/drawingml/2006/picture">
-                <pic:pic xmlns:pic="http://schemas.openxmlformats.org/drawingml/2006/picture">
-                  <pic:nvPicPr>
-                    <pic:cNvPr id="0" name="Picture 2"/>
-                    <pic:cNvPicPr>
+                <ns6:pic>
+                  <ns6:nvPicPr>
+                    <ns6:cNvPr id="0" name="Picture 2"/>
+                    <ns6:cNvPicPr>
                       <a:picLocks noChangeAspect="1" noChangeArrowheads="1"/>
-                    </pic:cNvPicPr>
-                  </pic:nvPicPr>
-                  <pic:blipFill rotWithShape="1">
+                    </ns6:cNvPicPr>
+                  </ns6:nvPicPr>
+                  <ns6:blipFill rotWithShape="1">
                     <a:blip r:embed="rId29" cstate="print">
                       <a:extLst>
                         <a:ext uri="{28A0092B-C50C-407E-A947-70E740481C1C}">
-                          <a14:useLocalDpi xmlns:a14="http://schemas.microsoft.com/office/drawing/2010/main" val="0"/>
+                          <ns8:useLocalDpi val="0"/>
                         </a:ext>
                       </a:extLst>
                     </a:blip>
@@ -10025,8 +9948,8 @@
                     <a:stretch>
                       <a:fillRect/>
                     </a:stretch>
-                  </pic:blipFill>
-                  <pic:spPr bwMode="auto">
+                  </ns6:blipFill>
+                  <ns6:spPr bwMode="auto">
                     <a:xfrm>
                       <a:off x="0" y="0"/>
                       <a:ext cx="5431790" cy="1726477"/>
@@ -10040,18 +9963,18 @@
                     </a:ln>
                     <a:extLst>
                       <a:ext uri="{53640926-AAD7-44D8-BBD7-CCE9431645EC}">
-                        <a14:shadowObscured xmlns:a14="http://schemas.microsoft.com/office/drawing/2010/main"/>
+                        <ns8:shadowObscured/>
                       </a:ext>
                     </a:extLst>
-                  </pic:spPr>
-                </pic:pic>
+                  </ns6:spPr>
+                </ns6:pic>
               </a:graphicData>
             </a:graphic>
           </wp:inline>
         </w:drawing>
       </w:r>
     </w:p>
-    <w:p>
+    <w:p ns2:paraId="7B55F0AA" ns2:textId="583EA223">
       <w:pPr>
         <w:jc w:val="left"/>
         <w:rPr>
@@ -10077,27 +10000,27 @@
           <w:lang w:val="es-CL" w:eastAsia="es-CL"/>
         </w:rPr>
         <w:drawing>
-          <wp:inline distT="0" distB="0" distL="0" distR="0" wp14:anchorId="21050A73" wp14:editId="75DEFCBE">
+          <wp:inline distT="0" distB="0" distL="0" distR="0" ns4:anchorId="21050A73" ns4:editId="75DEFCBE">
             <wp:extent cx="5736311" cy="1350335"/>
             <wp:effectExtent l="0" t="0" r="0" b="2540"/>
             <wp:docPr id="1692217057" name="Picture 3"/>
             <wp:cNvGraphicFramePr>
-              <a:graphicFrameLocks xmlns:a="http://schemas.openxmlformats.org/drawingml/2006/main" noChangeAspect="1"/>
+              <a:graphicFrameLocks noChangeAspect="1"/>
             </wp:cNvGraphicFramePr>
-            <a:graphic xmlns:a="http://schemas.openxmlformats.org/drawingml/2006/main">
+            <a:graphic>
               <a:graphicData uri="http://schemas.openxmlformats.org/drawingml/2006/picture">
-                <pic:pic xmlns:pic="http://schemas.openxmlformats.org/drawingml/2006/picture">
-                  <pic:nvPicPr>
-                    <pic:cNvPr id="0" name="Picture 3"/>
-                    <pic:cNvPicPr>
+                <ns6:pic>
+                  <ns6:nvPicPr>
+                    <ns6:cNvPr id="0" name="Picture 3"/>
+                    <ns6:cNvPicPr>
                       <a:picLocks noChangeAspect="1" noChangeArrowheads="1"/>
-                    </pic:cNvPicPr>
-                  </pic:nvPicPr>
-                  <pic:blipFill rotWithShape="1">
+                    </ns6:cNvPicPr>
+                  </ns6:nvPicPr>
+                  <ns6:blipFill rotWithShape="1">
                     <a:blip r:embed="rId30" cstate="print">
                       <a:extLst>
                         <a:ext uri="{28A0092B-C50C-407E-A947-70E740481C1C}">
-                          <a14:useLocalDpi xmlns:a14="http://schemas.microsoft.com/office/drawing/2010/main" val="0"/>
+                          <ns8:useLocalDpi val="0"/>
                         </a:ext>
                       </a:extLst>
                     </a:blip>
@@ -10105,8 +10028,8 @@
                     <a:stretch>
                       <a:fillRect/>
                     </a:stretch>
-                  </pic:blipFill>
-                  <pic:spPr bwMode="auto">
+                  </ns6:blipFill>
+                  <ns6:spPr bwMode="auto">
                     <a:xfrm>
                       <a:off x="0" y="0"/>
                       <a:ext cx="5755228" cy="1354788"/>
@@ -10120,11 +10043,11 @@
                     </a:ln>
                     <a:extLst>
                       <a:ext uri="{53640926-AAD7-44D8-BBD7-CCE9431645EC}">
-                        <a14:shadowObscured xmlns:a14="http://schemas.microsoft.com/office/drawing/2010/main"/>
+                        <ns8:shadowObscured/>
                       </a:ext>
                     </a:extLst>
-                  </pic:spPr>
-                </pic:pic>
+                  </ns6:spPr>
+                </ns6:pic>
               </a:graphicData>
             </a:graphic>
           </wp:inline>
@@ -10143,7 +10066,7 @@
         <w:br w:type="page"/>
       </w:r>
     </w:p>
-    <w:p>
+    <w:p ns2:paraId="35E7A18C" ns2:textId="4EC6B09E">
       <w:pPr>
         <w:pStyle w:val="Ttulo3"/>
         <w:rPr>
@@ -10162,7 +10085,7 @@
       </w:r>
       <w:bookmarkEnd w:id="38"/>
     </w:p>
-    <w:p>
+    <w:p ns2:paraId="122D4C75" ns2:textId="208B5AB6">
       <w:pPr>
         <w:widowControl w:val="0"/>
         <w:pBdr>
@@ -10187,7 +10110,7 @@
         <w:t>Mapeo visual relacional de persistencia de datos en MySQL 8.0. Detallará las llaves primarias, foráneas, tipos de datos y restricciones de integridad para las tablas de: usuario, estudiante, orientador, evaluacion, pregunta, respuesta, reporte_vocacional y proceso_bpm.</w:t>
       </w:r>
     </w:p>
-    <w:p>
+    <w:p ns2:paraId="70875D9A" ns2:textId="1D23AA66">
       <w:pPr>
         <w:rPr>
           <w:rFonts w:ascii="Arial" w:eastAsia="Arial" w:hAnsi="Arial" w:cs="Arial"/>
@@ -10210,7 +10133,7 @@
           <w:lang w:val="es-CL" w:eastAsia="es-CL"/>
         </w:rPr>
         <w:drawing>
-          <wp:anchor distT="0" distB="0" distL="114300" distR="114300" simplePos="0" relativeHeight="251659264" behindDoc="1" locked="0" layoutInCell="1" allowOverlap="1" wp14:anchorId="778B34E9" wp14:editId="3CC3392A">
+          <wp:anchor distT="0" distB="0" distL="114300" distR="114300" simplePos="0" relativeHeight="251659264" behindDoc="1" locked="0" layoutInCell="1" allowOverlap="1" ns4:anchorId="778B34E9" ns4:editId="3CC3392A">
             <wp:simplePos x="0" y="0"/>
             <wp:positionH relativeFrom="column">
               <wp:posOffset>-168275</wp:posOffset>
@@ -10223,22 +10146,22 @@
             <wp:wrapSquare wrapText="bothSides"/>
             <wp:docPr id="1813565506" name="Picture 4"/>
             <wp:cNvGraphicFramePr>
-              <a:graphicFrameLocks xmlns:a="http://schemas.openxmlformats.org/drawingml/2006/main" noChangeAspect="1"/>
+              <a:graphicFrameLocks noChangeAspect="1"/>
             </wp:cNvGraphicFramePr>
-            <a:graphic xmlns:a="http://schemas.openxmlformats.org/drawingml/2006/main">
+            <a:graphic>
               <a:graphicData uri="http://schemas.openxmlformats.org/drawingml/2006/picture">
-                <pic:pic xmlns:pic="http://schemas.openxmlformats.org/drawingml/2006/picture">
-                  <pic:nvPicPr>
-                    <pic:cNvPr id="0" name="Picture 4"/>
-                    <pic:cNvPicPr>
+                <ns6:pic>
+                  <ns6:nvPicPr>
+                    <ns6:cNvPr id="0" name="Picture 4"/>
+                    <ns6:cNvPicPr>
                       <a:picLocks noChangeAspect="1" noChangeArrowheads="1"/>
-                    </pic:cNvPicPr>
-                  </pic:nvPicPr>
-                  <pic:blipFill>
+                    </ns6:cNvPicPr>
+                  </ns6:nvPicPr>
+                  <ns6:blipFill>
                     <a:blip r:embed="rId31" cstate="print">
                       <a:extLst>
                         <a:ext uri="{28A0092B-C50C-407E-A947-70E740481C1C}">
-                          <a14:useLocalDpi xmlns:a14="http://schemas.microsoft.com/office/drawing/2010/main" val="0"/>
+                          <ns8:useLocalDpi val="0"/>
                         </a:ext>
                       </a:extLst>
                     </a:blip>
@@ -10246,8 +10169,8 @@
                     <a:stretch>
                       <a:fillRect/>
                     </a:stretch>
-                  </pic:blipFill>
-                  <pic:spPr bwMode="auto">
+                  </ns6:blipFill>
+                  <ns6:spPr bwMode="auto">
                     <a:xfrm>
                       <a:off x="0" y="0"/>
                       <a:ext cx="3599815" cy="6137275"/>
@@ -10259,16 +10182,16 @@
                     <a:ln>
                       <a:noFill/>
                     </a:ln>
-                  </pic:spPr>
-                </pic:pic>
+                  </ns6:spPr>
+                </ns6:pic>
               </a:graphicData>
             </a:graphic>
-            <wp14:sizeRelH relativeFrom="margin">
-              <wp14:pctWidth>0</wp14:pctWidth>
-            </wp14:sizeRelH>
-            <wp14:sizeRelV relativeFrom="margin">
-              <wp14:pctHeight>0</wp14:pctHeight>
-            </wp14:sizeRelV>
+            <ns4:sizeRelH relativeFrom="margin">
+              <ns4:pctWidth>0</ns4:pctWidth>
+            </ns4:sizeRelH>
+            <ns4:sizeRelV relativeFrom="margin">
+              <ns4:pctHeight>0</ns4:pctHeight>
+            </ns4:sizeRelV>
           </wp:anchor>
         </w:drawing>
       </w:r>
@@ -10283,7 +10206,7 @@
         <w:br w:type="page"/>
       </w:r>
     </w:p>
-    <w:p>
+    <w:p ns2:paraId="7B98D4B2" ns2:textId="2874D38D">
       <w:pPr>
         <w:pStyle w:val="Ttulo3"/>
         <w:rPr>
@@ -10302,7 +10225,7 @@
       </w:r>
       <w:bookmarkEnd w:id="39"/>
     </w:p>
-    <w:p>
+    <w:p ns2:paraId="67D2492A" ns2:textId="280F0839">
       <w:pPr>
         <w:widowControl w:val="0"/>
         <w:pBdr>
@@ -10333,27 +10256,27 @@
           <w:lang w:val="es-CL" w:eastAsia="es-CL"/>
         </w:rPr>
         <w:drawing>
-          <wp:inline distT="0" distB="0" distL="0" distR="0" wp14:anchorId="4A913DDF" wp14:editId="10FFBCA4">
+          <wp:inline distT="0" distB="0" distL="0" distR="0" ns4:anchorId="4A913DDF" ns4:editId="10FFBCA4">
             <wp:extent cx="4887559" cy="6655242"/>
             <wp:effectExtent l="0" t="0" r="8890" b="0"/>
             <wp:docPr id="616586429" name="Picture 5"/>
             <wp:cNvGraphicFramePr>
-              <a:graphicFrameLocks xmlns:a="http://schemas.openxmlformats.org/drawingml/2006/main" noChangeAspect="1"/>
+              <a:graphicFrameLocks noChangeAspect="1"/>
             </wp:cNvGraphicFramePr>
-            <a:graphic xmlns:a="http://schemas.openxmlformats.org/drawingml/2006/main">
+            <a:graphic>
               <a:graphicData uri="http://schemas.openxmlformats.org/drawingml/2006/picture">
-                <pic:pic xmlns:pic="http://schemas.openxmlformats.org/drawingml/2006/picture">
-                  <pic:nvPicPr>
-                    <pic:cNvPr id="0" name="Picture 5"/>
-                    <pic:cNvPicPr>
+                <ns6:pic>
+                  <ns6:nvPicPr>
+                    <ns6:cNvPr id="0" name="Picture 5"/>
+                    <ns6:cNvPicPr>
                       <a:picLocks noChangeAspect="1" noChangeArrowheads="1"/>
-                    </pic:cNvPicPr>
-                  </pic:nvPicPr>
-                  <pic:blipFill>
+                    </ns6:cNvPicPr>
+                  </ns6:nvPicPr>
+                  <ns6:blipFill>
                     <a:blip r:embed="rId32">
                       <a:extLst>
                         <a:ext uri="{28A0092B-C50C-407E-A947-70E740481C1C}">
-                          <a14:useLocalDpi xmlns:a14="http://schemas.microsoft.com/office/drawing/2010/main" val="0"/>
+                          <ns8:useLocalDpi val="0"/>
                         </a:ext>
                       </a:extLst>
                     </a:blip>
@@ -10361,8 +10284,8 @@
                     <a:stretch>
                       <a:fillRect/>
                     </a:stretch>
-                  </pic:blipFill>
-                  <pic:spPr bwMode="auto">
+                  </ns6:blipFill>
+                  <ns6:spPr bwMode="auto">
                     <a:xfrm>
                       <a:off x="0" y="0"/>
                       <a:ext cx="4889084" cy="6657319"/>
@@ -10374,15 +10297,15 @@
                     <a:ln>
                       <a:noFill/>
                     </a:ln>
-                  </pic:spPr>
-                </pic:pic>
+                  </ns6:spPr>
+                </ns6:pic>
               </a:graphicData>
             </a:graphic>
           </wp:inline>
         </w:drawing>
       </w:r>
     </w:p>
-    <w:p>
+    <w:p ns2:paraId="6429CE6E" ns2:textId="77777777">
       <w:pPr>
         <w:rPr>
           <w:rFonts w:ascii="Arial" w:eastAsia="Arial" w:hAnsi="Arial" w:cs="Arial"/>
@@ -10403,7 +10326,7 @@
         <w:br w:type="page"/>
       </w:r>
     </w:p>
-    <w:p>
+    <w:p ns2:paraId="3645F7DC" ns2:textId="312499B7">
       <w:pPr>
         <w:pStyle w:val="Ttulo3"/>
         <w:rPr>
@@ -10422,7 +10345,7 @@
       </w:r>
       <w:bookmarkEnd w:id="40"/>
     </w:p>
-    <w:p>
+    <w:p ns2:paraId="54EF06B1" ns2:textId="12549139">
       <w:pPr>
         <w:widowControl w:val="0"/>
         <w:pBdr>
@@ -10453,27 +10376,27 @@
           <w:lang w:val="es-CL" w:eastAsia="es-CL"/>
         </w:rPr>
         <w:drawing>
-          <wp:inline distT="0" distB="0" distL="0" distR="0" wp14:anchorId="3EC33748" wp14:editId="1D00A4E9">
+          <wp:inline distT="0" distB="0" distL="0" distR="0" ns4:anchorId="3EC33748" ns4:editId="1D00A4E9">
             <wp:extent cx="5414645" cy="1948180"/>
             <wp:effectExtent l="0" t="0" r="0" b="0"/>
             <wp:docPr id="818690703" name="Picture 6"/>
             <wp:cNvGraphicFramePr>
-              <a:graphicFrameLocks xmlns:a="http://schemas.openxmlformats.org/drawingml/2006/main" noChangeAspect="1"/>
+              <a:graphicFrameLocks noChangeAspect="1"/>
             </wp:cNvGraphicFramePr>
-            <a:graphic xmlns:a="http://schemas.openxmlformats.org/drawingml/2006/main">
+            <a:graphic>
               <a:graphicData uri="http://schemas.openxmlformats.org/drawingml/2006/picture">
-                <pic:pic xmlns:pic="http://schemas.openxmlformats.org/drawingml/2006/picture">
-                  <pic:nvPicPr>
-                    <pic:cNvPr id="0" name="Picture 6"/>
-                    <pic:cNvPicPr>
+                <ns6:pic>
+                  <ns6:nvPicPr>
+                    <ns6:cNvPr id="0" name="Picture 6"/>
+                    <ns6:cNvPicPr>
                       <a:picLocks noChangeAspect="1" noChangeArrowheads="1"/>
-                    </pic:cNvPicPr>
-                  </pic:nvPicPr>
-                  <pic:blipFill>
+                    </ns6:cNvPicPr>
+                  </ns6:nvPicPr>
+                  <ns6:blipFill>
                     <a:blip r:embed="rId33" cstate="print">
                       <a:extLst>
                         <a:ext uri="{28A0092B-C50C-407E-A947-70E740481C1C}">
-                          <a14:useLocalDpi xmlns:a14="http://schemas.microsoft.com/office/drawing/2010/main" val="0"/>
+                          <ns8:useLocalDpi val="0"/>
                         </a:ext>
                       </a:extLst>
                     </a:blip>
@@ -10481,8 +10404,8 @@
                     <a:stretch>
                       <a:fillRect/>
                     </a:stretch>
-                  </pic:blipFill>
-                  <pic:spPr bwMode="auto">
+                  </ns6:blipFill>
+                  <ns6:spPr bwMode="auto">
                     <a:xfrm>
                       <a:off x="0" y="0"/>
                       <a:ext cx="5414645" cy="1948180"/>
@@ -10494,15 +10417,15 @@
                     <a:ln>
                       <a:noFill/>
                     </a:ln>
-                  </pic:spPr>
-                </pic:pic>
+                  </ns6:spPr>
+                </ns6:pic>
               </a:graphicData>
             </a:graphic>
           </wp:inline>
         </w:drawing>
       </w:r>
     </w:p>
-    <w:p>
+    <w:p ns2:paraId="7263651E" ns2:textId="32EF99AD">
       <w:pPr>
         <w:widowControl w:val="0"/>
         <w:pBdr>
@@ -10534,27 +10457,27 @@
           <w:lang w:val="es-CL" w:eastAsia="es-CL"/>
         </w:rPr>
         <w:drawing>
-          <wp:inline distT="0" distB="0" distL="0" distR="0" wp14:anchorId="71202A8F" wp14:editId="15B74570">
+          <wp:inline distT="0" distB="0" distL="0" distR="0" ns4:anchorId="71202A8F" ns4:editId="15B74570">
             <wp:extent cx="5430520" cy="5128895"/>
             <wp:effectExtent l="0" t="0" r="0" b="0"/>
             <wp:docPr id="857518116" name="Picture 7"/>
             <wp:cNvGraphicFramePr>
-              <a:graphicFrameLocks xmlns:a="http://schemas.openxmlformats.org/drawingml/2006/main" noChangeAspect="1"/>
+              <a:graphicFrameLocks noChangeAspect="1"/>
             </wp:cNvGraphicFramePr>
-            <a:graphic xmlns:a="http://schemas.openxmlformats.org/drawingml/2006/main">
+            <a:graphic>
               <a:graphicData uri="http://schemas.openxmlformats.org/drawingml/2006/picture">
-                <pic:pic xmlns:pic="http://schemas.openxmlformats.org/drawingml/2006/picture">
-                  <pic:nvPicPr>
-                    <pic:cNvPr id="0" name="Picture 7"/>
-                    <pic:cNvPicPr>
+                <ns6:pic>
+                  <ns6:nvPicPr>
+                    <ns6:cNvPr id="0" name="Picture 7"/>
+                    <ns6:cNvPicPr>
                       <a:picLocks noChangeAspect="1" noChangeArrowheads="1"/>
-                    </pic:cNvPicPr>
-                  </pic:nvPicPr>
-                  <pic:blipFill>
+                    </ns6:cNvPicPr>
+                  </ns6:nvPicPr>
+                  <ns6:blipFill>
                     <a:blip r:embed="rId34">
                       <a:extLst>
                         <a:ext uri="{28A0092B-C50C-407E-A947-70E740481C1C}">
-                          <a14:useLocalDpi xmlns:a14="http://schemas.microsoft.com/office/drawing/2010/main" val="0"/>
+                          <ns8:useLocalDpi val="0"/>
                         </a:ext>
                       </a:extLst>
                     </a:blip>
@@ -10562,8 +10485,8 @@
                     <a:stretch>
                       <a:fillRect/>
                     </a:stretch>
-                  </pic:blipFill>
-                  <pic:spPr bwMode="auto">
+                  </ns6:blipFill>
+                  <ns6:spPr bwMode="auto">
                     <a:xfrm>
                       <a:off x="0" y="0"/>
                       <a:ext cx="5430520" cy="5128895"/>
@@ -10575,15 +10498,15 @@
                     <a:ln>
                       <a:noFill/>
                     </a:ln>
-                  </pic:spPr>
-                </pic:pic>
+                  </ns6:spPr>
+                </ns6:pic>
               </a:graphicData>
             </a:graphic>
           </wp:inline>
         </w:drawing>
       </w:r>
     </w:p>
-    <w:p>
+    <w:p ns2:paraId="6A2B22C3" ns2:textId="4E8806C2">
       <w:pPr>
         <w:widowControl w:val="0"/>
         <w:pBdr>
@@ -10622,7 +10545,7 @@
       </w:r>
       <w:bookmarkEnd w:id="41"/>
     </w:p>
-    <w:p>
+    <w:p ns2:paraId="13E17E37" ns2:textId="77777777">
       <w:pPr>
         <w:widowControl w:val="0"/>
         <w:pBdr>
@@ -10671,7 +10594,7 @@
         <w:t>, 2(1999), 102-138.</w:t>
       </w:r>
     </w:p>
-    <w:p>
+    <w:p ns2:paraId="4CB3C29F" ns2:textId="77777777">
       <w:pPr>
         <w:widowControl w:val="0"/>
         <w:pBdr>
@@ -10713,7 +10636,7 @@
         <w:t xml:space="preserve"> (7th ed.). Project Management Institute.</w:t>
       </w:r>
     </w:p>
-    <w:p>
+    <w:p ns2:paraId="273E21E8" ns2:textId="77777777">
       <w:pPr>
         <w:widowControl w:val="0"/>
         <w:pBdr>
@@ -10762,7 +10685,7 @@
         <w:t>Prentice Hall.</w:t>
       </w:r>
     </w:p>
-    <w:p>
+    <w:p ns2:paraId="07F0A228" ns2:textId="1F268AF6">
       <w:pPr>
         <w:pStyle w:val="Ttulo1"/>
         <w:numPr>
@@ -10775,203 +10698,203 @@
         </w:rPr>
       </w:pPr>
     </w:p>
-    <w:p>
-      <w:pPr>
-        <w:rPr>
-          <w:rFonts w:ascii="Arial" w:hAnsi="Arial" w:cs="Arial"/>
-        </w:rPr>
-      </w:pPr>
-    </w:p>
-    <w:p>
-      <w:pPr>
-        <w:rPr>
-          <w:rFonts w:ascii="Arial" w:hAnsi="Arial" w:cs="Arial"/>
-        </w:rPr>
-      </w:pPr>
-    </w:p>
-    <w:p>
-      <w:pPr>
-        <w:rPr>
-          <w:rFonts w:ascii="Arial" w:hAnsi="Arial" w:cs="Arial"/>
-        </w:rPr>
-      </w:pPr>
-    </w:p>
-    <w:p>
-      <w:pPr>
-        <w:rPr>
-          <w:rFonts w:ascii="Arial" w:hAnsi="Arial" w:cs="Arial"/>
-        </w:rPr>
-      </w:pPr>
-    </w:p>
-    <w:p>
-      <w:pPr>
-        <w:rPr>
-          <w:rFonts w:ascii="Arial" w:hAnsi="Arial" w:cs="Arial"/>
-        </w:rPr>
-      </w:pPr>
-    </w:p>
-    <w:p>
-      <w:pPr>
-        <w:rPr>
-          <w:rFonts w:ascii="Arial" w:hAnsi="Arial" w:cs="Arial"/>
-        </w:rPr>
-      </w:pPr>
-    </w:p>
-    <w:p>
-      <w:pPr>
-        <w:rPr>
-          <w:rFonts w:ascii="Arial" w:hAnsi="Arial" w:cs="Arial"/>
-        </w:rPr>
-      </w:pPr>
-    </w:p>
-    <w:p>
-      <w:pPr>
-        <w:rPr>
-          <w:rFonts w:ascii="Arial" w:hAnsi="Arial" w:cs="Arial"/>
-        </w:rPr>
-      </w:pPr>
-    </w:p>
-    <w:p>
-      <w:pPr>
-        <w:rPr>
-          <w:rFonts w:ascii="Arial" w:hAnsi="Arial" w:cs="Arial"/>
-        </w:rPr>
-      </w:pPr>
-    </w:p>
-    <w:p>
-      <w:pPr>
-        <w:rPr>
-          <w:rFonts w:ascii="Arial" w:hAnsi="Arial" w:cs="Arial"/>
-        </w:rPr>
-      </w:pPr>
-    </w:p>
-    <w:p>
-      <w:pPr>
-        <w:rPr>
-          <w:rFonts w:ascii="Arial" w:hAnsi="Arial" w:cs="Arial"/>
-        </w:rPr>
-      </w:pPr>
-    </w:p>
-    <w:p>
-      <w:pPr>
-        <w:rPr>
-          <w:rFonts w:ascii="Arial" w:hAnsi="Arial" w:cs="Arial"/>
-        </w:rPr>
-      </w:pPr>
-    </w:p>
-    <w:p>
-      <w:pPr>
-        <w:rPr>
-          <w:rFonts w:ascii="Arial" w:hAnsi="Arial" w:cs="Arial"/>
-        </w:rPr>
-      </w:pPr>
-    </w:p>
-    <w:p>
-      <w:pPr>
-        <w:rPr>
-          <w:rFonts w:ascii="Arial" w:hAnsi="Arial" w:cs="Arial"/>
-        </w:rPr>
-      </w:pPr>
-    </w:p>
-    <w:p>
-      <w:pPr>
-        <w:rPr>
-          <w:rFonts w:ascii="Arial" w:hAnsi="Arial" w:cs="Arial"/>
-        </w:rPr>
-      </w:pPr>
-    </w:p>
-    <w:p>
-      <w:pPr>
-        <w:rPr>
-          <w:rFonts w:ascii="Arial" w:hAnsi="Arial" w:cs="Arial"/>
-        </w:rPr>
-      </w:pPr>
-    </w:p>
-    <w:p>
-      <w:pPr>
-        <w:rPr>
-          <w:rFonts w:ascii="Arial" w:hAnsi="Arial" w:cs="Arial"/>
-        </w:rPr>
-      </w:pPr>
-    </w:p>
-    <w:p>
-      <w:pPr>
-        <w:rPr>
-          <w:rFonts w:ascii="Arial" w:hAnsi="Arial" w:cs="Arial"/>
-        </w:rPr>
-      </w:pPr>
-    </w:p>
-    <w:p>
-      <w:pPr>
-        <w:rPr>
-          <w:rFonts w:ascii="Arial" w:hAnsi="Arial" w:cs="Arial"/>
-        </w:rPr>
-      </w:pPr>
-    </w:p>
-    <w:p>
-      <w:pPr>
-        <w:rPr>
-          <w:rFonts w:ascii="Arial" w:hAnsi="Arial" w:cs="Arial"/>
-        </w:rPr>
-      </w:pPr>
-    </w:p>
-    <w:p>
-      <w:pPr>
-        <w:rPr>
-          <w:rFonts w:ascii="Arial" w:hAnsi="Arial" w:cs="Arial"/>
-        </w:rPr>
-      </w:pPr>
-    </w:p>
-    <w:p>
-      <w:pPr>
-        <w:rPr>
-          <w:rFonts w:ascii="Arial" w:hAnsi="Arial" w:cs="Arial"/>
-        </w:rPr>
-      </w:pPr>
-    </w:p>
-    <w:p>
-      <w:pPr>
-        <w:rPr>
-          <w:rFonts w:ascii="Arial" w:hAnsi="Arial" w:cs="Arial"/>
-        </w:rPr>
-      </w:pPr>
-    </w:p>
-    <w:p>
-      <w:pPr>
-        <w:rPr>
-          <w:rFonts w:ascii="Arial" w:hAnsi="Arial" w:cs="Arial"/>
-        </w:rPr>
-      </w:pPr>
-    </w:p>
-    <w:p>
-      <w:pPr>
-        <w:rPr>
-          <w:rFonts w:ascii="Arial" w:hAnsi="Arial" w:cs="Arial"/>
-        </w:rPr>
-      </w:pPr>
-    </w:p>
-    <w:p>
-      <w:pPr>
-        <w:rPr>
-          <w:rFonts w:ascii="Arial" w:hAnsi="Arial" w:cs="Arial"/>
-        </w:rPr>
-      </w:pPr>
-    </w:p>
-    <w:p>
-      <w:pPr>
-        <w:rPr>
-          <w:rFonts w:ascii="Arial" w:hAnsi="Arial" w:cs="Arial"/>
-        </w:rPr>
-      </w:pPr>
-    </w:p>
-    <w:p>
-      <w:pPr>
-        <w:rPr>
-          <w:rFonts w:ascii="Arial" w:hAnsi="Arial" w:cs="Arial"/>
-        </w:rPr>
-      </w:pPr>
-    </w:p>
-    <w:p>
+    <w:p ns2:paraId="35898F4E" ns2:textId="77777777">
+      <w:pPr>
+        <w:rPr>
+          <w:rFonts w:ascii="Arial" w:hAnsi="Arial" w:cs="Arial"/>
+        </w:rPr>
+      </w:pPr>
+    </w:p>
+    <w:p ns2:paraId="5CCA7394" ns2:textId="77777777">
+      <w:pPr>
+        <w:rPr>
+          <w:rFonts w:ascii="Arial" w:hAnsi="Arial" w:cs="Arial"/>
+        </w:rPr>
+      </w:pPr>
+    </w:p>
+    <w:p ns2:paraId="48B482A0" ns2:textId="77777777">
+      <w:pPr>
+        <w:rPr>
+          <w:rFonts w:ascii="Arial" w:hAnsi="Arial" w:cs="Arial"/>
+        </w:rPr>
+      </w:pPr>
+    </w:p>
+    <w:p ns2:paraId="499DCB9D" ns2:textId="77777777">
+      <w:pPr>
+        <w:rPr>
+          <w:rFonts w:ascii="Arial" w:hAnsi="Arial" w:cs="Arial"/>
+        </w:rPr>
+      </w:pPr>
+    </w:p>
+    <w:p ns2:paraId="1EEFBFF9" ns2:textId="77777777">
+      <w:pPr>
+        <w:rPr>
+          <w:rFonts w:ascii="Arial" w:hAnsi="Arial" w:cs="Arial"/>
+        </w:rPr>
+      </w:pPr>
+    </w:p>
+    <w:p ns2:paraId="33B49482" ns2:textId="77777777">
+      <w:pPr>
+        <w:rPr>
+          <w:rFonts w:ascii="Arial" w:hAnsi="Arial" w:cs="Arial"/>
+        </w:rPr>
+      </w:pPr>
+    </w:p>
+    <w:p ns2:paraId="14901FDB" ns2:textId="77777777">
+      <w:pPr>
+        <w:rPr>
+          <w:rFonts w:ascii="Arial" w:hAnsi="Arial" w:cs="Arial"/>
+        </w:rPr>
+      </w:pPr>
+    </w:p>
+    <w:p ns2:paraId="6B82FA5E" ns2:textId="77777777">
+      <w:pPr>
+        <w:rPr>
+          <w:rFonts w:ascii="Arial" w:hAnsi="Arial" w:cs="Arial"/>
+        </w:rPr>
+      </w:pPr>
+    </w:p>
+    <w:p ns2:paraId="1930B261" ns2:textId="77777777">
+      <w:pPr>
+        <w:rPr>
+          <w:rFonts w:ascii="Arial" w:hAnsi="Arial" w:cs="Arial"/>
+        </w:rPr>
+      </w:pPr>
+    </w:p>
+    <w:p ns2:paraId="09BFD374" ns2:textId="77777777">
+      <w:pPr>
+        <w:rPr>
+          <w:rFonts w:ascii="Arial" w:hAnsi="Arial" w:cs="Arial"/>
+        </w:rPr>
+      </w:pPr>
+    </w:p>
+    <w:p ns2:paraId="224B6BC7" ns2:textId="77777777">
+      <w:pPr>
+        <w:rPr>
+          <w:rFonts w:ascii="Arial" w:hAnsi="Arial" w:cs="Arial"/>
+        </w:rPr>
+      </w:pPr>
+    </w:p>
+    <w:p ns2:paraId="39852BC2" ns2:textId="77777777">
+      <w:pPr>
+        <w:rPr>
+          <w:rFonts w:ascii="Arial" w:hAnsi="Arial" w:cs="Arial"/>
+        </w:rPr>
+      </w:pPr>
+    </w:p>
+    <w:p ns2:paraId="3E50DAA3" ns2:textId="77777777">
+      <w:pPr>
+        <w:rPr>
+          <w:rFonts w:ascii="Arial" w:hAnsi="Arial" w:cs="Arial"/>
+        </w:rPr>
+      </w:pPr>
+    </w:p>
+    <w:p ns2:paraId="4490DFC2" ns2:textId="77777777">
+      <w:pPr>
+        <w:rPr>
+          <w:rFonts w:ascii="Arial" w:hAnsi="Arial" w:cs="Arial"/>
+        </w:rPr>
+      </w:pPr>
+    </w:p>
+    <w:p ns2:paraId="5DAC88DF" ns2:textId="77777777">
+      <w:pPr>
+        <w:rPr>
+          <w:rFonts w:ascii="Arial" w:hAnsi="Arial" w:cs="Arial"/>
+        </w:rPr>
+      </w:pPr>
+    </w:p>
+    <w:p ns2:paraId="41964EF7" ns2:textId="77777777">
+      <w:pPr>
+        <w:rPr>
+          <w:rFonts w:ascii="Arial" w:hAnsi="Arial" w:cs="Arial"/>
+        </w:rPr>
+      </w:pPr>
+    </w:p>
+    <w:p ns2:paraId="0CB56D8F" ns2:textId="77777777">
+      <w:pPr>
+        <w:rPr>
+          <w:rFonts w:ascii="Arial" w:hAnsi="Arial" w:cs="Arial"/>
+        </w:rPr>
+      </w:pPr>
+    </w:p>
+    <w:p ns2:paraId="45B3C083" ns2:textId="77777777">
+      <w:pPr>
+        <w:rPr>
+          <w:rFonts w:ascii="Arial" w:hAnsi="Arial" w:cs="Arial"/>
+        </w:rPr>
+      </w:pPr>
+    </w:p>
+    <w:p ns2:paraId="77137C5F" ns2:textId="77777777">
+      <w:pPr>
+        <w:rPr>
+          <w:rFonts w:ascii="Arial" w:hAnsi="Arial" w:cs="Arial"/>
+        </w:rPr>
+      </w:pPr>
+    </w:p>
+    <w:p ns2:paraId="627FF53A" ns2:textId="77777777">
+      <w:pPr>
+        <w:rPr>
+          <w:rFonts w:ascii="Arial" w:hAnsi="Arial" w:cs="Arial"/>
+        </w:rPr>
+      </w:pPr>
+    </w:p>
+    <w:p ns2:paraId="4177B18B" ns2:textId="77777777">
+      <w:pPr>
+        <w:rPr>
+          <w:rFonts w:ascii="Arial" w:hAnsi="Arial" w:cs="Arial"/>
+        </w:rPr>
+      </w:pPr>
+    </w:p>
+    <w:p ns2:paraId="4B7D30A5" ns2:textId="77777777">
+      <w:pPr>
+        <w:rPr>
+          <w:rFonts w:ascii="Arial" w:hAnsi="Arial" w:cs="Arial"/>
+        </w:rPr>
+      </w:pPr>
+    </w:p>
+    <w:p ns2:paraId="0D44027F" ns2:textId="77777777">
+      <w:pPr>
+        <w:rPr>
+          <w:rFonts w:ascii="Arial" w:hAnsi="Arial" w:cs="Arial"/>
+        </w:rPr>
+      </w:pPr>
+    </w:p>
+    <w:p ns2:paraId="490ABCAE" ns2:textId="77777777">
+      <w:pPr>
+        <w:rPr>
+          <w:rFonts w:ascii="Arial" w:hAnsi="Arial" w:cs="Arial"/>
+        </w:rPr>
+      </w:pPr>
+    </w:p>
+    <w:p ns2:paraId="4C3DFB01" ns2:textId="77777777">
+      <w:pPr>
+        <w:rPr>
+          <w:rFonts w:ascii="Arial" w:hAnsi="Arial" w:cs="Arial"/>
+        </w:rPr>
+      </w:pPr>
+    </w:p>
+    <w:p ns2:paraId="3F4E2081" ns2:textId="77777777">
+      <w:pPr>
+        <w:rPr>
+          <w:rFonts w:ascii="Arial" w:hAnsi="Arial" w:cs="Arial"/>
+        </w:rPr>
+      </w:pPr>
+    </w:p>
+    <w:p ns2:paraId="7EFCC884" ns2:textId="77777777">
+      <w:pPr>
+        <w:rPr>
+          <w:rFonts w:ascii="Arial" w:hAnsi="Arial" w:cs="Arial"/>
+        </w:rPr>
+      </w:pPr>
+    </w:p>
+    <w:p ns2:paraId="5CA1E4BF" ns2:textId="77777777">
+      <w:pPr>
+        <w:rPr>
+          <w:rFonts w:ascii="Arial" w:hAnsi="Arial" w:cs="Arial"/>
+        </w:rPr>
+      </w:pPr>
+    </w:p>
+    <w:p ns2:paraId="794B74B4" ns2:textId="780A107D">
       <w:pPr>
         <w:pStyle w:val="Ttulo1"/>
         <w:numPr>
@@ -10994,7 +10917,7 @@
       </w:r>
       <w:bookmarkEnd w:id="42"/>
     </w:p>
-    <w:p>
+    <w:p ns2:paraId="01C35743" ns2:textId="77777777">
       <w:pPr>
         <w:numPr>
           <w:ilvl w:val="0"/>
@@ -11043,7 +10966,7 @@
         <w:t xml:space="preserve"> Interfaz de programación de aplicaciones que utiliza peticiones HTTP para transferir datos y permitir la comunicación sutil entre el frontend desarrollado en Vue.js 3 y el servidor backend en FastAPI. </w:t>
       </w:r>
     </w:p>
-    <w:p>
+    <w:p ns2:paraId="3DF75957" ns2:textId="77777777">
       <w:pPr>
         <w:numPr>
           <w:ilvl w:val="0"/>
@@ -11072,7 +10995,7 @@
         <w:t xml:space="preserve"> Especificación de interfaz espiritual sucesora de WSGI, utilizada por el servidor Uvicorn para gestionar de manera asíncrona y con alto rendimiento las múltiples peticiones concurrentes orientadas a la aplicación web. </w:t>
       </w:r>
     </w:p>
-    <w:p>
+    <w:p ns2:paraId="552B3AB2" ns2:textId="77777777">
       <w:pPr>
         <w:numPr>
           <w:ilvl w:val="0"/>
@@ -11101,7 +11024,7 @@
         <w:t xml:space="preserve"> Librería de JavaScript basada en promesas encargada de gestionar y ejecutar solicitudes HTTP desde el cliente hacia la API de backend de manera optimizada y asíncrona. </w:t>
       </w:r>
     </w:p>
-    <w:p>
+    <w:p ns2:paraId="76779235" ns2:textId="77777777">
       <w:pPr>
         <w:numPr>
           <w:ilvl w:val="0"/>
@@ -11130,7 +11053,7 @@
         <w:t xml:space="preserve"> Cuestionario psicométrico estandarizado y validado científicamente que consta de 44 afirmaciones autoevaluables, utilizado como núcleo logicial para caracterizar el perfil de personalidad del estudiante. </w:t>
       </w:r>
     </w:p>
-    <w:p>
+    <w:p ns2:paraId="6430E966" ns2:textId="77777777">
       <w:pPr>
         <w:numPr>
           <w:ilvl w:val="0"/>
@@ -11159,7 +11082,7 @@
         <w:t xml:space="preserve"> Disciplina de gestión corporativa que integra metodologías y tecnologías para optimizar, estandarizar y modelar flujos de trabajo de extremo a extremo dentro de una organización o sistema institucional. </w:t>
       </w:r>
     </w:p>
-    <w:p>
+    <w:p ns2:paraId="4376C87E" ns2:textId="77777777">
       <w:pPr>
         <w:numPr>
           <w:ilvl w:val="0"/>
@@ -11204,7 +11127,7 @@
         <w:t xml:space="preserve">) para representar visualmente las etapas operativas y lógicas de un proceso de negocio. </w:t>
       </w:r>
     </w:p>
-    <w:p>
+    <w:p ns2:paraId="3EF66CD4" ns2:textId="77777777">
       <w:pPr>
         <w:numPr>
           <w:ilvl w:val="0"/>
@@ -11233,7 +11156,7 @@
         <w:t xml:space="preserve"> Sistema operativo basado en la distribución Arch Linux, optimizado a nivel de kernel y compilación de paquetes para entregar una baja latencia y alto rendimiento en el ambiente de desarrollo local. </w:t>
       </w:r>
     </w:p>
-    <w:p>
+    <w:p ns2:paraId="0EB9DFCE" ns2:textId="77777777">
       <w:pPr>
         <w:numPr>
           <w:ilvl w:val="0"/>
@@ -11262,7 +11185,7 @@
         <w:t xml:space="preserve"> Motor de orquestación y automatización de procesos de negocio nativo en la nube que interpreta modelos BPMN para coordinar y registrar los estados de las tareas del sistema. </w:t>
       </w:r>
     </w:p>
-    <w:p>
+    <w:p ns2:paraId="0BCB8CB3" ns2:textId="77777777">
       <w:pPr>
         <w:numPr>
           <w:ilvl w:val="0"/>
@@ -11291,7 +11214,7 @@
         <w:t xml:space="preserve"> Herramienta de medición psicométrica psicológica que mide actitudes o respuestas en un gradiente lineal de opciones, implementada en este software en una matriz obligatoria de 5 puntos de valoración. </w:t>
       </w:r>
     </w:p>
-    <w:p>
+    <w:p ns2:paraId="1AE15E9C" ns2:textId="77777777">
       <w:pPr>
         <w:numPr>
           <w:ilvl w:val="0"/>
@@ -11320,7 +11243,7 @@
         <w:t xml:space="preserve"> Framework web moderno y de código abierto basado en Python 3.11, seleccionado por su alta velocidad de ejecución asíncrona y la autogeneración nativa de documentación interactiva orientada a endpoints. </w:t>
       </w:r>
     </w:p>
-    <w:p>
+    <w:p ns2:paraId="52F74742" ns2:textId="77777777">
       <w:pPr>
         <w:numPr>
           <w:ilvl w:val="0"/>
@@ -11349,7 +11272,7 @@
         <w:t xml:space="preserve"> Estándar abierto basado en JSON empleado para la transmisión segura de tokens de identidad cifrados que validan los accesos restringidos y la seguridad de los usuarios orientadores. </w:t>
       </w:r>
     </w:p>
-    <w:p>
+    <w:p ns2:paraId="73759ED7" ns2:textId="77777777">
       <w:pPr>
         <w:numPr>
           <w:ilvl w:val="0"/>
@@ -11378,7 +11301,7 @@
         <w:t xml:space="preserve"> Versión inicial y acotada de un producto de software que reúne las funcionalidades esenciales y críticas para ser desplegado de forma operativa cumpliendo con los estándares de calidad definidos. </w:t>
       </w:r>
     </w:p>
-    <w:p>
+    <w:p ns2:paraId="025BA594" ns2:textId="77777777">
       <w:pPr>
         <w:numPr>
           <w:ilvl w:val="0"/>
@@ -11424,7 +11347,7 @@
         <w:t xml:space="preserve">) de código abierto, utilizado para la persistencia e integridad estructural de la información transaccional del perfilamiento estudiantil. </w:t>
       </w:r>
     </w:p>
-    <w:p>
+    <w:p ns2:paraId="10EBE1D4" ns2:textId="77777777">
       <w:pPr>
         <w:numPr>
           <w:ilvl w:val="0"/>
@@ -11533,7 +11456,7 @@
         <w:t xml:space="preserve"> (Estabilidad Emocional). </w:t>
       </w:r>
     </w:p>
-    <w:p>
+    <w:p ns2:paraId="44434B4C" ns2:textId="77777777">
       <w:pPr>
         <w:numPr>
           <w:ilvl w:val="0"/>
@@ -11562,7 +11485,7 @@
         <w:t xml:space="preserve"> Técnica de programación para convertir datos entre el sistema de tipos de un lenguaje orientado a objetos (Python) y una base de datos relacional (MySQL), implementada mediante la librería SQLAlchemy. </w:t>
       </w:r>
     </w:p>
-    <w:p>
+    <w:p ns2:paraId="64AC85D0" ns2:textId="77777777">
       <w:pPr>
         <w:numPr>
           <w:ilvl w:val="0"/>
@@ -11591,7 +11514,7 @@
         <w:t xml:space="preserve"> Arquitectura de aplicación web que carga una única página HTML y actualiza dinámicamente el contenido de la interfaz de usuario interactiva a medida que este interactúa con el sistema, eliminando la recarga completa del navegador. </w:t>
       </w:r>
     </w:p>
-    <w:p>
+    <w:p ns2:paraId="49966948" ns2:textId="77777777">
       <w:pPr>
         <w:numPr>
           <w:ilvl w:val="0"/>
@@ -11620,7 +11543,7 @@
         <w:t xml:space="preserve"> Kit de herramientas SQL y mapeador de objetos relacionales (ORM) para Python que proporciona la flexibilidad y automatización requeridas para mapear clases a tablas MySQL. </w:t>
       </w:r>
     </w:p>
-    <w:p>
+    <w:p ns2:paraId="2A51DE80" ns2:textId="77777777">
       <w:pPr>
         <w:numPr>
           <w:ilvl w:val="0"/>
@@ -11649,7 +11572,7 @@
         <w:t xml:space="preserve"> Servidor web ASGI rápido y de producción para Python, utilizado como entorno para ejecutar de forma nativa la lógica y los controladores de FastAPI. </w:t>
       </w:r>
     </w:p>
-    <w:p>
+    <w:p ns2:paraId="21D1AB32" ns2:textId="77777777">
       <w:pPr>
         <w:numPr>
           <w:ilvl w:val="0"/>
@@ -11678,7 +11601,7 @@
         <w:t xml:space="preserve"> Framework progresivo de JavaScript de código abierto enfocado en la capa visual, utilizado para modularizar componentes web y construir interfaces de usuario de alta velocidad transaccional. </w:t>
       </w:r>
     </w:p>
-    <w:p>
+    <w:p ns2:paraId="660250A2" ns2:textId="77777777">
       <w:pPr>
         <w:jc w:val="left"/>
         <w:rPr>
@@ -11687,70 +11610,70 @@
         </w:rPr>
       </w:pPr>
     </w:p>
-    <w:p>
-      <w:pPr>
-        <w:rPr>
-          <w:rFonts w:ascii="Arial" w:hAnsi="Arial" w:cs="Arial"/>
-        </w:rPr>
-      </w:pPr>
-    </w:p>
-    <w:p>
-      <w:pPr>
-        <w:rPr>
-          <w:rFonts w:ascii="Arial" w:hAnsi="Arial" w:cs="Arial"/>
-        </w:rPr>
-      </w:pPr>
-    </w:p>
-    <w:p>
-      <w:pPr>
-        <w:rPr>
-          <w:rFonts w:ascii="Arial" w:hAnsi="Arial" w:cs="Arial"/>
-        </w:rPr>
-      </w:pPr>
-    </w:p>
-    <w:p>
-      <w:pPr>
-        <w:rPr>
-          <w:rFonts w:ascii="Arial" w:hAnsi="Arial" w:cs="Arial"/>
-        </w:rPr>
-      </w:pPr>
-    </w:p>
-    <w:p>
-      <w:pPr>
-        <w:rPr>
-          <w:rFonts w:ascii="Arial" w:hAnsi="Arial" w:cs="Arial"/>
-        </w:rPr>
-      </w:pPr>
-    </w:p>
-    <w:p>
-      <w:pPr>
-        <w:rPr>
-          <w:rFonts w:ascii="Arial" w:hAnsi="Arial" w:cs="Arial"/>
-        </w:rPr>
-      </w:pPr>
-    </w:p>
-    <w:p>
-      <w:pPr>
-        <w:rPr>
-          <w:rFonts w:ascii="Arial" w:hAnsi="Arial" w:cs="Arial"/>
-        </w:rPr>
-      </w:pPr>
-    </w:p>
-    <w:p>
-      <w:pPr>
-        <w:rPr>
-          <w:rFonts w:ascii="Arial" w:hAnsi="Arial" w:cs="Arial"/>
-        </w:rPr>
-      </w:pPr>
-    </w:p>
-    <w:p>
-      <w:pPr>
-        <w:rPr>
-          <w:rFonts w:ascii="Arial" w:hAnsi="Arial" w:cs="Arial"/>
-        </w:rPr>
-      </w:pPr>
-    </w:p>
-    <w:p>
+    <w:p ns2:paraId="2574FC46" ns2:textId="77777777">
+      <w:pPr>
+        <w:rPr>
+          <w:rFonts w:ascii="Arial" w:hAnsi="Arial" w:cs="Arial"/>
+        </w:rPr>
+      </w:pPr>
+    </w:p>
+    <w:p ns2:paraId="338CE94F" ns2:textId="77777777">
+      <w:pPr>
+        <w:rPr>
+          <w:rFonts w:ascii="Arial" w:hAnsi="Arial" w:cs="Arial"/>
+        </w:rPr>
+      </w:pPr>
+    </w:p>
+    <w:p ns2:paraId="758564F1" ns2:textId="77777777">
+      <w:pPr>
+        <w:rPr>
+          <w:rFonts w:ascii="Arial" w:hAnsi="Arial" w:cs="Arial"/>
+        </w:rPr>
+      </w:pPr>
+    </w:p>
+    <w:p ns2:paraId="1F91B0E2" ns2:textId="77777777">
+      <w:pPr>
+        <w:rPr>
+          <w:rFonts w:ascii="Arial" w:hAnsi="Arial" w:cs="Arial"/>
+        </w:rPr>
+      </w:pPr>
+    </w:p>
+    <w:p ns2:paraId="11398AA6" ns2:textId="77777777">
+      <w:pPr>
+        <w:rPr>
+          <w:rFonts w:ascii="Arial" w:hAnsi="Arial" w:cs="Arial"/>
+        </w:rPr>
+      </w:pPr>
+    </w:p>
+    <w:p ns2:paraId="0653018F" ns2:textId="77777777">
+      <w:pPr>
+        <w:rPr>
+          <w:rFonts w:ascii="Arial" w:hAnsi="Arial" w:cs="Arial"/>
+        </w:rPr>
+      </w:pPr>
+    </w:p>
+    <w:p ns2:paraId="06FE3A01" ns2:textId="77777777">
+      <w:pPr>
+        <w:rPr>
+          <w:rFonts w:ascii="Arial" w:hAnsi="Arial" w:cs="Arial"/>
+        </w:rPr>
+      </w:pPr>
+    </w:p>
+    <w:p ns2:paraId="4B6189F1" ns2:textId="77777777">
+      <w:pPr>
+        <w:rPr>
+          <w:rFonts w:ascii="Arial" w:hAnsi="Arial" w:cs="Arial"/>
+        </w:rPr>
+      </w:pPr>
+    </w:p>
+    <w:p ns2:paraId="2906FCFA" ns2:textId="77777777">
+      <w:pPr>
+        <w:rPr>
+          <w:rFonts w:ascii="Arial" w:hAnsi="Arial" w:cs="Arial"/>
+        </w:rPr>
+      </w:pPr>
+    </w:p>
+    <w:p ns2:paraId="1B2B0279" ns2:textId="77777777">
       <w:pPr>
         <w:pStyle w:val="Ttulo1"/>
         <w:numPr>
@@ -11763,7 +11686,7 @@
         </w:rPr>
       </w:pPr>
     </w:p>
-    <w:p>
+    <w:p ns2:paraId="1BAC0CD1" ns2:textId="77777777">
       <w:pPr>
         <w:pStyle w:val="Ttulo1"/>
         <w:numPr>
@@ -11776,7 +11699,7 @@
         </w:rPr>
       </w:pPr>
     </w:p>
-    <w:p>
+    <w:p ns2:paraId="3A83A7A5" ns2:textId="77777777">
       <w:pPr>
         <w:pStyle w:val="Ttulo1"/>
         <w:numPr>
@@ -11789,7 +11712,7 @@
         </w:rPr>
       </w:pPr>
     </w:p>
-    <w:p>
+    <w:p ns2:paraId="46F07FFA" ns2:textId="77777777">
       <w:pPr>
         <w:pStyle w:val="Ttulo1"/>
         <w:numPr>
@@ -11802,7 +11725,7 @@
         </w:rPr>
       </w:pPr>
     </w:p>
-    <w:p>
+    <w:p ns2:paraId="6B7823E5" ns2:textId="227F0D19">
       <w:pPr>
         <w:jc w:val="both"/>
         <w:rPr>
@@ -11813,7 +11736,7 @@
         </w:rPr>
       </w:pPr>
     </w:p>
-    <w:p>
+    <w:p ns2:paraId="4CAFAAE8" ns2:textId="432C42A9">
       <w:pPr>
         <w:jc w:val="both"/>
       </w:pPr>

</xml_diff>